<commit_message>
Updated tables and figures
</commit_message>
<xml_diff>
--- a/Output/devel_mod_table.docx
+++ b/Output/devel_mod_table.docx
@@ -50,7 +50,7 @@
           <w:sz w:val="24"/>
           <w:color w:val="333333"/>
         </w:rPr>
-        <w:t xml:space="preserve">Supplemental Table 3.</w:t>
+        <w:t xml:space="preserve">S3 Table. Associations of three temperature variables in early and late development (before or after six days post-hatch) with nestling mass for wild barns swallows in Boulder County, CO.</w:t>
       </w:r>
       <w:r>
         <w:rPr>
@@ -58,7 +58,7 @@
           <w:sz w:val="24"/>
           <w:color w:val="333333"/>
         </w:rPr>
-        <w:t xml:space="preserve"> Associations of three temperature variables before or after thermoregulatory independence (defined as occurring six days post-hatch) with nestling mass. Temperature variability is defined as the interquartile range.</w:t>
+        <w:t xml:space="preserve"> Temperature variability is defined as the interquartile range. For each temperature variable, results are provided for unadjusted and adjusted models. Sample size for each developmental stage is provided in the header (n). For each model, the table provides the effect size and 95% confidence interval for temperature effects (β (95% CI)), and the corresponding t-value, degrees of freedom, and p-value from a two-tailed t-test using a Satterthwaite degree of freedom estimation.</w:t>
       </w:r>
     </w:p>
     <w:tbl xmlns:w="http://schemas.openxmlformats.org/wordprocessingml/2006/main" xmlns:wp="http://schemas.openxmlformats.org/drawingml/2006/wordprocessingDrawing" xmlns:r="http://schemas.openxmlformats.org/officeDocument/2006/relationships" xmlns:w14="http://schemas.microsoft.com/office/word/2010/wordml">
@@ -110,7 +110,7 @@
               <w:bottom w:val="single" w:sz="16" w:space="0" w:color="D3D3D3"/>
               <w:start w:val="single" w:space="0" w:color="D3D3D3"/>
             </w:tcBorders>
-            <w:gridSpan w:val="2"/>
+            <w:gridSpan w:val="4"/>
           </w:tcPr>
           <w:p>
             <w:pPr>
@@ -123,7 +123,7 @@
                 <w:rFonts w:ascii="Calibri" w:hAnsi="Calibri"/>
                 <w:sz w:val="20"/>
               </w:rPr>
-              <w:t xml:space="default">Before models</w:t>
+              <w:t xml:space="default">Before models (n = 106)</w:t>
             </w:r>
           </w:p>
         </w:tc>
@@ -134,7 +134,7 @@
               <w:bottom w:val="single" w:sz="16" w:space="0" w:color="D3D3D3"/>
               <w:end w:val="single" w:space="0" w:color="D3D3D3"/>
             </w:tcBorders>
-            <w:gridSpan w:val="2"/>
+            <w:gridSpan w:val="4"/>
           </w:tcPr>
           <w:p>
             <w:pPr>
@@ -147,7 +147,7 @@
                 <w:rFonts w:ascii="Calibri" w:hAnsi="Calibri"/>
                 <w:sz w:val="20"/>
               </w:rPr>
-              <w:t xml:space="default">After models</w:t>
+              <w:t xml:space="default">After models (n = 106)</w:t>
             </w:r>
           </w:p>
         </w:tc>
@@ -198,27 +198,6 @@
                 <w:rFonts w:ascii="Calibri" w:hAnsi="Calibri"/>
                 <w:sz w:val="20"/>
               </w:rPr>
-              <w:t xml:space="default">N</w:t>
-            </w:r>
-          </w:p>
-        </w:tc>
-        <w:tc>
-          <w:tcPr>
-            <w:tcBorders>
-              <w:bottom w:val="single" w:sz="16" w:space="0" w:color="D3D3D3"/>
-            </w:tcBorders>
-          </w:tcPr>
-          <w:p>
-            <w:pPr>
-              <w:spacing w:before="0" w:after="60"/>
-              <w:keepNext/>
-              <w:jc w:val="end"/>
-            </w:pPr>
-            <w:r>
-              <w:rPr>
-                <w:rFonts w:ascii="Calibri" w:hAnsi="Calibri"/>
-                <w:sz w:val="20"/>
-              </w:rPr>
               <w:t xml:space="default">β (95% CI)</w:t>
             </w:r>
             <w:r>
@@ -249,7 +228,7 @@
                 <w:rFonts w:ascii="Calibri" w:hAnsi="Calibri"/>
                 <w:sz w:val="20"/>
               </w:rPr>
-              <w:t xml:space="default">N</w:t>
+              <w:t xml:space="default">t-value</w:t>
             </w:r>
           </w:p>
         </w:tc>
@@ -257,7 +236,48 @@
           <w:tcPr>
             <w:tcBorders>
               <w:bottom w:val="single" w:sz="16" w:space="0" w:color="D3D3D3"/>
-              <w:end w:val="single" w:space="0" w:color="D3D3D3"/>
+            </w:tcBorders>
+          </w:tcPr>
+          <w:p>
+            <w:pPr>
+              <w:spacing w:before="0" w:after="60"/>
+              <w:keepNext/>
+              <w:jc w:val="end"/>
+            </w:pPr>
+            <w:r>
+              <w:rPr>
+                <w:rFonts w:ascii="Calibri" w:hAnsi="Calibri"/>
+                <w:sz w:val="20"/>
+              </w:rPr>
+              <w:t xml:space="default">DF</w:t>
+            </w:r>
+          </w:p>
+        </w:tc>
+        <w:tc>
+          <w:tcPr>
+            <w:tcBorders>
+              <w:bottom w:val="single" w:sz="16" w:space="0" w:color="D3D3D3"/>
+            </w:tcBorders>
+          </w:tcPr>
+          <w:p>
+            <w:pPr>
+              <w:spacing w:before="0" w:after="60"/>
+              <w:keepNext/>
+              <w:jc w:val="start"/>
+            </w:pPr>
+            <w:r>
+              <w:rPr>
+                <w:rFonts w:ascii="Calibri" w:hAnsi="Calibri"/>
+                <w:sz w:val="20"/>
+              </w:rPr>
+              <w:t xml:space="default">p-value</w:t>
+            </w:r>
+          </w:p>
+        </w:tc>
+        <w:tc>
+          <w:tcPr>
+            <w:tcBorders>
+              <w:bottom w:val="single" w:sz="16" w:space="0" w:color="D3D3D3"/>
             </w:tcBorders>
           </w:tcPr>
           <w:p>
@@ -281,6 +301,70 @@
                 <w:sz w:val="20"/>
               </w:rPr>
               <w:t xml:space="default">1</w:t>
+            </w:r>
+          </w:p>
+        </w:tc>
+        <w:tc>
+          <w:tcPr>
+            <w:tcBorders>
+              <w:bottom w:val="single" w:sz="16" w:space="0" w:color="D3D3D3"/>
+            </w:tcBorders>
+          </w:tcPr>
+          <w:p>
+            <w:pPr>
+              <w:spacing w:before="0" w:after="60"/>
+              <w:keepNext/>
+              <w:jc w:val="end"/>
+            </w:pPr>
+            <w:r>
+              <w:rPr>
+                <w:rFonts w:ascii="Calibri" w:hAnsi="Calibri"/>
+                <w:sz w:val="20"/>
+              </w:rPr>
+              <w:t xml:space="default">t-value</w:t>
+            </w:r>
+          </w:p>
+        </w:tc>
+        <w:tc>
+          <w:tcPr>
+            <w:tcBorders>
+              <w:bottom w:val="single" w:sz="16" w:space="0" w:color="D3D3D3"/>
+            </w:tcBorders>
+          </w:tcPr>
+          <w:p>
+            <w:pPr>
+              <w:spacing w:before="0" w:after="60"/>
+              <w:keepNext/>
+              <w:jc w:val="end"/>
+            </w:pPr>
+            <w:r>
+              <w:rPr>
+                <w:rFonts w:ascii="Calibri" w:hAnsi="Calibri"/>
+                <w:sz w:val="20"/>
+              </w:rPr>
+              <w:t xml:space="default">DF</w:t>
+            </w:r>
+          </w:p>
+        </w:tc>
+        <w:tc>
+          <w:tcPr>
+            <w:tcBorders>
+              <w:bottom w:val="single" w:sz="16" w:space="0" w:color="D3D3D3"/>
+              <w:end w:val="single" w:space="0" w:color="D3D3D3"/>
+            </w:tcBorders>
+          </w:tcPr>
+          <w:p>
+            <w:pPr>
+              <w:spacing w:before="0" w:after="60"/>
+              <w:keepNext/>
+              <w:jc w:val="start"/>
+            </w:pPr>
+            <w:r>
+              <w:rPr>
+                <w:rFonts w:ascii="Calibri" w:hAnsi="Calibri"/>
+                <w:sz w:val="20"/>
+              </w:rPr>
+              <w:t xml:space="default">p-value</w:t>
             </w:r>
           </w:p>
         </w:tc>
@@ -300,7 +384,7 @@
             <w:tcMar>
               <w:top w:w="25" w:type="dxa"/>
             </w:tcMar>
-            <w:gridSpan w:val="5"/>
+            <w:gridSpan w:val="9"/>
           </w:tcPr>
           <w:p>
             <w:pPr>
@@ -366,30 +450,6 @@
                 <w:rFonts w:ascii="Calibri" w:hAnsi="Calibri"/>
                 <w:sz w:val="20"/>
               </w:rPr>
-              <w:t xml:space="default">106</w:t>
-            </w:r>
-          </w:p>
-        </w:tc>
-        <w:tc>
-          <w:tcPr>
-            <w:tcBorders>
-              <w:top w:val="single" w:space="0" w:color="D3D3D3"/>
-              <w:bottom w:val="single" w:space="0" w:color="D3D3D3"/>
-              <w:start w:val="single" w:space="0" w:color="D3D3D3"/>
-              <w:end w:val="single" w:space="0" w:color="D3D3D3"/>
-            </w:tcBorders>
-          </w:tcPr>
-          <w:p>
-            <w:pPr>
-              <w:spacing w:before="0" w:after="60"/>
-              <w:keepNext/>
-              <w:jc w:val="end"/>
-            </w:pPr>
-            <w:r>
-              <w:rPr>
-                <w:rFonts w:ascii="Calibri" w:hAnsi="Calibri"/>
-                <w:sz w:val="20"/>
-              </w:rPr>
               <w:t xml:space="default">1.11 (0.45, 1.8)</w:t>
             </w:r>
           </w:p>
@@ -414,7 +474,55 @@
                 <w:rFonts w:ascii="Calibri" w:hAnsi="Calibri"/>
                 <w:sz w:val="20"/>
               </w:rPr>
-              <w:t xml:space="default">106</w:t>
+              <w:t xml:space="default">3.22</w:t>
+            </w:r>
+          </w:p>
+        </w:tc>
+        <w:tc>
+          <w:tcPr>
+            <w:tcBorders>
+              <w:top w:val="single" w:space="0" w:color="D3D3D3"/>
+              <w:bottom w:val="single" w:space="0" w:color="D3D3D3"/>
+              <w:start w:val="single" w:space="0" w:color="D3D3D3"/>
+              <w:end w:val="single" w:space="0" w:color="D3D3D3"/>
+            </w:tcBorders>
+          </w:tcPr>
+          <w:p>
+            <w:pPr>
+              <w:spacing w:before="0" w:after="60"/>
+              <w:keepNext/>
+              <w:jc w:val="end"/>
+            </w:pPr>
+            <w:r>
+              <w:rPr>
+                <w:rFonts w:ascii="Calibri" w:hAnsi="Calibri"/>
+                <w:sz w:val="20"/>
+              </w:rPr>
+              <w:t xml:space="default">28.58</w:t>
+            </w:r>
+          </w:p>
+        </w:tc>
+        <w:tc>
+          <w:tcPr>
+            <w:tcBorders>
+              <w:top w:val="single" w:space="0" w:color="D3D3D3"/>
+              <w:bottom w:val="single" w:space="0" w:color="D3D3D3"/>
+              <w:start w:val="single" w:space="0" w:color="D3D3D3"/>
+              <w:end w:val="single" w:space="0" w:color="D3D3D3"/>
+            </w:tcBorders>
+          </w:tcPr>
+          <w:p>
+            <w:pPr>
+              <w:spacing w:before="0" w:after="60"/>
+              <w:keepNext/>
+              <w:jc w:val="start"/>
+            </w:pPr>
+            <w:r>
+              <w:rPr>
+                <w:rFonts w:ascii="Calibri" w:hAnsi="Calibri"/>
+                <w:sz w:val="20"/>
+              </w:rPr>
+              <w:t xml:space="default">0.003</w:t>
             </w:r>
           </w:p>
         </w:tc>
@@ -439,6 +547,78 @@
                 <w:sz w:val="20"/>
               </w:rPr>
               <w:t xml:space="default">0.5 (-0.22, 1.25)</w:t>
+            </w:r>
+          </w:p>
+        </w:tc>
+        <w:tc>
+          <w:tcPr>
+            <w:tcBorders>
+              <w:top w:val="single" w:space="0" w:color="D3D3D3"/>
+              <w:bottom w:val="single" w:space="0" w:color="D3D3D3"/>
+              <w:start w:val="single" w:space="0" w:color="D3D3D3"/>
+              <w:end w:val="single" w:space="0" w:color="D3D3D3"/>
+            </w:tcBorders>
+          </w:tcPr>
+          <w:p>
+            <w:pPr>
+              <w:spacing w:before="0" w:after="60"/>
+              <w:keepNext/>
+              <w:jc w:val="end"/>
+            </w:pPr>
+            <w:r>
+              <w:rPr>
+                <w:rFonts w:ascii="Calibri" w:hAnsi="Calibri"/>
+                <w:sz w:val="20"/>
+              </w:rPr>
+              <w:t xml:space="default">1.30</w:t>
+            </w:r>
+          </w:p>
+        </w:tc>
+        <w:tc>
+          <w:tcPr>
+            <w:tcBorders>
+              <w:top w:val="single" w:space="0" w:color="D3D3D3"/>
+              <w:bottom w:val="single" w:space="0" w:color="D3D3D3"/>
+              <w:start w:val="single" w:space="0" w:color="D3D3D3"/>
+              <w:end w:val="single" w:space="0" w:color="D3D3D3"/>
+            </w:tcBorders>
+          </w:tcPr>
+          <w:p>
+            <w:pPr>
+              <w:spacing w:before="0" w:after="60"/>
+              <w:keepNext/>
+              <w:jc w:val="end"/>
+            </w:pPr>
+            <w:r>
+              <w:rPr>
+                <w:rFonts w:ascii="Calibri" w:hAnsi="Calibri"/>
+                <w:sz w:val="20"/>
+              </w:rPr>
+              <w:t xml:space="default">28.55</w:t>
+            </w:r>
+          </w:p>
+        </w:tc>
+        <w:tc>
+          <w:tcPr>
+            <w:tcBorders>
+              <w:top w:val="single" w:space="0" w:color="D3D3D3"/>
+              <w:bottom w:val="single" w:space="0" w:color="D3D3D3"/>
+              <w:start w:val="single" w:space="0" w:color="D3D3D3"/>
+              <w:end w:val="single" w:space="0" w:color="D3D3D3"/>
+            </w:tcBorders>
+          </w:tcPr>
+          <w:p>
+            <w:pPr>
+              <w:spacing w:before="0" w:after="60"/>
+              <w:keepNext/>
+              <w:jc w:val="start"/>
+            </w:pPr>
+            <w:r>
+              <w:rPr>
+                <w:rFonts w:ascii="Calibri" w:hAnsi="Calibri"/>
+                <w:sz w:val="20"/>
+              </w:rPr>
+              <w:t xml:space="default">0.2</w:t>
             </w:r>
           </w:p>
         </w:tc>
@@ -500,30 +680,6 @@
                 <w:rFonts w:ascii="Calibri" w:hAnsi="Calibri"/>
                 <w:sz w:val="20"/>
               </w:rPr>
-              <w:t xml:space="default">106</w:t>
-            </w:r>
-          </w:p>
-        </w:tc>
-        <w:tc>
-          <w:tcPr>
-            <w:tcBorders>
-              <w:top w:val="single" w:space="0" w:color="D3D3D3"/>
-              <w:bottom w:val="single" w:space="0" w:color="D3D3D3"/>
-              <w:start w:val="single" w:space="0" w:color="D3D3D3"/>
-              <w:end w:val="single" w:space="0" w:color="D3D3D3"/>
-            </w:tcBorders>
-          </w:tcPr>
-          <w:p>
-            <w:pPr>
-              <w:spacing w:before="0" w:after="60"/>
-              <w:keepNext/>
-              <w:jc w:val="end"/>
-            </w:pPr>
-            <w:r>
-              <w:rPr>
-                <w:rFonts w:ascii="Calibri" w:hAnsi="Calibri"/>
-                <w:sz w:val="20"/>
-              </w:rPr>
               <w:t xml:space="default">1.16 (0.32, 2)</w:t>
             </w:r>
           </w:p>
@@ -548,7 +704,55 @@
                 <w:rFonts w:ascii="Calibri" w:hAnsi="Calibri"/>
                 <w:sz w:val="20"/>
               </w:rPr>
-              <w:t xml:space="default">106</w:t>
+              <w:t xml:space="default">2.79</w:t>
+            </w:r>
+          </w:p>
+        </w:tc>
+        <w:tc>
+          <w:tcPr>
+            <w:tcBorders>
+              <w:top w:val="single" w:space="0" w:color="D3D3D3"/>
+              <w:bottom w:val="single" w:space="0" w:color="D3D3D3"/>
+              <w:start w:val="single" w:space="0" w:color="D3D3D3"/>
+              <w:end w:val="single" w:space="0" w:color="D3D3D3"/>
+            </w:tcBorders>
+          </w:tcPr>
+          <w:p>
+            <w:pPr>
+              <w:spacing w:before="0" w:after="60"/>
+              <w:keepNext/>
+              <w:jc w:val="end"/>
+            </w:pPr>
+            <w:r>
+              <w:rPr>
+                <w:rFonts w:ascii="Calibri" w:hAnsi="Calibri"/>
+                <w:sz w:val="20"/>
+              </w:rPr>
+              <w:t xml:space="default">26.96</w:t>
+            </w:r>
+          </w:p>
+        </w:tc>
+        <w:tc>
+          <w:tcPr>
+            <w:tcBorders>
+              <w:top w:val="single" w:space="0" w:color="D3D3D3"/>
+              <w:bottom w:val="single" w:space="0" w:color="D3D3D3"/>
+              <w:start w:val="single" w:space="0" w:color="D3D3D3"/>
+              <w:end w:val="single" w:space="0" w:color="D3D3D3"/>
+            </w:tcBorders>
+          </w:tcPr>
+          <w:p>
+            <w:pPr>
+              <w:spacing w:before="0" w:after="60"/>
+              <w:keepNext/>
+              <w:jc w:val="start"/>
+            </w:pPr>
+            <w:r>
+              <w:rPr>
+                <w:rFonts w:ascii="Calibri" w:hAnsi="Calibri"/>
+                <w:sz w:val="20"/>
+              </w:rPr>
+              <w:t xml:space="default">0.01</w:t>
             </w:r>
           </w:p>
         </w:tc>
@@ -573,6 +777,78 @@
                 <w:sz w:val="20"/>
               </w:rPr>
               <w:t xml:space="default">0.29 (-0.45, 1.06)</w:t>
+            </w:r>
+          </w:p>
+        </w:tc>
+        <w:tc>
+          <w:tcPr>
+            <w:tcBorders>
+              <w:top w:val="single" w:space="0" w:color="D3D3D3"/>
+              <w:bottom w:val="single" w:space="0" w:color="D3D3D3"/>
+              <w:start w:val="single" w:space="0" w:color="D3D3D3"/>
+              <w:end w:val="single" w:space="0" w:color="D3D3D3"/>
+            </w:tcBorders>
+          </w:tcPr>
+          <w:p>
+            <w:pPr>
+              <w:spacing w:before="0" w:after="60"/>
+              <w:keepNext/>
+              <w:jc w:val="end"/>
+            </w:pPr>
+            <w:r>
+              <w:rPr>
+                <w:rFonts w:ascii="Calibri" w:hAnsi="Calibri"/>
+                <w:sz w:val="20"/>
+              </w:rPr>
+              <w:t xml:space="default">0.75</w:t>
+            </w:r>
+          </w:p>
+        </w:tc>
+        <w:tc>
+          <w:tcPr>
+            <w:tcBorders>
+              <w:top w:val="single" w:space="0" w:color="D3D3D3"/>
+              <w:bottom w:val="single" w:space="0" w:color="D3D3D3"/>
+              <w:start w:val="single" w:space="0" w:color="D3D3D3"/>
+              <w:end w:val="single" w:space="0" w:color="D3D3D3"/>
+            </w:tcBorders>
+          </w:tcPr>
+          <w:p>
+            <w:pPr>
+              <w:spacing w:before="0" w:after="60"/>
+              <w:keepNext/>
+              <w:jc w:val="end"/>
+            </w:pPr>
+            <w:r>
+              <w:rPr>
+                <w:rFonts w:ascii="Calibri" w:hAnsi="Calibri"/>
+                <w:sz w:val="20"/>
+              </w:rPr>
+              <w:t xml:space="default">26.96</w:t>
+            </w:r>
+          </w:p>
+        </w:tc>
+        <w:tc>
+          <w:tcPr>
+            <w:tcBorders>
+              <w:top w:val="single" w:space="0" w:color="D3D3D3"/>
+              <w:bottom w:val="single" w:space="0" w:color="D3D3D3"/>
+              <w:start w:val="single" w:space="0" w:color="D3D3D3"/>
+              <w:end w:val="single" w:space="0" w:color="D3D3D3"/>
+            </w:tcBorders>
+          </w:tcPr>
+          <w:p>
+            <w:pPr>
+              <w:spacing w:before="0" w:after="60"/>
+              <w:keepNext/>
+              <w:jc w:val="start"/>
+            </w:pPr>
+            <w:r>
+              <w:rPr>
+                <w:rFonts w:ascii="Calibri" w:hAnsi="Calibri"/>
+                <w:sz w:val="20"/>
+              </w:rPr>
+              <w:t xml:space="default">0.46</w:t>
             </w:r>
           </w:p>
         </w:tc>
@@ -592,7 +868,7 @@
             <w:tcMar>
               <w:top w:w="25" w:type="dxa"/>
             </w:tcMar>
-            <w:gridSpan w:val="5"/>
+            <w:gridSpan w:val="9"/>
           </w:tcPr>
           <w:p>
             <w:pPr>
@@ -658,30 +934,6 @@
                 <w:rFonts w:ascii="Calibri" w:hAnsi="Calibri"/>
                 <w:sz w:val="20"/>
               </w:rPr>
-              <w:t xml:space="default">106</w:t>
-            </w:r>
-          </w:p>
-        </w:tc>
-        <w:tc>
-          <w:tcPr>
-            <w:tcBorders>
-              <w:top w:val="single" w:space="0" w:color="D3D3D3"/>
-              <w:bottom w:val="single" w:space="0" w:color="D3D3D3"/>
-              <w:start w:val="single" w:space="0" w:color="D3D3D3"/>
-              <w:end w:val="single" w:space="0" w:color="D3D3D3"/>
-            </w:tcBorders>
-          </w:tcPr>
-          <w:p>
-            <w:pPr>
-              <w:spacing w:before="0" w:after="60"/>
-              <w:keepNext/>
-              <w:jc w:val="end"/>
-            </w:pPr>
-            <w:r>
-              <w:rPr>
-                <w:rFonts w:ascii="Calibri" w:hAnsi="Calibri"/>
-                <w:sz w:val="20"/>
-              </w:rPr>
               <w:t xml:space="default">-0.87 (-1.53, -0.24)</w:t>
             </w:r>
           </w:p>
@@ -706,7 +958,55 @@
                 <w:rFonts w:ascii="Calibri" w:hAnsi="Calibri"/>
                 <w:sz w:val="20"/>
               </w:rPr>
-              <w:t xml:space="default">106</w:t>
+              <w:t xml:space="default">-2.61</w:t>
+            </w:r>
+          </w:p>
+        </w:tc>
+        <w:tc>
+          <w:tcPr>
+            <w:tcBorders>
+              <w:top w:val="single" w:space="0" w:color="D3D3D3"/>
+              <w:bottom w:val="single" w:space="0" w:color="D3D3D3"/>
+              <w:start w:val="single" w:space="0" w:color="D3D3D3"/>
+              <w:end w:val="single" w:space="0" w:color="D3D3D3"/>
+            </w:tcBorders>
+          </w:tcPr>
+          <w:p>
+            <w:pPr>
+              <w:spacing w:before="0" w:after="60"/>
+              <w:keepNext/>
+              <w:jc w:val="end"/>
+            </w:pPr>
+            <w:r>
+              <w:rPr>
+                <w:rFonts w:ascii="Calibri" w:hAnsi="Calibri"/>
+                <w:sz w:val="20"/>
+              </w:rPr>
+              <w:t xml:space="default">29.13</w:t>
+            </w:r>
+          </w:p>
+        </w:tc>
+        <w:tc>
+          <w:tcPr>
+            <w:tcBorders>
+              <w:top w:val="single" w:space="0" w:color="D3D3D3"/>
+              <w:bottom w:val="single" w:space="0" w:color="D3D3D3"/>
+              <w:start w:val="single" w:space="0" w:color="D3D3D3"/>
+              <w:end w:val="single" w:space="0" w:color="D3D3D3"/>
+            </w:tcBorders>
+          </w:tcPr>
+          <w:p>
+            <w:pPr>
+              <w:spacing w:before="0" w:after="60"/>
+              <w:keepNext/>
+              <w:jc w:val="start"/>
+            </w:pPr>
+            <w:r>
+              <w:rPr>
+                <w:rFonts w:ascii="Calibri" w:hAnsi="Calibri"/>
+                <w:sz w:val="20"/>
+              </w:rPr>
+              <w:t xml:space="default">0.01</w:t>
             </w:r>
           </w:p>
         </w:tc>
@@ -731,6 +1031,78 @@
                 <w:sz w:val="20"/>
               </w:rPr>
               <w:t xml:space="default">-1.16 (-1.82, -0.53)</w:t>
+            </w:r>
+          </w:p>
+        </w:tc>
+        <w:tc>
+          <w:tcPr>
+            <w:tcBorders>
+              <w:top w:val="single" w:space="0" w:color="D3D3D3"/>
+              <w:bottom w:val="single" w:space="0" w:color="D3D3D3"/>
+              <w:start w:val="single" w:space="0" w:color="D3D3D3"/>
+              <w:end w:val="single" w:space="0" w:color="D3D3D3"/>
+            </w:tcBorders>
+          </w:tcPr>
+          <w:p>
+            <w:pPr>
+              <w:spacing w:before="0" w:after="60"/>
+              <w:keepNext/>
+              <w:jc w:val="end"/>
+            </w:pPr>
+            <w:r>
+              <w:rPr>
+                <w:rFonts w:ascii="Calibri" w:hAnsi="Calibri"/>
+                <w:sz w:val="20"/>
+              </w:rPr>
+              <w:t xml:space="default">-3.56</w:t>
+            </w:r>
+          </w:p>
+        </w:tc>
+        <w:tc>
+          <w:tcPr>
+            <w:tcBorders>
+              <w:top w:val="single" w:space="0" w:color="D3D3D3"/>
+              <w:bottom w:val="single" w:space="0" w:color="D3D3D3"/>
+              <w:start w:val="single" w:space="0" w:color="D3D3D3"/>
+              <w:end w:val="single" w:space="0" w:color="D3D3D3"/>
+            </w:tcBorders>
+          </w:tcPr>
+          <w:p>
+            <w:pPr>
+              <w:spacing w:before="0" w:after="60"/>
+              <w:keepNext/>
+              <w:jc w:val="end"/>
+            </w:pPr>
+            <w:r>
+              <w:rPr>
+                <w:rFonts w:ascii="Calibri" w:hAnsi="Calibri"/>
+                <w:sz w:val="20"/>
+              </w:rPr>
+              <w:t xml:space="default">28.51</w:t>
+            </w:r>
+          </w:p>
+        </w:tc>
+        <w:tc>
+          <w:tcPr>
+            <w:tcBorders>
+              <w:top w:val="single" w:space="0" w:color="D3D3D3"/>
+              <w:bottom w:val="single" w:space="0" w:color="D3D3D3"/>
+              <w:start w:val="single" w:space="0" w:color="D3D3D3"/>
+              <w:end w:val="single" w:space="0" w:color="D3D3D3"/>
+            </w:tcBorders>
+          </w:tcPr>
+          <w:p>
+            <w:pPr>
+              <w:spacing w:before="0" w:after="60"/>
+              <w:keepNext/>
+              <w:jc w:val="start"/>
+            </w:pPr>
+            <w:r>
+              <w:rPr>
+                <w:rFonts w:ascii="Calibri" w:hAnsi="Calibri"/>
+                <w:sz w:val="20"/>
+              </w:rPr>
+              <w:t xml:space="default">0.001</w:t>
             </w:r>
           </w:p>
         </w:tc>
@@ -792,30 +1164,6 @@
                 <w:rFonts w:ascii="Calibri" w:hAnsi="Calibri"/>
                 <w:sz w:val="20"/>
               </w:rPr>
-              <w:t xml:space="default">106</w:t>
-            </w:r>
-          </w:p>
-        </w:tc>
-        <w:tc>
-          <w:tcPr>
-            <w:tcBorders>
-              <w:top w:val="single" w:space="0" w:color="D3D3D3"/>
-              <w:bottom w:val="single" w:space="0" w:color="D3D3D3"/>
-              <w:start w:val="single" w:space="0" w:color="D3D3D3"/>
-              <w:end w:val="single" w:space="0" w:color="D3D3D3"/>
-            </w:tcBorders>
-          </w:tcPr>
-          <w:p>
-            <w:pPr>
-              <w:spacing w:before="0" w:after="60"/>
-              <w:keepNext/>
-              <w:jc w:val="end"/>
-            </w:pPr>
-            <w:r>
-              <w:rPr>
-                <w:rFonts w:ascii="Calibri" w:hAnsi="Calibri"/>
-                <w:sz w:val="20"/>
-              </w:rPr>
               <w:t xml:space="default">-0.66 (-1.32, -0.04)</w:t>
             </w:r>
           </w:p>
@@ -840,7 +1188,55 @@
                 <w:rFonts w:ascii="Calibri" w:hAnsi="Calibri"/>
                 <w:sz w:val="20"/>
               </w:rPr>
-              <w:t xml:space="default">106</w:t>
+              <w:t xml:space="default">-2.03</w:t>
+            </w:r>
+          </w:p>
+        </w:tc>
+        <w:tc>
+          <w:tcPr>
+            <w:tcBorders>
+              <w:top w:val="single" w:space="0" w:color="D3D3D3"/>
+              <w:bottom w:val="single" w:space="0" w:color="D3D3D3"/>
+              <w:start w:val="single" w:space="0" w:color="D3D3D3"/>
+              <w:end w:val="single" w:space="0" w:color="D3D3D3"/>
+            </w:tcBorders>
+          </w:tcPr>
+          <w:p>
+            <w:pPr>
+              <w:spacing w:before="0" w:after="60"/>
+              <w:keepNext/>
+              <w:jc w:val="end"/>
+            </w:pPr>
+            <w:r>
+              <w:rPr>
+                <w:rFonts w:ascii="Calibri" w:hAnsi="Calibri"/>
+                <w:sz w:val="20"/>
+              </w:rPr>
+              <w:t xml:space="default">27.67</w:t>
+            </w:r>
+          </w:p>
+        </w:tc>
+        <w:tc>
+          <w:tcPr>
+            <w:tcBorders>
+              <w:top w:val="single" w:space="0" w:color="D3D3D3"/>
+              <w:bottom w:val="single" w:space="0" w:color="D3D3D3"/>
+              <w:start w:val="single" w:space="0" w:color="D3D3D3"/>
+              <w:end w:val="single" w:space="0" w:color="D3D3D3"/>
+            </w:tcBorders>
+          </w:tcPr>
+          <w:p>
+            <w:pPr>
+              <w:spacing w:before="0" w:after="60"/>
+              <w:keepNext/>
+              <w:jc w:val="start"/>
+            </w:pPr>
+            <w:r>
+              <w:rPr>
+                <w:rFonts w:ascii="Calibri" w:hAnsi="Calibri"/>
+                <w:sz w:val="20"/>
+              </w:rPr>
+              <w:t xml:space="default">0.05</w:t>
             </w:r>
           </w:p>
         </w:tc>
@@ -865,6 +1261,78 @@
                 <w:sz w:val="20"/>
               </w:rPr>
               <w:t xml:space="default">-1.13 (-1.76, -0.52)</w:t>
+            </w:r>
+          </w:p>
+        </w:tc>
+        <w:tc>
+          <w:tcPr>
+            <w:tcBorders>
+              <w:top w:val="single" w:space="0" w:color="D3D3D3"/>
+              <w:bottom w:val="single" w:space="0" w:color="D3D3D3"/>
+              <w:start w:val="single" w:space="0" w:color="D3D3D3"/>
+              <w:end w:val="single" w:space="0" w:color="D3D3D3"/>
+            </w:tcBorders>
+          </w:tcPr>
+          <w:p>
+            <w:pPr>
+              <w:spacing w:before="0" w:after="60"/>
+              <w:keepNext/>
+              <w:jc w:val="end"/>
+            </w:pPr>
+            <w:r>
+              <w:rPr>
+                <w:rFonts w:ascii="Calibri" w:hAnsi="Calibri"/>
+                <w:sz w:val="20"/>
+              </w:rPr>
+              <w:t xml:space="default">-3.60</w:t>
+            </w:r>
+          </w:p>
+        </w:tc>
+        <w:tc>
+          <w:tcPr>
+            <w:tcBorders>
+              <w:top w:val="single" w:space="0" w:color="D3D3D3"/>
+              <w:bottom w:val="single" w:space="0" w:color="D3D3D3"/>
+              <w:start w:val="single" w:space="0" w:color="D3D3D3"/>
+              <w:end w:val="single" w:space="0" w:color="D3D3D3"/>
+            </w:tcBorders>
+          </w:tcPr>
+          <w:p>
+            <w:pPr>
+              <w:spacing w:before="0" w:after="60"/>
+              <w:keepNext/>
+              <w:jc w:val="end"/>
+            </w:pPr>
+            <w:r>
+              <w:rPr>
+                <w:rFonts w:ascii="Calibri" w:hAnsi="Calibri"/>
+                <w:sz w:val="20"/>
+              </w:rPr>
+              <w:t xml:space="default">26.87</w:t>
+            </w:r>
+          </w:p>
+        </w:tc>
+        <w:tc>
+          <w:tcPr>
+            <w:tcBorders>
+              <w:top w:val="single" w:space="0" w:color="D3D3D3"/>
+              <w:bottom w:val="single" w:space="0" w:color="D3D3D3"/>
+              <w:start w:val="single" w:space="0" w:color="D3D3D3"/>
+              <w:end w:val="single" w:space="0" w:color="D3D3D3"/>
+            </w:tcBorders>
+          </w:tcPr>
+          <w:p>
+            <w:pPr>
+              <w:spacing w:before="0" w:after="60"/>
+              <w:keepNext/>
+              <w:jc w:val="start"/>
+            </w:pPr>
+            <w:r>
+              <w:rPr>
+                <w:rFonts w:ascii="Calibri" w:hAnsi="Calibri"/>
+                <w:sz w:val="20"/>
+              </w:rPr>
+              <w:t xml:space="default">0.001</w:t>
             </w:r>
           </w:p>
         </w:tc>
@@ -884,7 +1352,7 @@
             <w:tcMar>
               <w:top w:w="25" w:type="dxa"/>
             </w:tcMar>
-            <w:gridSpan w:val="5"/>
+            <w:gridSpan w:val="9"/>
           </w:tcPr>
           <w:p>
             <w:pPr>
@@ -950,30 +1418,6 @@
                 <w:rFonts w:ascii="Calibri" w:hAnsi="Calibri"/>
                 <w:sz w:val="20"/>
               </w:rPr>
-              <w:t xml:space="default">106</w:t>
-            </w:r>
-          </w:p>
-        </w:tc>
-        <w:tc>
-          <w:tcPr>
-            <w:tcBorders>
-              <w:top w:val="single" w:space="0" w:color="D3D3D3"/>
-              <w:bottom w:val="single" w:space="0" w:color="D3D3D3"/>
-              <w:start w:val="single" w:space="0" w:color="D3D3D3"/>
-              <w:end w:val="single" w:space="0" w:color="D3D3D3"/>
-            </w:tcBorders>
-          </w:tcPr>
-          <w:p>
-            <w:pPr>
-              <w:spacing w:before="0" w:after="60"/>
-              <w:keepNext/>
-              <w:jc w:val="end"/>
-            </w:pPr>
-            <w:r>
-              <w:rPr>
-                <w:rFonts w:ascii="Calibri" w:hAnsi="Calibri"/>
-                <w:sz w:val="20"/>
-              </w:rPr>
               <w:t xml:space="default">-1.32 (-1.9, -0.78)</w:t>
             </w:r>
           </w:p>
@@ -998,7 +1442,55 @@
                 <w:rFonts w:ascii="Calibri" w:hAnsi="Calibri"/>
                 <w:sz w:val="20"/>
               </w:rPr>
-              <w:t xml:space="default">106</w:t>
+              <w:t xml:space="default">-4.53</w:t>
+            </w:r>
+          </w:p>
+        </w:tc>
+        <w:tc>
+          <w:tcPr>
+            <w:tcBorders>
+              <w:top w:val="single" w:space="0" w:color="D3D3D3"/>
+              <w:bottom w:val="single" w:space="0" w:color="D3D3D3"/>
+              <w:start w:val="single" w:space="0" w:color="D3D3D3"/>
+              <w:end w:val="single" w:space="0" w:color="D3D3D3"/>
+            </w:tcBorders>
+          </w:tcPr>
+          <w:p>
+            <w:pPr>
+              <w:spacing w:before="0" w:after="60"/>
+              <w:keepNext/>
+              <w:jc w:val="end"/>
+            </w:pPr>
+            <w:r>
+              <w:rPr>
+                <w:rFonts w:ascii="Calibri" w:hAnsi="Calibri"/>
+                <w:sz w:val="20"/>
+              </w:rPr>
+              <w:t xml:space="default">28.61</w:t>
+            </w:r>
+          </w:p>
+        </w:tc>
+        <w:tc>
+          <w:tcPr>
+            <w:tcBorders>
+              <w:top w:val="single" w:space="0" w:color="D3D3D3"/>
+              <w:bottom w:val="single" w:space="0" w:color="D3D3D3"/>
+              <w:start w:val="single" w:space="0" w:color="D3D3D3"/>
+              <w:end w:val="single" w:space="0" w:color="D3D3D3"/>
+            </w:tcBorders>
+          </w:tcPr>
+          <w:p>
+            <w:pPr>
+              <w:spacing w:before="0" w:after="60"/>
+              <w:keepNext/>
+              <w:jc w:val="start"/>
+            </w:pPr>
+            <w:r>
+              <w:rPr>
+                <w:rFonts w:ascii="Calibri" w:hAnsi="Calibri"/>
+                <w:sz w:val="20"/>
+              </w:rPr>
+              <w:t xml:space="default">1e-04</w:t>
             </w:r>
           </w:p>
         </w:tc>
@@ -1023,6 +1515,78 @@
                 <w:sz w:val="20"/>
               </w:rPr>
               <w:t xml:space="default">-1.39 (-1.99, -0.85)</w:t>
+            </w:r>
+          </w:p>
+        </w:tc>
+        <w:tc>
+          <w:tcPr>
+            <w:tcBorders>
+              <w:top w:val="single" w:space="0" w:color="D3D3D3"/>
+              <w:bottom w:val="single" w:space="0" w:color="D3D3D3"/>
+              <w:start w:val="single" w:space="0" w:color="D3D3D3"/>
+              <w:end w:val="single" w:space="0" w:color="D3D3D3"/>
+            </w:tcBorders>
+          </w:tcPr>
+          <w:p>
+            <w:pPr>
+              <w:spacing w:before="0" w:after="60"/>
+              <w:keepNext/>
+              <w:jc w:val="end"/>
+            </w:pPr>
+            <w:r>
+              <w:rPr>
+                <w:rFonts w:ascii="Calibri" w:hAnsi="Calibri"/>
+                <w:sz w:val="20"/>
+              </w:rPr>
+              <w:t xml:space="default">-4.74</w:t>
+            </w:r>
+          </w:p>
+        </w:tc>
+        <w:tc>
+          <w:tcPr>
+            <w:tcBorders>
+              <w:top w:val="single" w:space="0" w:color="D3D3D3"/>
+              <w:bottom w:val="single" w:space="0" w:color="D3D3D3"/>
+              <w:start w:val="single" w:space="0" w:color="D3D3D3"/>
+              <w:end w:val="single" w:space="0" w:color="D3D3D3"/>
+            </w:tcBorders>
+          </w:tcPr>
+          <w:p>
+            <w:pPr>
+              <w:spacing w:before="0" w:after="60"/>
+              <w:keepNext/>
+              <w:jc w:val="end"/>
+            </w:pPr>
+            <w:r>
+              <w:rPr>
+                <w:rFonts w:ascii="Calibri" w:hAnsi="Calibri"/>
+                <w:sz w:val="20"/>
+              </w:rPr>
+              <w:t xml:space="default">28.45</w:t>
+            </w:r>
+          </w:p>
+        </w:tc>
+        <w:tc>
+          <w:tcPr>
+            <w:tcBorders>
+              <w:top w:val="single" w:space="0" w:color="D3D3D3"/>
+              <w:bottom w:val="single" w:space="0" w:color="D3D3D3"/>
+              <w:start w:val="single" w:space="0" w:color="D3D3D3"/>
+              <w:end w:val="single" w:space="0" w:color="D3D3D3"/>
+            </w:tcBorders>
+          </w:tcPr>
+          <w:p>
+            <w:pPr>
+              <w:spacing w:before="0" w:after="60"/>
+              <w:keepNext/>
+              <w:jc w:val="start"/>
+            </w:pPr>
+            <w:r>
+              <w:rPr>
+                <w:rFonts w:ascii="Calibri" w:hAnsi="Calibri"/>
+                <w:sz w:val="20"/>
+              </w:rPr>
+              <w:t xml:space="default">1e-04</w:t>
             </w:r>
           </w:p>
         </w:tc>
@@ -1084,30 +1648,6 @@
                 <w:rFonts w:ascii="Calibri" w:hAnsi="Calibri"/>
                 <w:sz w:val="20"/>
               </w:rPr>
-              <w:t xml:space="default">106</w:t>
-            </w:r>
-          </w:p>
-        </w:tc>
-        <w:tc>
-          <w:tcPr>
-            <w:tcBorders>
-              <w:top w:val="single" w:space="0" w:color="D3D3D3"/>
-              <w:bottom w:val="single" w:space="0" w:color="D3D3D3"/>
-              <w:start w:val="single" w:space="0" w:color="D3D3D3"/>
-              <w:end w:val="single" w:space="0" w:color="D3D3D3"/>
-            </w:tcBorders>
-          </w:tcPr>
-          <w:p>
-            <w:pPr>
-              <w:spacing w:before="0" w:after="60"/>
-              <w:keepNext/>
-              <w:jc w:val="end"/>
-            </w:pPr>
-            <w:r>
-              <w:rPr>
-                <w:rFonts w:ascii="Calibri" w:hAnsi="Calibri"/>
-                <w:sz w:val="20"/>
-              </w:rPr>
               <w:t xml:space="default">-1.41 (-2.07, -0.77)</w:t>
             </w:r>
           </w:p>
@@ -1132,7 +1672,55 @@
                 <w:rFonts w:ascii="Calibri" w:hAnsi="Calibri"/>
                 <w:sz w:val="20"/>
               </w:rPr>
-              <w:t xml:space="default">106</w:t>
+              <w:t xml:space="default">-4.21</w:t>
+            </w:r>
+          </w:p>
+        </w:tc>
+        <w:tc>
+          <w:tcPr>
+            <w:tcBorders>
+              <w:top w:val="single" w:space="0" w:color="D3D3D3"/>
+              <w:bottom w:val="single" w:space="0" w:color="D3D3D3"/>
+              <w:start w:val="single" w:space="0" w:color="D3D3D3"/>
+              <w:end w:val="single" w:space="0" w:color="D3D3D3"/>
+            </w:tcBorders>
+          </w:tcPr>
+          <w:p>
+            <w:pPr>
+              <w:spacing w:before="0" w:after="60"/>
+              <w:keepNext/>
+              <w:jc w:val="end"/>
+            </w:pPr>
+            <w:r>
+              <w:rPr>
+                <w:rFonts w:ascii="Calibri" w:hAnsi="Calibri"/>
+                <w:sz w:val="20"/>
+              </w:rPr>
+              <w:t xml:space="default">27.00</w:t>
+            </w:r>
+          </w:p>
+        </w:tc>
+        <w:tc>
+          <w:tcPr>
+            <w:tcBorders>
+              <w:top w:val="single" w:space="0" w:color="D3D3D3"/>
+              <w:bottom w:val="single" w:space="0" w:color="D3D3D3"/>
+              <w:start w:val="single" w:space="0" w:color="D3D3D3"/>
+              <w:end w:val="single" w:space="0" w:color="D3D3D3"/>
+            </w:tcBorders>
+          </w:tcPr>
+          <w:p>
+            <w:pPr>
+              <w:spacing w:before="0" w:after="60"/>
+              <w:keepNext/>
+              <w:jc w:val="start"/>
+            </w:pPr>
+            <w:r>
+              <w:rPr>
+                <w:rFonts w:ascii="Calibri" w:hAnsi="Calibri"/>
+                <w:sz w:val="20"/>
+              </w:rPr>
+              <w:t xml:space="default">3e-04</w:t>
             </w:r>
           </w:p>
         </w:tc>
@@ -1157,6 +1745,78 @@
                 <w:sz w:val="20"/>
               </w:rPr>
               <w:t xml:space="default">-1.33 (-1.95, -0.7)</w:t>
+            </w:r>
+          </w:p>
+        </w:tc>
+        <w:tc>
+          <w:tcPr>
+            <w:tcBorders>
+              <w:top w:val="single" w:space="0" w:color="D3D3D3"/>
+              <w:bottom w:val="single" w:space="0" w:color="D3D3D3"/>
+              <w:start w:val="single" w:space="0" w:color="D3D3D3"/>
+              <w:end w:val="single" w:space="0" w:color="D3D3D3"/>
+            </w:tcBorders>
+          </w:tcPr>
+          <w:p>
+            <w:pPr>
+              <w:spacing w:before="0" w:after="60"/>
+              <w:keepNext/>
+              <w:jc w:val="end"/>
+            </w:pPr>
+            <w:r>
+              <w:rPr>
+                <w:rFonts w:ascii="Calibri" w:hAnsi="Calibri"/>
+                <w:sz w:val="20"/>
+              </w:rPr>
+              <w:t xml:space="default">-4.14</w:t>
+            </w:r>
+          </w:p>
+        </w:tc>
+        <w:tc>
+          <w:tcPr>
+            <w:tcBorders>
+              <w:top w:val="single" w:space="0" w:color="D3D3D3"/>
+              <w:bottom w:val="single" w:space="0" w:color="D3D3D3"/>
+              <w:start w:val="single" w:space="0" w:color="D3D3D3"/>
+              <w:end w:val="single" w:space="0" w:color="D3D3D3"/>
+            </w:tcBorders>
+          </w:tcPr>
+          <w:p>
+            <w:pPr>
+              <w:spacing w:before="0" w:after="60"/>
+              <w:keepNext/>
+              <w:jc w:val="end"/>
+            </w:pPr>
+            <w:r>
+              <w:rPr>
+                <w:rFonts w:ascii="Calibri" w:hAnsi="Calibri"/>
+                <w:sz w:val="20"/>
+              </w:rPr>
+              <w:t xml:space="default">26.38</w:t>
+            </w:r>
+          </w:p>
+        </w:tc>
+        <w:tc>
+          <w:tcPr>
+            <w:tcBorders>
+              <w:top w:val="single" w:space="0" w:color="D3D3D3"/>
+              <w:bottom w:val="single" w:space="0" w:color="D3D3D3"/>
+              <w:start w:val="single" w:space="0" w:color="D3D3D3"/>
+              <w:end w:val="single" w:space="0" w:color="D3D3D3"/>
+            </w:tcBorders>
+          </w:tcPr>
+          <w:p>
+            <w:pPr>
+              <w:spacing w:before="0" w:after="60"/>
+              <w:keepNext/>
+              <w:jc w:val="start"/>
+            </w:pPr>
+            <w:r>
+              <w:rPr>
+                <w:rFonts w:ascii="Calibri" w:hAnsi="Calibri"/>
+                <w:sz w:val="20"/>
+              </w:rPr>
+              <w:t xml:space="default">3e-04</w:t>
             </w:r>
           </w:p>
         </w:tc>
@@ -1167,7 +1827,7 @@
         </w:trPr>
         <w:tc>
           <w:tcPr>
-            <w:gridSpan w:val="5"/>
+            <w:gridSpan w:val="9"/>
           </w:tcPr>
           <w:p>
             <w:pPr>
@@ -1199,7 +1859,7 @@
         </w:trPr>
         <w:tc>
           <w:tcPr>
-            <w:gridSpan w:val="5"/>
+            <w:gridSpan w:val="9"/>
           </w:tcPr>
           <w:p>
             <w:pPr>
@@ -1231,7 +1891,7 @@
         </w:trPr>
         <w:tc>
           <w:tcPr>
-            <w:gridSpan w:val="5"/>
+            <w:gridSpan w:val="9"/>
           </w:tcPr>
           <w:p>
             <w:pPr>
@@ -1263,7 +1923,7 @@
         </w:trPr>
         <w:tc>
           <w:tcPr>
-            <w:gridSpan w:val="5"/>
+            <w:gridSpan w:val="9"/>
           </w:tcPr>
           <w:p>
             <w:pPr>
@@ -1294,9 +1954,6 @@
       <w:pPr>
         <w:pStyle w:val="FirstParagraph"/>
       </w:pPr>
-      <w:r>
-        <w:t xml:space="preserve"/>
-      </w:r>
     </w:p>
     <w:sectPr/>
   </w:body>
@@ -1329,14 +1986,14 @@
 <file path=word/numbering.xml><?xml version="1.0" encoding="utf-8"?>
 <w:numbering xmlns:w="http://schemas.openxmlformats.org/wordprocessingml/2006/main">
   <w:abstractNum w:abstractNumId="990">
-    <w:nsid w:val="A990"/>
+    <w:nsid w:val="0000A990"/>
     <w:multiLevelType w:val="multilevel"/>
     <w:lvl w:ilvl="0">
       <w:numFmt w:val="bullet"/>
       <w:lvlText w:val=" "/>
       <w:lvlJc w:val="left"/>
       <w:pPr>
-        <w:ind w:left="720" w:hanging="480"/>
+        <w:ind w:left="720" w:hanging="360"/>
       </w:pPr>
     </w:lvl>
     <w:lvl w:ilvl="1">
@@ -1344,7 +2001,7 @@
       <w:lvlText w:val=" "/>
       <w:lvlJc w:val="left"/>
       <w:pPr>
-        <w:ind w:left="1440" w:hanging="480"/>
+        <w:ind w:left="1440" w:hanging="360"/>
       </w:pPr>
     </w:lvl>
     <w:lvl w:ilvl="2">
@@ -1352,7 +2009,7 @@
       <w:lvlText w:val=" "/>
       <w:lvlJc w:val="left"/>
       <w:pPr>
-        <w:ind w:left="2160" w:hanging="480"/>
+        <w:ind w:left="2160" w:hanging="360"/>
       </w:pPr>
     </w:lvl>
     <w:lvl w:ilvl="3">
@@ -1360,7 +2017,7 @@
       <w:lvlText w:val=" "/>
       <w:lvlJc w:val="left"/>
       <w:pPr>
-        <w:ind w:left="2880" w:hanging="480"/>
+        <w:ind w:left="2880" w:hanging="360"/>
       </w:pPr>
     </w:lvl>
     <w:lvl w:ilvl="4">
@@ -1368,7 +2025,7 @@
       <w:lvlText w:val=" "/>
       <w:lvlJc w:val="left"/>
       <w:pPr>
-        <w:ind w:left="3600" w:hanging="480"/>
+        <w:ind w:left="3600" w:hanging="360"/>
       </w:pPr>
     </w:lvl>
     <w:lvl w:ilvl="5">
@@ -1376,7 +2033,7 @@
       <w:lvlText w:val=" "/>
       <w:lvlJc w:val="left"/>
       <w:pPr>
-        <w:ind w:left="4320" w:hanging="480"/>
+        <w:ind w:left="4320" w:hanging="360"/>
       </w:pPr>
     </w:lvl>
     <w:lvl w:ilvl="6">
@@ -1384,7 +2041,7 @@
       <w:lvlText w:val=" "/>
       <w:lvlJc w:val="left"/>
       <w:pPr>
-        <w:ind w:left="5040" w:hanging="480"/>
+        <w:ind w:left="5040" w:hanging="360"/>
       </w:pPr>
     </w:lvl>
     <w:lvl w:ilvl="7">
@@ -1392,7 +2049,7 @@
       <w:lvlText w:val=" "/>
       <w:lvlJc w:val="left"/>
       <w:pPr>
-        <w:ind w:left="5760" w:hanging="480"/>
+        <w:ind w:left="5760" w:hanging="360"/>
       </w:pPr>
     </w:lvl>
     <w:lvl w:ilvl="8">
@@ -1400,7 +2057,7 @@
       <w:lvlText w:val=" "/>
       <w:lvlJc w:val="left"/>
       <w:pPr>
-        <w:ind w:left="6480" w:hanging="480"/>
+        <w:ind w:left="6480" w:hanging="360"/>
       </w:pPr>
     </w:lvl>
   </w:abstractNum>
@@ -1436,10 +2093,10 @@
     <w:name w:val="Body Text"/>
     <w:basedOn w:val="Normal"/>
     <w:link w:val="BodyTextChar"/>
+    <w:qFormat/>
     <w:pPr>
       <w:spacing w:after="180" w:before="180"/>
     </w:pPr>
-    <w:qFormat/>
   </w:style>
   <w:style w:customStyle="1" w:styleId="FirstParagraph" w:type="paragraph">
     <w:name w:val="First Paragraph"/>
@@ -1459,36 +2116,69 @@
     <w:name w:val="Title"/>
     <w:basedOn w:val="Normal"/>
     <w:next w:val="BodyText"/>
+    <w:link w:val="TitleChar"/>
+    <w:uiPriority w:val="10"/>
     <w:qFormat/>
+    <w:rsid w:val="00A10FD9"/>
     <w:pPr>
-      <w:keepNext/>
-      <w:keepLines/>
-      <w:spacing w:after="240" w:before="480"/>
+      <w:spacing w:after="80" w:line="240" w:lineRule="auto"/>
+      <w:contextualSpacing/>
       <w:jc w:val="center"/>
     </w:pPr>
     <w:rPr>
       <w:rFonts w:asciiTheme="majorHAnsi" w:cstheme="majorBidi" w:eastAsiaTheme="majorEastAsia" w:hAnsiTheme="majorHAnsi"/>
-      <w:b/>
-      <w:bCs/>
-      <w:color w:themeColor="accent1" w:themeShade="B5" w:val="345A8A"/>
-      <w:sz w:val="36"/>
-      <w:szCs w:val="36"/>
+      <w:spacing w:val="-10"/>
+      <w:kern w:val="28"/>
+      <w:sz w:val="56"/>
+      <w:szCs w:val="56"/>
+    </w:rPr>
+  </w:style>
+  <w:style w:customStyle="1" w:styleId="TitleChar" w:type="character">
+    <w:name w:val="Title Char"/>
+    <w:basedOn w:val="DefaultParagraphFont"/>
+    <w:link w:val="Title"/>
+    <w:uiPriority w:val="10"/>
+    <w:rsid w:val="00A10FD9"/>
+    <w:rPr>
+      <w:rFonts w:asciiTheme="majorHAnsi" w:cstheme="majorBidi" w:eastAsiaTheme="majorEastAsia" w:hAnsiTheme="majorHAnsi"/>
+      <w:spacing w:val="-10"/>
+      <w:kern w:val="28"/>
+      <w:sz w:val="56"/>
+      <w:szCs w:val="56"/>
     </w:rPr>
   </w:style>
   <w:style w:styleId="Subtitle" w:type="paragraph">
     <w:name w:val="Subtitle"/>
     <w:basedOn w:val="Title"/>
     <w:next w:val="BodyText"/>
+    <w:link w:val="SubtitleChar"/>
+    <w:uiPriority w:val="11"/>
     <w:qFormat/>
+    <w:rsid w:val="00A10FD9"/>
     <w:pPr>
-      <w:keepNext/>
-      <w:keepLines/>
-      <w:spacing w:after="240" w:before="240"/>
-      <w:jc w:val="center"/>
+      <w:numPr>
+        <w:ilvl w:val="1"/>
+      </w:numPr>
     </w:pPr>
     <w:rPr>
-      <w:sz w:val="30"/>
-      <w:szCs w:val="30"/>
+      <w:rFonts w:cstheme="majorBidi" w:eastAsiaTheme="majorEastAsia"/>
+      <w:spacing w:val="15"/>
+      <w:sz w:val="28"/>
+      <w:szCs w:val="28"/>
+    </w:rPr>
+  </w:style>
+  <w:style w:customStyle="1" w:styleId="SubtitleChar" w:type="character">
+    <w:name w:val="Subtitle Char"/>
+    <w:basedOn w:val="DefaultParagraphFont"/>
+    <w:link w:val="Subtitle"/>
+    <w:uiPriority w:val="11"/>
+    <w:rsid w:val="00A10FD9"/>
+    <w:rPr>
+      <w:rFonts w:cstheme="majorBidi" w:eastAsiaTheme="majorEastAsia"/>
+      <w:color w:themeColor="text1" w:themeTint="A6" w:val="595959"/>
+      <w:spacing w:val="15"/>
+      <w:sz w:val="28"/>
+      <w:szCs w:val="28"/>
     </w:rPr>
   </w:style>
   <w:style w:customStyle="1" w:styleId="Author" w:type="paragraph">
@@ -1519,15 +2209,13 @@
     <w:pPr>
       <w:keepNext/>
       <w:keepLines/>
+      <w:spacing w:after="0" w:before="300"/>
       <w:jc w:val="center"/>
-      <w:spacing w:after="0" w:before="300"/>
     </w:pPr>
     <w:rPr>
+      <w:b/>
       <w:sz w:val="20"/>
       <w:szCs w:val="20"/>
-      <w:b/>
-      <w:color w:val="345A8A"/>
-      &gt;
     </w:rPr>
   </w:style>
   <w:style w:customStyle="1" w:styleId="Abstract" w:type="paragraph">
@@ -1554,191 +2242,321 @@
     <w:rPr/>
   </w:style>
   <w:style w:styleId="Heading1" w:type="paragraph">
-    <w:name w:val="Heading 1"/>
+    <w:name w:val="heading 1"/>
     <w:basedOn w:val="Normal"/>
     <w:next w:val="BodyText"/>
+    <w:link w:val="Heading1Char"/>
     <w:uiPriority w:val="9"/>
     <w:qFormat/>
+    <w:rsid w:val="00A10FD9"/>
     <w:pPr>
       <w:keepNext/>
       <w:keepLines/>
-      <w:spacing w:after="0" w:before="480"/>
+      <w:spacing w:after="80" w:before="360"/>
       <w:outlineLvl w:val="0"/>
     </w:pPr>
     <w:rPr>
       <w:rFonts w:asciiTheme="majorHAnsi" w:cstheme="majorBidi" w:eastAsiaTheme="majorEastAsia" w:hAnsiTheme="majorHAnsi"/>
-      <w:b/>
-      <w:bCs/>
-      <w:color w:themeColor="accent1" w:val="4F81BD"/>
-      <w:sz w:val="32"/>
-      <w:szCs w:val="32"/>
+      <w:color w:themeColor="accent1" w:themeShade="BF" w:val="0F4761"/>
+      <w:sz w:val="40"/>
+      <w:szCs w:val="40"/>
     </w:rPr>
   </w:style>
   <w:style w:styleId="Heading2" w:type="paragraph">
-    <w:name w:val="Heading 2"/>
+    <w:name w:val="heading 2"/>
     <w:basedOn w:val="Normal"/>
     <w:next w:val="BodyText"/>
+    <w:link w:val="Heading2Char"/>
     <w:uiPriority w:val="9"/>
+    <w:semiHidden/>
     <w:unhideWhenUsed/>
     <w:qFormat/>
+    <w:rsid w:val="00A10FD9"/>
     <w:pPr>
       <w:keepNext/>
       <w:keepLines/>
-      <w:spacing w:after="0" w:before="200"/>
+      <w:spacing w:after="80" w:before="160"/>
       <w:outlineLvl w:val="1"/>
     </w:pPr>
     <w:rPr>
       <w:rFonts w:asciiTheme="majorHAnsi" w:cstheme="majorBidi" w:eastAsiaTheme="majorEastAsia" w:hAnsiTheme="majorHAnsi"/>
-      <w:b/>
-      <w:bCs/>
-      <w:color w:themeColor="accent1" w:val="4F81BD"/>
-      <w:sz w:val="28"/>
-      <w:szCs w:val="28"/>
+      <w:color w:themeColor="accent1" w:themeShade="BF" w:val="0F4761"/>
+      <w:sz w:val="32"/>
+      <w:szCs w:val="32"/>
     </w:rPr>
   </w:style>
   <w:style w:styleId="Heading3" w:type="paragraph">
-    <w:name w:val="Heading 3"/>
+    <w:name w:val="heading 3"/>
     <w:basedOn w:val="Normal"/>
     <w:next w:val="BodyText"/>
+    <w:link w:val="Heading3Char"/>
     <w:uiPriority w:val="9"/>
+    <w:semiHidden/>
     <w:unhideWhenUsed/>
     <w:qFormat/>
+    <w:rsid w:val="00A10FD9"/>
     <w:pPr>
       <w:keepNext/>
       <w:keepLines/>
-      <w:spacing w:after="0" w:before="200"/>
+      <w:spacing w:after="80" w:before="160"/>
       <w:outlineLvl w:val="2"/>
     </w:pPr>
     <w:rPr>
-      <w:rFonts w:asciiTheme="majorHAnsi" w:cstheme="majorBidi" w:eastAsiaTheme="majorEastAsia" w:hAnsiTheme="majorHAnsi"/>
-      <w:b/>
-      <w:bCs/>
-      <w:color w:themeColor="accent1" w:val="4F81BD"/>
-      <w:sz w:val="24"/>
-      <w:szCs w:val="24"/>
+      <w:rFonts w:cstheme="majorBidi" w:eastAsiaTheme="majorEastAsia"/>
+      <w:color w:themeColor="accent1" w:themeShade="BF" w:val="0F4761"/>
+      <w:sz w:val="28"/>
+      <w:szCs w:val="28"/>
     </w:rPr>
   </w:style>
   <w:style w:styleId="Heading4" w:type="paragraph">
-    <w:name w:val="Heading 4"/>
+    <w:name w:val="heading 4"/>
     <w:basedOn w:val="Normal"/>
     <w:next w:val="BodyText"/>
+    <w:link w:val="Heading4Char"/>
     <w:uiPriority w:val="9"/>
+    <w:semiHidden/>
     <w:unhideWhenUsed/>
     <w:qFormat/>
+    <w:rsid w:val="00A10FD9"/>
     <w:pPr>
       <w:keepNext/>
       <w:keepLines/>
-      <w:spacing w:after="0" w:before="200"/>
+      <w:spacing w:after="40" w:before="80"/>
       <w:outlineLvl w:val="3"/>
     </w:pPr>
     <w:rPr>
-      <w:rFonts w:asciiTheme="majorHAnsi" w:cstheme="majorBidi" w:eastAsiaTheme="majorEastAsia" w:hAnsiTheme="majorHAnsi"/>
+      <w:rFonts w:cstheme="majorBidi" w:eastAsiaTheme="majorEastAsia"/>
       <w:i/>
-      <w:bCs/>
-      <w:color w:themeColor="accent1" w:val="4F81BD"/>
-      <w:sz w:val="24"/>
-      <w:szCs w:val="24"/>
+      <w:iCs/>
+      <w:color w:themeColor="accent1" w:themeShade="BF" w:val="0F4761"/>
     </w:rPr>
   </w:style>
   <w:style w:styleId="Heading5" w:type="paragraph">
-    <w:name w:val="Heading 5"/>
+    <w:name w:val="heading 5"/>
     <w:basedOn w:val="Normal"/>
     <w:next w:val="BodyText"/>
+    <w:link w:val="Heading5Char"/>
     <w:uiPriority w:val="9"/>
+    <w:semiHidden/>
     <w:unhideWhenUsed/>
     <w:qFormat/>
+    <w:rsid w:val="00A10FD9"/>
     <w:pPr>
       <w:keepNext/>
       <w:keepLines/>
-      <w:spacing w:after="0" w:before="200"/>
+      <w:spacing w:after="40" w:before="80"/>
       <w:outlineLvl w:val="4"/>
     </w:pPr>
     <w:rPr>
-      <w:rFonts w:asciiTheme="majorHAnsi" w:cstheme="majorBidi" w:eastAsiaTheme="majorEastAsia" w:hAnsiTheme="majorHAnsi"/>
-      <w:iCs/>
-      <w:color w:themeColor="accent1" w:val="4F81BD"/>
-      <w:sz w:val="24"/>
-      <w:szCs w:val="24"/>
+      <w:rFonts w:cstheme="majorBidi" w:eastAsiaTheme="majorEastAsia"/>
+      <w:color w:themeColor="accent1" w:themeShade="BF" w:val="0F4761"/>
     </w:rPr>
   </w:style>
   <w:style w:styleId="Heading6" w:type="paragraph">
-    <w:name w:val="Heading 6"/>
+    <w:name w:val="heading 6"/>
     <w:basedOn w:val="Normal"/>
     <w:next w:val="BodyText"/>
+    <w:link w:val="Heading6Char"/>
     <w:uiPriority w:val="9"/>
+    <w:semiHidden/>
     <w:unhideWhenUsed/>
     <w:qFormat/>
+    <w:rsid w:val="00A10FD9"/>
     <w:pPr>
       <w:keepNext/>
       <w:keepLines/>
-      <w:spacing w:after="0" w:before="200"/>
+      <w:spacing w:after="0" w:before="40"/>
       <w:outlineLvl w:val="5"/>
     </w:pPr>
     <w:rPr>
-      <w:rFonts w:asciiTheme="majorHAnsi" w:cstheme="majorBidi" w:eastAsiaTheme="majorEastAsia" w:hAnsiTheme="majorHAnsi"/>
-      <w:color w:themeColor="accent1" w:val="4F81BD"/>
-      <w:sz w:val="24"/>
-      <w:szCs w:val="24"/>
+      <w:rFonts w:cstheme="majorBidi" w:eastAsiaTheme="majorEastAsia"/>
+      <w:i/>
+      <w:iCs/>
+      <w:color w:themeColor="text1" w:themeTint="A6" w:val="595959"/>
     </w:rPr>
   </w:style>
   <w:style w:styleId="Heading7" w:type="paragraph">
-    <w:name w:val="Heading 7"/>
+    <w:name w:val="heading 7"/>
     <w:basedOn w:val="Normal"/>
     <w:next w:val="BodyText"/>
+    <w:link w:val="Heading7Char"/>
     <w:uiPriority w:val="9"/>
+    <w:semiHidden/>
     <w:unhideWhenUsed/>
     <w:qFormat/>
+    <w:rsid w:val="00A10FD9"/>
     <w:pPr>
       <w:keepNext/>
       <w:keepLines/>
-      <w:spacing w:after="0" w:before="200"/>
+      <w:spacing w:after="0" w:before="40"/>
       <w:outlineLvl w:val="6"/>
     </w:pPr>
     <w:rPr>
-      <w:rFonts w:asciiTheme="majorHAnsi" w:cstheme="majorBidi" w:eastAsiaTheme="majorEastAsia" w:hAnsiTheme="majorHAnsi"/>
-      <w:color w:themeColor="accent1" w:val="4F81BD"/>
-      <w:sz w:val="24"/>
-      <w:szCs w:val="24"/>
+      <w:rFonts w:cstheme="majorBidi" w:eastAsiaTheme="majorEastAsia"/>
+      <w:color w:themeColor="text1" w:themeTint="A6" w:val="595959"/>
     </w:rPr>
   </w:style>
   <w:style w:styleId="Heading8" w:type="paragraph">
-    <w:name w:val="Heading 8"/>
+    <w:name w:val="heading 8"/>
     <w:basedOn w:val="Normal"/>
     <w:next w:val="BodyText"/>
+    <w:link w:val="Heading8Char"/>
     <w:uiPriority w:val="9"/>
+    <w:semiHidden/>
     <w:unhideWhenUsed/>
     <w:qFormat/>
+    <w:rsid w:val="00A10FD9"/>
     <w:pPr>
       <w:keepNext/>
       <w:keepLines/>
-      <w:spacing w:after="0" w:before="200"/>
+      <w:spacing w:after="0"/>
       <w:outlineLvl w:val="7"/>
     </w:pPr>
     <w:rPr>
-      <w:rFonts w:asciiTheme="majorHAnsi" w:cstheme="majorBidi" w:eastAsiaTheme="majorEastAsia" w:hAnsiTheme="majorHAnsi"/>
-      <w:color w:themeColor="accent1" w:val="4F81BD"/>
-      <w:sz w:val="24"/>
-      <w:szCs w:val="24"/>
+      <w:rFonts w:cstheme="majorBidi" w:eastAsiaTheme="majorEastAsia"/>
+      <w:i/>
+      <w:iCs/>
+      <w:color w:themeColor="text1" w:themeTint="D8" w:val="272727"/>
     </w:rPr>
   </w:style>
   <w:style w:styleId="Heading9" w:type="paragraph">
-    <w:name w:val="Heading 9"/>
+    <w:name w:val="heading 9"/>
     <w:basedOn w:val="Normal"/>
     <w:next w:val="BodyText"/>
+    <w:link w:val="Heading9Char"/>
     <w:uiPriority w:val="9"/>
+    <w:semiHidden/>
     <w:unhideWhenUsed/>
     <w:qFormat/>
+    <w:rsid w:val="00A10FD9"/>
     <w:pPr>
       <w:keepNext/>
       <w:keepLines/>
-      <w:spacing w:after="0" w:before="200"/>
+      <w:spacing w:after="0"/>
       <w:outlineLvl w:val="8"/>
     </w:pPr>
     <w:rPr>
+      <w:rFonts w:cstheme="majorBidi" w:eastAsiaTheme="majorEastAsia"/>
+      <w:color w:themeColor="text1" w:themeTint="D8" w:val="272727"/>
+    </w:rPr>
+  </w:style>
+  <w:style w:customStyle="1" w:styleId="Heading1Char" w:type="character">
+    <w:name w:val="Heading 1 Char"/>
+    <w:basedOn w:val="DefaultParagraphFont"/>
+    <w:link w:val="Heading1"/>
+    <w:uiPriority w:val="9"/>
+    <w:rsid w:val="00A10FD9"/>
+    <w:rPr>
       <w:rFonts w:asciiTheme="majorHAnsi" w:cstheme="majorBidi" w:eastAsiaTheme="majorEastAsia" w:hAnsiTheme="majorHAnsi"/>
-      <w:color w:themeColor="accent1" w:val="4F81BD"/>
-      <w:sz w:val="24"/>
-      <w:szCs w:val="24"/>
+      <w:color w:themeColor="accent1" w:themeShade="BF" w:val="0F4761"/>
+      <w:sz w:val="40"/>
+      <w:szCs w:val="40"/>
+    </w:rPr>
+  </w:style>
+  <w:style w:customStyle="1" w:styleId="Heading2Char" w:type="character">
+    <w:name w:val="Heading 2 Char"/>
+    <w:basedOn w:val="DefaultParagraphFont"/>
+    <w:link w:val="Heading2"/>
+    <w:uiPriority w:val="9"/>
+    <w:semiHidden/>
+    <w:rsid w:val="00A10FD9"/>
+    <w:rPr>
+      <w:rFonts w:asciiTheme="majorHAnsi" w:cstheme="majorBidi" w:eastAsiaTheme="majorEastAsia" w:hAnsiTheme="majorHAnsi"/>
+      <w:color w:themeColor="accent1" w:themeShade="BF" w:val="0F4761"/>
+      <w:sz w:val="32"/>
+      <w:szCs w:val="32"/>
+    </w:rPr>
+  </w:style>
+  <w:style w:customStyle="1" w:styleId="Heading3Char" w:type="character">
+    <w:name w:val="Heading 3 Char"/>
+    <w:basedOn w:val="DefaultParagraphFont"/>
+    <w:link w:val="Heading3"/>
+    <w:uiPriority w:val="9"/>
+    <w:semiHidden/>
+    <w:rsid w:val="00A10FD9"/>
+    <w:rPr>
+      <w:rFonts w:cstheme="majorBidi" w:eastAsiaTheme="majorEastAsia"/>
+      <w:color w:themeColor="accent1" w:themeShade="BF" w:val="0F4761"/>
+      <w:sz w:val="28"/>
+      <w:szCs w:val="28"/>
+    </w:rPr>
+  </w:style>
+  <w:style w:customStyle="1" w:styleId="Heading4Char" w:type="character">
+    <w:name w:val="Heading 4 Char"/>
+    <w:basedOn w:val="DefaultParagraphFont"/>
+    <w:link w:val="Heading4"/>
+    <w:uiPriority w:val="9"/>
+    <w:semiHidden/>
+    <w:rsid w:val="00A10FD9"/>
+    <w:rPr>
+      <w:rFonts w:cstheme="majorBidi" w:eastAsiaTheme="majorEastAsia"/>
+      <w:i/>
+      <w:iCs/>
+      <w:color w:themeColor="accent1" w:themeShade="BF" w:val="0F4761"/>
+    </w:rPr>
+  </w:style>
+  <w:style w:customStyle="1" w:styleId="Heading5Char" w:type="character">
+    <w:name w:val="Heading 5 Char"/>
+    <w:basedOn w:val="DefaultParagraphFont"/>
+    <w:link w:val="Heading5"/>
+    <w:uiPriority w:val="9"/>
+    <w:semiHidden/>
+    <w:rsid w:val="00A10FD9"/>
+    <w:rPr>
+      <w:rFonts w:cstheme="majorBidi" w:eastAsiaTheme="majorEastAsia"/>
+      <w:color w:themeColor="accent1" w:themeShade="BF" w:val="0F4761"/>
+    </w:rPr>
+  </w:style>
+  <w:style w:customStyle="1" w:styleId="Heading6Char" w:type="character">
+    <w:name w:val="Heading 6 Char"/>
+    <w:basedOn w:val="DefaultParagraphFont"/>
+    <w:link w:val="Heading6"/>
+    <w:uiPriority w:val="9"/>
+    <w:semiHidden/>
+    <w:rsid w:val="00A10FD9"/>
+    <w:rPr>
+      <w:rFonts w:cstheme="majorBidi" w:eastAsiaTheme="majorEastAsia"/>
+      <w:i/>
+      <w:iCs/>
+      <w:color w:themeColor="text1" w:themeTint="A6" w:val="595959"/>
+    </w:rPr>
+  </w:style>
+  <w:style w:customStyle="1" w:styleId="Heading7Char" w:type="character">
+    <w:name w:val="Heading 7 Char"/>
+    <w:basedOn w:val="DefaultParagraphFont"/>
+    <w:link w:val="Heading7"/>
+    <w:uiPriority w:val="9"/>
+    <w:semiHidden/>
+    <w:rsid w:val="00A10FD9"/>
+    <w:rPr>
+      <w:rFonts w:cstheme="majorBidi" w:eastAsiaTheme="majorEastAsia"/>
+      <w:color w:themeColor="text1" w:themeTint="A6" w:val="595959"/>
+    </w:rPr>
+  </w:style>
+  <w:style w:customStyle="1" w:styleId="Heading8Char" w:type="character">
+    <w:name w:val="Heading 8 Char"/>
+    <w:basedOn w:val="DefaultParagraphFont"/>
+    <w:link w:val="Heading8"/>
+    <w:uiPriority w:val="9"/>
+    <w:semiHidden/>
+    <w:rsid w:val="00A10FD9"/>
+    <w:rPr>
+      <w:rFonts w:cstheme="majorBidi" w:eastAsiaTheme="majorEastAsia"/>
+      <w:i/>
+      <w:iCs/>
+      <w:color w:themeColor="text1" w:themeTint="D8" w:val="272727"/>
+    </w:rPr>
+  </w:style>
+  <w:style w:customStyle="1" w:styleId="Heading9Char" w:type="character">
+    <w:name w:val="Heading 9 Char"/>
+    <w:basedOn w:val="DefaultParagraphFont"/>
+    <w:link w:val="Heading9"/>
+    <w:uiPriority w:val="9"/>
+    <w:semiHidden/>
+    <w:rsid w:val="00A10FD9"/>
+    <w:rPr>
+      <w:rFonts w:cstheme="majorBidi" w:eastAsiaTheme="majorEastAsia"/>
+      <w:color w:themeColor="text1" w:themeTint="D8" w:val="272727"/>
     </w:rPr>
   </w:style>
   <w:style w:styleId="BlockText" w:type="paragraph">
@@ -1763,8 +2581,8 @@
   </w:style>
   <w:style w:styleId="FootnoteBlockText" w:type="paragraph">
     <w:name w:val="Footnote Block Text"/>
-    <w:basedOn w:val="Footnote Text"/>
-    <w:next w:val="Footnote Text"/>
+    <w:basedOn w:val="FootnoteText"/>
+    <w:next w:val="FootnoteText"/>
     <w:uiPriority w:val="9"/>
     <w:unhideWhenUsed/>
     <w:qFormat/>
@@ -1802,10 +2620,10 @@
         <w:jc w:val="left"/>
       </w:trPr>
       <w:tcPr>
-        <w:vAlign w:val="bottom"/>
         <w:tcBorders>
           <w:bottom w:val="single"/>
         </w:tcBorders>
+        <w:vAlign w:val="bottom"/>
       </w:tcPr>
     </w:tblStylePr>
   </w:style>
@@ -1920,8 +2738,8 @@
     <w:name w:val="KeywordTok"/>
     <w:basedOn w:val="VerbatimChar"/>
     <w:rPr>
+      <w:b/>
       <w:color w:val="007020"/>
-      <w:b/>
     </w:rPr>
   </w:style>
   <w:style w:type="character" w:customStyle="1" w:styleId="DataTypeTok">
@@ -1998,42 +2816,42 @@
     <w:name w:val="ImportTok"/>
     <w:basedOn w:val="VerbatimChar"/>
     <w:rPr>
+      <w:b/>
       <w:color w:val="008000"/>
-      <w:b/>
     </w:rPr>
   </w:style>
   <w:style w:type="character" w:customStyle="1" w:styleId="CommentTok">
     <w:name w:val="CommentTok"/>
     <w:basedOn w:val="VerbatimChar"/>
     <w:rPr>
+      <w:i/>
       <w:color w:val="60a0b0"/>
-      <w:i/>
     </w:rPr>
   </w:style>
   <w:style w:type="character" w:customStyle="1" w:styleId="DocumentationTok">
     <w:name w:val="DocumentationTok"/>
     <w:basedOn w:val="VerbatimChar"/>
     <w:rPr>
+      <w:i/>
       <w:color w:val="ba2121"/>
-      <w:i/>
     </w:rPr>
   </w:style>
   <w:style w:type="character" w:customStyle="1" w:styleId="AnnotationTok">
     <w:name w:val="AnnotationTok"/>
     <w:basedOn w:val="VerbatimChar"/>
     <w:rPr>
-      <w:color w:val="60a0b0"/>
       <w:b/>
       <w:i/>
+      <w:color w:val="60a0b0"/>
     </w:rPr>
   </w:style>
   <w:style w:type="character" w:customStyle="1" w:styleId="CommentVarTok">
     <w:name w:val="CommentVarTok"/>
     <w:basedOn w:val="VerbatimChar"/>
     <w:rPr>
-      <w:color w:val="60a0b0"/>
       <w:b/>
       <w:i/>
+      <w:color w:val="60a0b0"/>
     </w:rPr>
   </w:style>
   <w:style w:type="character" w:customStyle="1" w:styleId="OtherTok">
@@ -2061,8 +2879,8 @@
     <w:name w:val="ControlFlowTok"/>
     <w:basedOn w:val="VerbatimChar"/>
     <w:rPr>
+      <w:b/>
       <w:color w:val="007020"/>
-      <w:b/>
     </w:rPr>
   </w:style>
   <w:style w:type="character" w:customStyle="1" w:styleId="OperatorTok">
@@ -2107,34 +2925,34 @@
     <w:name w:val="InformationTok"/>
     <w:basedOn w:val="VerbatimChar"/>
     <w:rPr>
-      <w:color w:val="60a0b0"/>
       <w:b/>
       <w:i/>
+      <w:color w:val="60a0b0"/>
     </w:rPr>
   </w:style>
   <w:style w:type="character" w:customStyle="1" w:styleId="WarningTok">
     <w:name w:val="WarningTok"/>
     <w:basedOn w:val="VerbatimChar"/>
     <w:rPr>
-      <w:color w:val="60a0b0"/>
       <w:b/>
       <w:i/>
+      <w:color w:val="60a0b0"/>
     </w:rPr>
   </w:style>
   <w:style w:type="character" w:customStyle="1" w:styleId="AlertTok">
     <w:name w:val="AlertTok"/>
     <w:basedOn w:val="VerbatimChar"/>
     <w:rPr>
+      <w:b/>
       <w:color w:val="ff0000"/>
-      <w:b/>
     </w:rPr>
   </w:style>
   <w:style w:type="character" w:customStyle="1" w:styleId="ErrorTok">
     <w:name w:val="ErrorTok"/>
     <w:basedOn w:val="VerbatimChar"/>
     <w:rPr>
+      <w:b/>
       <w:color w:val="ff0000"/>
-      <w:b/>
     </w:rPr>
   </w:style>
   <w:style w:type="character" w:customStyle="1" w:styleId="NormalTok">
@@ -2156,44 +2974,44 @@
         <a:sysClr val="window" lastClr="FFFFFF"/>
       </a:lt1>
       <a:dk2>
-        <a:srgbClr val="1F497D"/>
+        <a:srgbClr val="0E2841"/>
       </a:dk2>
       <a:lt2>
-        <a:srgbClr val="EEECE1"/>
+        <a:srgbClr val="E8E8E8"/>
       </a:lt2>
       <a:accent1>
-        <a:srgbClr val="4F81BD"/>
+        <a:srgbClr val="156082"/>
       </a:accent1>
       <a:accent2>
-        <a:srgbClr val="C0504D"/>
+        <a:srgbClr val="E97132"/>
       </a:accent2>
       <a:accent3>
-        <a:srgbClr val="9BBB59"/>
+        <a:srgbClr val="196B24"/>
       </a:accent3>
       <a:accent4>
-        <a:srgbClr val="8064A2"/>
+        <a:srgbClr val="0F9ED5"/>
       </a:accent4>
       <a:accent5>
-        <a:srgbClr val="4BACC6"/>
+        <a:srgbClr val="A02B93"/>
       </a:accent5>
       <a:accent6>
-        <a:srgbClr val="F79646"/>
+        <a:srgbClr val="4EA72E"/>
       </a:accent6>
       <a:hlink>
-        <a:srgbClr val="0000FF"/>
+        <a:srgbClr val="467886"/>
       </a:hlink>
       <a:folHlink>
-        <a:srgbClr val="800080"/>
+        <a:srgbClr val="96607D"/>
       </a:folHlink>
     </a:clrScheme>
     <a:fontScheme name="Office">
       <a:majorFont>
-        <a:latin typeface="Calibri"/>
+        <a:latin typeface="Aptos Display" panose="02110004020202020204"/>
         <a:ea typeface=""/>
         <a:cs typeface=""/>
-        <a:font script="Jpan" typeface="ＭＳ ゴシック"/>
+        <a:font script="Jpan" typeface="游ゴシック Light"/>
         <a:font script="Hang" typeface="맑은 고딕"/>
-        <a:font script="Hans" typeface="宋体"/>
+        <a:font script="Hans" typeface="等线 Light"/>
         <a:font script="Hant" typeface="新細明體"/>
         <a:font script="Arab" typeface="Times New Roman"/>
         <a:font script="Hebr" typeface="Times New Roman"/>
@@ -2220,14 +3038,32 @@
         <a:font script="Mong" typeface="Mongolian Baiti"/>
         <a:font script="Viet" typeface="Times New Roman"/>
         <a:font script="Uigh" typeface="Microsoft Uighur"/>
+        <a:font script="Geor" typeface="Sylfaen"/>
+        <a:font script="Armn" typeface="Arial"/>
+        <a:font script="Bugi" typeface="Leelawadee UI"/>
+        <a:font script="Bopo" typeface="Microsoft JhengHei"/>
+        <a:font script="Java" typeface="Javanese Text"/>
+        <a:font script="Lisu" typeface="Segoe UI"/>
+        <a:font script="Mymr" typeface="Myanmar Text"/>
+        <a:font script="Nkoo" typeface="Ebrima"/>
+        <a:font script="Olck" typeface="Nirmala UI"/>
+        <a:font script="Osma" typeface="Ebrima"/>
+        <a:font script="Phag" typeface="Phagspa"/>
+        <a:font script="Syrn" typeface="Estrangelo Edessa"/>
+        <a:font script="Syrj" typeface="Estrangelo Edessa"/>
+        <a:font script="Syre" typeface="Estrangelo Edessa"/>
+        <a:font script="Sora" typeface="Nirmala UI"/>
+        <a:font script="Tale" typeface="Microsoft Tai Le"/>
+        <a:font script="Talu" typeface="Microsoft New Tai Lue"/>
+        <a:font script="Tfng" typeface="Ebrima"/>
       </a:majorFont>
       <a:minorFont>
-        <a:latin typeface="Cambria"/>
+        <a:latin typeface="Aptos" panose="02110004020202020204"/>
         <a:ea typeface=""/>
         <a:cs typeface=""/>
-        <a:font script="Jpan" typeface="ＭＳ 明朝"/>
+        <a:font script="Jpan" typeface="游明朝"/>
         <a:font script="Hang" typeface="맑은 고딕"/>
-        <a:font script="Hans" typeface="宋体"/>
+        <a:font script="Hans" typeface="等线"/>
         <a:font script="Hant" typeface="新細明體"/>
         <a:font script="Arab" typeface="Arial"/>
         <a:font script="Hebr" typeface="Arial"/>
@@ -2254,6 +3090,24 @@
         <a:font script="Mong" typeface="Mongolian Baiti"/>
         <a:font script="Viet" typeface="Arial"/>
         <a:font script="Uigh" typeface="Microsoft Uighur"/>
+        <a:font script="Geor" typeface="Sylfaen"/>
+        <a:font script="Armn" typeface="Arial"/>
+        <a:font script="Bugi" typeface="Leelawadee UI"/>
+        <a:font script="Bopo" typeface="Microsoft JhengHei"/>
+        <a:font script="Java" typeface="Javanese Text"/>
+        <a:font script="Lisu" typeface="Segoe UI"/>
+        <a:font script="Mymr" typeface="Myanmar Text"/>
+        <a:font script="Nkoo" typeface="Ebrima"/>
+        <a:font script="Olck" typeface="Nirmala UI"/>
+        <a:font script="Osma" typeface="Ebrima"/>
+        <a:font script="Phag" typeface="Phagspa"/>
+        <a:font script="Syrn" typeface="Estrangelo Edessa"/>
+        <a:font script="Syrj" typeface="Estrangelo Edessa"/>
+        <a:font script="Syre" typeface="Estrangelo Edessa"/>
+        <a:font script="Sora" typeface="Nirmala UI"/>
+        <a:font script="Tale" typeface="Microsoft Tai Le"/>
+        <a:font script="Talu" typeface="Microsoft New Tai Lue"/>
+        <a:font script="Tfng" typeface="Ebrima"/>
       </a:minorFont>
     </a:fontScheme>
     <a:fmtScheme name="Office">
@@ -2265,200 +3119,141 @@
           <a:gsLst>
             <a:gs pos="0">
               <a:schemeClr val="phClr">
-                <a:tint val="50000"/>
-                <a:satMod val="300000"/>
+                <a:lumMod val="110000"/>
+                <a:satMod val="105000"/>
+                <a:tint val="67000"/>
               </a:schemeClr>
             </a:gs>
-            <a:gs pos="35000">
+            <a:gs pos="50000">
               <a:schemeClr val="phClr">
-                <a:tint val="37000"/>
-                <a:satMod val="300000"/>
+                <a:lumMod val="105000"/>
+                <a:satMod val="103000"/>
+                <a:tint val="73000"/>
               </a:schemeClr>
             </a:gs>
             <a:gs pos="100000">
               <a:schemeClr val="phClr">
-                <a:tint val="15000"/>
-                <a:satMod val="350000"/>
+                <a:lumMod val="105000"/>
+                <a:satMod val="109000"/>
+                <a:tint val="81000"/>
               </a:schemeClr>
             </a:gs>
           </a:gsLst>
-          <a:lin ang="16200000" scaled="1"/>
+          <a:lin ang="5400000" scaled="0"/>
         </a:gradFill>
         <a:gradFill rotWithShape="1">
           <a:gsLst>
             <a:gs pos="0">
               <a:schemeClr val="phClr">
-                <a:tint val="100000"/>
+                <a:satMod val="103000"/>
+                <a:lumMod val="102000"/>
+                <a:tint val="94000"/>
+              </a:schemeClr>
+            </a:gs>
+            <a:gs pos="50000">
+              <a:schemeClr val="phClr">
+                <a:satMod val="110000"/>
+                <a:lumMod val="100000"/>
                 <a:shade val="100000"/>
-                <a:satMod val="130000"/>
               </a:schemeClr>
             </a:gs>
             <a:gs pos="100000">
               <a:schemeClr val="phClr">
-                <a:tint val="50000"/>
-                <a:shade val="100000"/>
-                <a:satMod val="350000"/>
+                <a:lumMod val="99000"/>
+                <a:satMod val="120000"/>
+                <a:shade val="78000"/>
               </a:schemeClr>
             </a:gs>
           </a:gsLst>
-          <a:lin ang="16200000" scaled="0"/>
+          <a:lin ang="5400000" scaled="0"/>
         </a:gradFill>
       </a:fillStyleLst>
       <a:lnStyleLst>
-        <a:ln w="9525" cap="flat" cmpd="sng" algn="ctr">
-          <a:solidFill>
-            <a:schemeClr val="phClr">
-              <a:shade val="95000"/>
-              <a:satMod val="105000"/>
-            </a:schemeClr>
-          </a:solidFill>
-          <a:prstDash val="solid"/>
-        </a:ln>
-        <a:ln w="25400" cap="flat" cmpd="sng" algn="ctr">
+        <a:ln w="6350" cap="flat" cmpd="sng" algn="ctr">
           <a:solidFill>
             <a:schemeClr val="phClr"/>
           </a:solidFill>
           <a:prstDash val="solid"/>
+          <a:miter lim="800000"/>
         </a:ln>
-        <a:ln w="38100" cap="flat" cmpd="sng" algn="ctr">
+        <a:ln w="12700" cap="flat" cmpd="sng" algn="ctr">
           <a:solidFill>
             <a:schemeClr val="phClr"/>
           </a:solidFill>
           <a:prstDash val="solid"/>
+          <a:miter lim="800000"/>
+        </a:ln>
+        <a:ln w="19050" cap="flat" cmpd="sng" algn="ctr">
+          <a:solidFill>
+            <a:schemeClr val="phClr"/>
+          </a:solidFill>
+          <a:prstDash val="solid"/>
+          <a:miter lim="800000"/>
         </a:ln>
       </a:lnStyleLst>
       <a:effectStyleLst>
         <a:effectStyle>
+          <a:effectLst/>
+        </a:effectStyle>
+        <a:effectStyle>
+          <a:effectLst/>
+        </a:effectStyle>
+        <a:effectStyle>
           <a:effectLst>
-            <a:outerShdw blurRad="40000" dist="20000" dir="5400000" rotWithShape="0">
+            <a:outerShdw blurRad="57150" dist="19050" dir="5400000" algn="ctr" rotWithShape="0">
               <a:srgbClr val="000000">
-                <a:alpha val="38000"/>
+                <a:alpha val="63000"/>
               </a:srgbClr>
             </a:outerShdw>
           </a:effectLst>
-        </a:effectStyle>
-        <a:effectStyle>
-          <a:effectLst>
-            <a:outerShdw blurRad="40000" dist="23000" dir="5400000" rotWithShape="0">
-              <a:srgbClr val="000000">
-                <a:alpha val="35000"/>
-              </a:srgbClr>
-            </a:outerShdw>
-          </a:effectLst>
-        </a:effectStyle>
-        <a:effectStyle>
-          <a:effectLst>
-            <a:outerShdw blurRad="40000" dist="23000" dir="5400000" rotWithShape="0">
-              <a:srgbClr val="000000">
-                <a:alpha val="35000"/>
-              </a:srgbClr>
-            </a:outerShdw>
-          </a:effectLst>
-          <a:scene3d>
-            <a:camera prst="orthographicFront">
-              <a:rot lat="0" lon="0" rev="0"/>
-            </a:camera>
-            <a:lightRig rig="threePt" dir="t">
-              <a:rot lat="0" lon="0" rev="1200000"/>
-            </a:lightRig>
-          </a:scene3d>
-          <a:sp3d>
-            <a:bevelT w="63500" h="25400"/>
-          </a:sp3d>
         </a:effectStyle>
       </a:effectStyleLst>
       <a:bgFillStyleLst>
         <a:solidFill>
           <a:schemeClr val="phClr"/>
         </a:solidFill>
+        <a:solidFill>
+          <a:schemeClr val="phClr">
+            <a:tint val="95000"/>
+            <a:satMod val="170000"/>
+          </a:schemeClr>
+        </a:solidFill>
         <a:gradFill rotWithShape="1">
           <a:gsLst>
             <a:gs pos="0">
               <a:schemeClr val="phClr">
-                <a:tint val="40000"/>
-                <a:satMod val="350000"/>
+                <a:tint val="93000"/>
+                <a:satMod val="150000"/>
+                <a:shade val="98000"/>
+                <a:lumMod val="102000"/>
               </a:schemeClr>
             </a:gs>
-            <a:gs pos="40000">
+            <a:gs pos="50000">
               <a:schemeClr val="phClr">
-                <a:tint val="45000"/>
-                <a:shade val="99000"/>
-                <a:satMod val="350000"/>
+                <a:tint val="98000"/>
+                <a:satMod val="130000"/>
+                <a:shade val="90000"/>
+                <a:lumMod val="103000"/>
               </a:schemeClr>
             </a:gs>
             <a:gs pos="100000">
               <a:schemeClr val="phClr">
-                <a:shade val="20000"/>
-                <a:satMod val="255000"/>
+                <a:shade val="63000"/>
+                <a:satMod val="120000"/>
               </a:schemeClr>
             </a:gs>
           </a:gsLst>
-          <a:path path="circle">
-            <a:fillToRect l="50000" t="-80000" r="50000" b="180000"/>
-          </a:path>
-        </a:gradFill>
-        <a:gradFill rotWithShape="1">
-          <a:gsLst>
-            <a:gs pos="0">
-              <a:schemeClr val="phClr">
-                <a:tint val="80000"/>
-                <a:satMod val="300000"/>
-              </a:schemeClr>
-            </a:gs>
-            <a:gs pos="100000">
-              <a:schemeClr val="phClr">
-                <a:shade val="30000"/>
-                <a:satMod val="200000"/>
-              </a:schemeClr>
-            </a:gs>
-          </a:gsLst>
-          <a:path path="circle">
-            <a:fillToRect l="50000" t="50000" r="50000" b="50000"/>
-          </a:path>
+          <a:lin ang="5400000" scaled="0"/>
         </a:gradFill>
       </a:bgFillStyleLst>
     </a:fmtScheme>
   </a:themeElements>
-  <a:objectDefaults>
-    <a:spDef>
-      <a:spPr/>
-      <a:bodyPr/>
-      <a:lstStyle/>
-      <a:style>
-        <a:lnRef idx="1">
-          <a:schemeClr val="accent1"/>
-        </a:lnRef>
-        <a:fillRef idx="3">
-          <a:schemeClr val="accent1"/>
-        </a:fillRef>
-        <a:effectRef idx="2">
-          <a:schemeClr val="accent1"/>
-        </a:effectRef>
-        <a:fontRef idx="minor">
-          <a:schemeClr val="lt1"/>
-        </a:fontRef>
-      </a:style>
-    </a:spDef>
-    <a:lnDef>
-      <a:spPr/>
-      <a:bodyPr/>
-      <a:lstStyle/>
-      <a:style>
-        <a:lnRef idx="2">
-          <a:schemeClr val="accent1"/>
-        </a:lnRef>
-        <a:fillRef idx="0">
-          <a:schemeClr val="accent1"/>
-        </a:fillRef>
-        <a:effectRef idx="1">
-          <a:schemeClr val="accent1"/>
-        </a:effectRef>
-        <a:fontRef idx="minor">
-          <a:schemeClr val="tx1"/>
-        </a:fontRef>
-      </a:style>
-    </a:lnDef>
-  </a:objectDefaults>
+  <a:objectDefaults/>
   <a:extraClrSchemeLst/>
+  <a:extLst>
+    <a:ext uri="{05A4C25C-085E-4340-85A3-A5531E510DB2}">
+      <thm15:themeFamily xmlns:thm15="http://schemas.microsoft.com/office/thememl/2012/main" name="Office Theme" id="{2E142A2C-CD16-42D6-873A-C26D2A0506FA}" vid="{1BDDFF52-6CD6-40A5-AB3C-68EB2F1E4D0A}"/>
+    </a:ext>
+  </a:extLst>
 </a:theme>
 </file>
</xml_diff>

<commit_message>
Updated analysis and visualization scripts
</commit_message>
<xml_diff>
--- a/Output/devel_mod_table.docx
+++ b/Output/devel_mod_table.docx
@@ -50,7 +50,7 @@
           <w:sz w:val="24"/>
           <w:color w:val="333333"/>
         </w:rPr>
-        <w:t xml:space="preserve">S3 Table. Associations of three temperature variables in early and late development (before or after six days post-hatch) with nestling mass for wild barns swallows in Boulder County, CO.</w:t>
+        <w:t xml:space="preserve">Supplemental Table 3.</w:t>
       </w:r>
       <w:r>
         <w:rPr>
@@ -58,7 +58,7 @@
           <w:sz w:val="24"/>
           <w:color w:val="333333"/>
         </w:rPr>
-        <w:t xml:space="preserve"> Temperature variability is defined as the interquartile range. For each temperature variable, results are provided for unadjusted and adjusted models. Sample size for each developmental stage is provided in the header (n). For each model, the table provides the effect size and 95% confidence interval for temperature effects (β (95% CI)), and the corresponding degrees of freedom, t-value, and p-value from a two-tailed t-test using a Satterthwaite degree of freedom estimation.</w:t>
+        <w:t xml:space="preserve"> Associations of three temperature variables before or after thermoregulatory independence (defined as occurring six days post-hatch) with nestling mass. Temperature variability is defined as the interquartile range.</w:t>
       </w:r>
     </w:p>
     <w:tbl xmlns:w="http://schemas.openxmlformats.org/wordprocessingml/2006/main" xmlns:wp="http://schemas.openxmlformats.org/drawingml/2006/wordprocessingDrawing" xmlns:r="http://schemas.openxmlformats.org/officeDocument/2006/relationships" xmlns:w14="http://schemas.microsoft.com/office/word/2010/wordml">
@@ -110,7 +110,7 @@
               <w:bottom w:val="single" w:sz="16" w:space="0" w:color="D3D3D3"/>
               <w:start w:val="single" w:space="0" w:color="D3D3D3"/>
             </w:tcBorders>
-            <w:gridSpan w:val="4"/>
+            <w:gridSpan w:val="3"/>
           </w:tcPr>
           <w:p>
             <w:pPr>
@@ -123,7 +123,7 @@
                 <w:rFonts w:ascii="Calibri" w:hAnsi="Calibri"/>
                 <w:sz w:val="20"/>
               </w:rPr>
-              <w:t xml:space="default">Before models (n = 106)</w:t>
+              <w:t xml:space="default">Before models</w:t>
             </w:r>
           </w:p>
         </w:tc>
@@ -134,7 +134,7 @@
               <w:bottom w:val="single" w:sz="16" w:space="0" w:color="D3D3D3"/>
               <w:end w:val="single" w:space="0" w:color="D3D3D3"/>
             </w:tcBorders>
-            <w:gridSpan w:val="4"/>
+            <w:gridSpan w:val="3"/>
           </w:tcPr>
           <w:p>
             <w:pPr>
@@ -147,7 +147,7 @@
                 <w:rFonts w:ascii="Calibri" w:hAnsi="Calibri"/>
                 <w:sz w:val="20"/>
               </w:rPr>
-              <w:t xml:space="default">After models (n = 106)</w:t>
+              <w:t xml:space="default">After models</w:t>
             </w:r>
           </w:p>
         </w:tc>
@@ -198,6 +198,27 @@
                 <w:rFonts w:ascii="Calibri" w:hAnsi="Calibri"/>
                 <w:sz w:val="20"/>
               </w:rPr>
+              <w:t xml:space="default">N</w:t>
+            </w:r>
+          </w:p>
+        </w:tc>
+        <w:tc>
+          <w:tcPr>
+            <w:tcBorders>
+              <w:bottom w:val="single" w:sz="16" w:space="0" w:color="D3D3D3"/>
+            </w:tcBorders>
+          </w:tcPr>
+          <w:p>
+            <w:pPr>
+              <w:spacing w:before="0" w:after="60"/>
+              <w:keepNext/>
+              <w:jc w:val="end"/>
+            </w:pPr>
+            <w:r>
+              <w:rPr>
+                <w:rFonts w:ascii="Calibri" w:hAnsi="Calibri"/>
+                <w:sz w:val="20"/>
+              </w:rPr>
               <w:t xml:space="default">β (95% CI)</w:t>
             </w:r>
             <w:r>
@@ -221,6 +242,27 @@
             <w:pPr>
               <w:spacing w:before="0" w:after="60"/>
               <w:keepNext/>
+              <w:jc w:val="start"/>
+            </w:pPr>
+            <w:r>
+              <w:rPr>
+                <w:rFonts w:ascii="Calibri" w:hAnsi="Calibri"/>
+                <w:sz w:val="20"/>
+              </w:rPr>
+              <w:t xml:space="default">P</w:t>
+            </w:r>
+          </w:p>
+        </w:tc>
+        <w:tc>
+          <w:tcPr>
+            <w:tcBorders>
+              <w:bottom w:val="single" w:sz="16" w:space="0" w:color="D3D3D3"/>
+            </w:tcBorders>
+          </w:tcPr>
+          <w:p>
+            <w:pPr>
+              <w:spacing w:before="0" w:after="60"/>
+              <w:keepNext/>
               <w:jc w:val="end"/>
             </w:pPr>
             <w:r>
@@ -228,49 +270,7 @@
                 <w:rFonts w:ascii="Calibri" w:hAnsi="Calibri"/>
                 <w:sz w:val="20"/>
               </w:rPr>
-              <w:t xml:space="default">DF</w:t>
-            </w:r>
-          </w:p>
-        </w:tc>
-        <w:tc>
-          <w:tcPr>
-            <w:tcBorders>
-              <w:bottom w:val="single" w:sz="16" w:space="0" w:color="D3D3D3"/>
-            </w:tcBorders>
-          </w:tcPr>
-          <w:p>
-            <w:pPr>
-              <w:spacing w:before="0" w:after="60"/>
-              <w:keepNext/>
-              <w:jc w:val="end"/>
-            </w:pPr>
-            <w:r>
-              <w:rPr>
-                <w:rFonts w:ascii="Calibri" w:hAnsi="Calibri"/>
-                <w:sz w:val="20"/>
-              </w:rPr>
-              <w:t xml:space="default">t-value</w:t>
-            </w:r>
-          </w:p>
-        </w:tc>
-        <w:tc>
-          <w:tcPr>
-            <w:tcBorders>
-              <w:bottom w:val="single" w:sz="16" w:space="0" w:color="D3D3D3"/>
-            </w:tcBorders>
-          </w:tcPr>
-          <w:p>
-            <w:pPr>
-              <w:spacing w:before="0" w:after="60"/>
-              <w:keepNext/>
-              <w:jc w:val="start"/>
-            </w:pPr>
-            <w:r>
-              <w:rPr>
-                <w:rFonts w:ascii="Calibri" w:hAnsi="Calibri"/>
-                <w:sz w:val="20"/>
-              </w:rPr>
-              <w:t xml:space="default">p-value</w:t>
+              <w:t xml:space="default">N</w:t>
             </w:r>
           </w:p>
         </w:tc>
@@ -308,48 +308,6 @@
           <w:tcPr>
             <w:tcBorders>
               <w:bottom w:val="single" w:sz="16" w:space="0" w:color="D3D3D3"/>
-            </w:tcBorders>
-          </w:tcPr>
-          <w:p>
-            <w:pPr>
-              <w:spacing w:before="0" w:after="60"/>
-              <w:keepNext/>
-              <w:jc w:val="end"/>
-            </w:pPr>
-            <w:r>
-              <w:rPr>
-                <w:rFonts w:ascii="Calibri" w:hAnsi="Calibri"/>
-                <w:sz w:val="20"/>
-              </w:rPr>
-              <w:t xml:space="default">DF</w:t>
-            </w:r>
-          </w:p>
-        </w:tc>
-        <w:tc>
-          <w:tcPr>
-            <w:tcBorders>
-              <w:bottom w:val="single" w:sz="16" w:space="0" w:color="D3D3D3"/>
-            </w:tcBorders>
-          </w:tcPr>
-          <w:p>
-            <w:pPr>
-              <w:spacing w:before="0" w:after="60"/>
-              <w:keepNext/>
-              <w:jc w:val="end"/>
-            </w:pPr>
-            <w:r>
-              <w:rPr>
-                <w:rFonts w:ascii="Calibri" w:hAnsi="Calibri"/>
-                <w:sz w:val="20"/>
-              </w:rPr>
-              <w:t xml:space="default">t-value</w:t>
-            </w:r>
-          </w:p>
-        </w:tc>
-        <w:tc>
-          <w:tcPr>
-            <w:tcBorders>
-              <w:bottom w:val="single" w:sz="16" w:space="0" w:color="D3D3D3"/>
               <w:end w:val="single" w:space="0" w:color="D3D3D3"/>
             </w:tcBorders>
           </w:tcPr>
@@ -364,7 +322,7 @@
                 <w:rFonts w:ascii="Calibri" w:hAnsi="Calibri"/>
                 <w:sz w:val="20"/>
               </w:rPr>
-              <w:t xml:space="default">p-value</w:t>
+              <w:t xml:space="default">P</w:t>
             </w:r>
           </w:p>
         </w:tc>
@@ -384,7 +342,7 @@
             <w:tcMar>
               <w:top w:w="25" w:type="dxa"/>
             </w:tcMar>
-            <w:gridSpan w:val="9"/>
+            <w:gridSpan w:val="7"/>
           </w:tcPr>
           <w:p>
             <w:pPr>
@@ -450,6 +408,30 @@
                 <w:rFonts w:ascii="Calibri" w:hAnsi="Calibri"/>
                 <w:sz w:val="20"/>
               </w:rPr>
+              <w:t xml:space="default">106</w:t>
+            </w:r>
+          </w:p>
+        </w:tc>
+        <w:tc>
+          <w:tcPr>
+            <w:tcBorders>
+              <w:top w:val="single" w:space="0" w:color="D3D3D3"/>
+              <w:bottom w:val="single" w:space="0" w:color="D3D3D3"/>
+              <w:start w:val="single" w:space="0" w:color="D3D3D3"/>
+              <w:end w:val="single" w:space="0" w:color="D3D3D3"/>
+            </w:tcBorders>
+          </w:tcPr>
+          <w:p>
+            <w:pPr>
+              <w:spacing w:before="0" w:after="60"/>
+              <w:keepNext/>
+              <w:jc w:val="end"/>
+            </w:pPr>
+            <w:r>
+              <w:rPr>
+                <w:rFonts w:ascii="Calibri" w:hAnsi="Calibri"/>
+                <w:sz w:val="20"/>
+              </w:rPr>
               <w:t xml:space="default">1.11 (0.45, 1.8)</w:t>
             </w:r>
           </w:p>
@@ -467,6 +449,30 @@
             <w:pPr>
               <w:spacing w:before="0" w:after="60"/>
               <w:keepNext/>
+              <w:jc w:val="start"/>
+            </w:pPr>
+            <w:r>
+              <w:rPr>
+                <w:rFonts w:ascii="Calibri" w:hAnsi="Calibri"/>
+                <w:sz w:val="20"/>
+              </w:rPr>
+              <w:t xml:space="default">0.003</w:t>
+            </w:r>
+          </w:p>
+        </w:tc>
+        <w:tc>
+          <w:tcPr>
+            <w:tcBorders>
+              <w:top w:val="single" w:space="0" w:color="D3D3D3"/>
+              <w:bottom w:val="single" w:space="0" w:color="D3D3D3"/>
+              <w:start w:val="single" w:space="0" w:color="D3D3D3"/>
+              <w:end w:val="single" w:space="0" w:color="D3D3D3"/>
+            </w:tcBorders>
+          </w:tcPr>
+          <w:p>
+            <w:pPr>
+              <w:spacing w:before="0" w:after="60"/>
+              <w:keepNext/>
               <w:jc w:val="end"/>
             </w:pPr>
             <w:r>
@@ -474,7 +480,7 @@
                 <w:rFonts w:ascii="Calibri" w:hAnsi="Calibri"/>
                 <w:sz w:val="20"/>
               </w:rPr>
-              <w:t xml:space="default">28.58</w:t>
+              <w:t xml:space="default">106</w:t>
             </w:r>
           </w:p>
         </w:tc>
@@ -498,103 +504,7 @@
                 <w:rFonts w:ascii="Calibri" w:hAnsi="Calibri"/>
                 <w:sz w:val="20"/>
               </w:rPr>
-              <w:t xml:space="default">3.22</w:t>
-            </w:r>
-          </w:p>
-        </w:tc>
-        <w:tc>
-          <w:tcPr>
-            <w:tcBorders>
-              <w:top w:val="single" w:space="0" w:color="D3D3D3"/>
-              <w:bottom w:val="single" w:space="0" w:color="D3D3D3"/>
-              <w:start w:val="single" w:space="0" w:color="D3D3D3"/>
-              <w:end w:val="single" w:space="0" w:color="D3D3D3"/>
-            </w:tcBorders>
-          </w:tcPr>
-          <w:p>
-            <w:pPr>
-              <w:spacing w:before="0" w:after="60"/>
-              <w:keepNext/>
-              <w:jc w:val="start"/>
-            </w:pPr>
-            <w:r>
-              <w:rPr>
-                <w:rFonts w:ascii="Calibri" w:hAnsi="Calibri"/>
-                <w:sz w:val="20"/>
-              </w:rPr>
-              <w:t xml:space="default">0.003</w:t>
-            </w:r>
-          </w:p>
-        </w:tc>
-        <w:tc>
-          <w:tcPr>
-            <w:tcBorders>
-              <w:top w:val="single" w:space="0" w:color="D3D3D3"/>
-              <w:bottom w:val="single" w:space="0" w:color="D3D3D3"/>
-              <w:start w:val="single" w:space="0" w:color="D3D3D3"/>
-              <w:end w:val="single" w:space="0" w:color="D3D3D3"/>
-            </w:tcBorders>
-          </w:tcPr>
-          <w:p>
-            <w:pPr>
-              <w:spacing w:before="0" w:after="60"/>
-              <w:keepNext/>
-              <w:jc w:val="end"/>
-            </w:pPr>
-            <w:r>
-              <w:rPr>
-                <w:rFonts w:ascii="Calibri" w:hAnsi="Calibri"/>
-                <w:sz w:val="20"/>
-              </w:rPr>
               <w:t xml:space="default">0.5 (-0.22, 1.25)</w:t>
-            </w:r>
-          </w:p>
-        </w:tc>
-        <w:tc>
-          <w:tcPr>
-            <w:tcBorders>
-              <w:top w:val="single" w:space="0" w:color="D3D3D3"/>
-              <w:bottom w:val="single" w:space="0" w:color="D3D3D3"/>
-              <w:start w:val="single" w:space="0" w:color="D3D3D3"/>
-              <w:end w:val="single" w:space="0" w:color="D3D3D3"/>
-            </w:tcBorders>
-          </w:tcPr>
-          <w:p>
-            <w:pPr>
-              <w:spacing w:before="0" w:after="60"/>
-              <w:keepNext/>
-              <w:jc w:val="end"/>
-            </w:pPr>
-            <w:r>
-              <w:rPr>
-                <w:rFonts w:ascii="Calibri" w:hAnsi="Calibri"/>
-                <w:sz w:val="20"/>
-              </w:rPr>
-              <w:t xml:space="default">28.55</w:t>
-            </w:r>
-          </w:p>
-        </w:tc>
-        <w:tc>
-          <w:tcPr>
-            <w:tcBorders>
-              <w:top w:val="single" w:space="0" w:color="D3D3D3"/>
-              <w:bottom w:val="single" w:space="0" w:color="D3D3D3"/>
-              <w:start w:val="single" w:space="0" w:color="D3D3D3"/>
-              <w:end w:val="single" w:space="0" w:color="D3D3D3"/>
-            </w:tcBorders>
-          </w:tcPr>
-          <w:p>
-            <w:pPr>
-              <w:spacing w:before="0" w:after="60"/>
-              <w:keepNext/>
-              <w:jc w:val="end"/>
-            </w:pPr>
-            <w:r>
-              <w:rPr>
-                <w:rFonts w:ascii="Calibri" w:hAnsi="Calibri"/>
-                <w:sz w:val="20"/>
-              </w:rPr>
-              <w:t xml:space="default">1.30</w:t>
             </w:r>
           </w:p>
         </w:tc>
@@ -680,6 +590,30 @@
                 <w:rFonts w:ascii="Calibri" w:hAnsi="Calibri"/>
                 <w:sz w:val="20"/>
               </w:rPr>
+              <w:t xml:space="default">106</w:t>
+            </w:r>
+          </w:p>
+        </w:tc>
+        <w:tc>
+          <w:tcPr>
+            <w:tcBorders>
+              <w:top w:val="single" w:space="0" w:color="D3D3D3"/>
+              <w:bottom w:val="single" w:space="0" w:color="D3D3D3"/>
+              <w:start w:val="single" w:space="0" w:color="D3D3D3"/>
+              <w:end w:val="single" w:space="0" w:color="D3D3D3"/>
+            </w:tcBorders>
+          </w:tcPr>
+          <w:p>
+            <w:pPr>
+              <w:spacing w:before="0" w:after="60"/>
+              <w:keepNext/>
+              <w:jc w:val="end"/>
+            </w:pPr>
+            <w:r>
+              <w:rPr>
+                <w:rFonts w:ascii="Calibri" w:hAnsi="Calibri"/>
+                <w:sz w:val="20"/>
+              </w:rPr>
               <w:t xml:space="default">1.16 (0.32, 2)</w:t>
             </w:r>
           </w:p>
@@ -697,6 +631,30 @@
             <w:pPr>
               <w:spacing w:before="0" w:after="60"/>
               <w:keepNext/>
+              <w:jc w:val="start"/>
+            </w:pPr>
+            <w:r>
+              <w:rPr>
+                <w:rFonts w:ascii="Calibri" w:hAnsi="Calibri"/>
+                <w:sz w:val="20"/>
+              </w:rPr>
+              <w:t xml:space="default">0.01</w:t>
+            </w:r>
+          </w:p>
+        </w:tc>
+        <w:tc>
+          <w:tcPr>
+            <w:tcBorders>
+              <w:top w:val="single" w:space="0" w:color="D3D3D3"/>
+              <w:bottom w:val="single" w:space="0" w:color="D3D3D3"/>
+              <w:start w:val="single" w:space="0" w:color="D3D3D3"/>
+              <w:end w:val="single" w:space="0" w:color="D3D3D3"/>
+            </w:tcBorders>
+          </w:tcPr>
+          <w:p>
+            <w:pPr>
+              <w:spacing w:before="0" w:after="60"/>
+              <w:keepNext/>
               <w:jc w:val="end"/>
             </w:pPr>
             <w:r>
@@ -704,7 +662,7 @@
                 <w:rFonts w:ascii="Calibri" w:hAnsi="Calibri"/>
                 <w:sz w:val="20"/>
               </w:rPr>
-              <w:t xml:space="default">26.96</w:t>
+              <w:t xml:space="default">106</w:t>
             </w:r>
           </w:p>
         </w:tc>
@@ -728,103 +686,7 @@
                 <w:rFonts w:ascii="Calibri" w:hAnsi="Calibri"/>
                 <w:sz w:val="20"/>
               </w:rPr>
-              <w:t xml:space="default">2.79</w:t>
-            </w:r>
-          </w:p>
-        </w:tc>
-        <w:tc>
-          <w:tcPr>
-            <w:tcBorders>
-              <w:top w:val="single" w:space="0" w:color="D3D3D3"/>
-              <w:bottom w:val="single" w:space="0" w:color="D3D3D3"/>
-              <w:start w:val="single" w:space="0" w:color="D3D3D3"/>
-              <w:end w:val="single" w:space="0" w:color="D3D3D3"/>
-            </w:tcBorders>
-          </w:tcPr>
-          <w:p>
-            <w:pPr>
-              <w:spacing w:before="0" w:after="60"/>
-              <w:keepNext/>
-              <w:jc w:val="start"/>
-            </w:pPr>
-            <w:r>
-              <w:rPr>
-                <w:rFonts w:ascii="Calibri" w:hAnsi="Calibri"/>
-                <w:sz w:val="20"/>
-              </w:rPr>
-              <w:t xml:space="default">0.01</w:t>
-            </w:r>
-          </w:p>
-        </w:tc>
-        <w:tc>
-          <w:tcPr>
-            <w:tcBorders>
-              <w:top w:val="single" w:space="0" w:color="D3D3D3"/>
-              <w:bottom w:val="single" w:space="0" w:color="D3D3D3"/>
-              <w:start w:val="single" w:space="0" w:color="D3D3D3"/>
-              <w:end w:val="single" w:space="0" w:color="D3D3D3"/>
-            </w:tcBorders>
-          </w:tcPr>
-          <w:p>
-            <w:pPr>
-              <w:spacing w:before="0" w:after="60"/>
-              <w:keepNext/>
-              <w:jc w:val="end"/>
-            </w:pPr>
-            <w:r>
-              <w:rPr>
-                <w:rFonts w:ascii="Calibri" w:hAnsi="Calibri"/>
-                <w:sz w:val="20"/>
-              </w:rPr>
               <w:t xml:space="default">0.29 (-0.45, 1.06)</w:t>
-            </w:r>
-          </w:p>
-        </w:tc>
-        <w:tc>
-          <w:tcPr>
-            <w:tcBorders>
-              <w:top w:val="single" w:space="0" w:color="D3D3D3"/>
-              <w:bottom w:val="single" w:space="0" w:color="D3D3D3"/>
-              <w:start w:val="single" w:space="0" w:color="D3D3D3"/>
-              <w:end w:val="single" w:space="0" w:color="D3D3D3"/>
-            </w:tcBorders>
-          </w:tcPr>
-          <w:p>
-            <w:pPr>
-              <w:spacing w:before="0" w:after="60"/>
-              <w:keepNext/>
-              <w:jc w:val="end"/>
-            </w:pPr>
-            <w:r>
-              <w:rPr>
-                <w:rFonts w:ascii="Calibri" w:hAnsi="Calibri"/>
-                <w:sz w:val="20"/>
-              </w:rPr>
-              <w:t xml:space="default">26.96</w:t>
-            </w:r>
-          </w:p>
-        </w:tc>
-        <w:tc>
-          <w:tcPr>
-            <w:tcBorders>
-              <w:top w:val="single" w:space="0" w:color="D3D3D3"/>
-              <w:bottom w:val="single" w:space="0" w:color="D3D3D3"/>
-              <w:start w:val="single" w:space="0" w:color="D3D3D3"/>
-              <w:end w:val="single" w:space="0" w:color="D3D3D3"/>
-            </w:tcBorders>
-          </w:tcPr>
-          <w:p>
-            <w:pPr>
-              <w:spacing w:before="0" w:after="60"/>
-              <w:keepNext/>
-              <w:jc w:val="end"/>
-            </w:pPr>
-            <w:r>
-              <w:rPr>
-                <w:rFonts w:ascii="Calibri" w:hAnsi="Calibri"/>
-                <w:sz w:val="20"/>
-              </w:rPr>
-              <w:t xml:space="default">0.75</w:t>
             </w:r>
           </w:p>
         </w:tc>
@@ -868,7 +730,7 @@
             <w:tcMar>
               <w:top w:w="25" w:type="dxa"/>
             </w:tcMar>
-            <w:gridSpan w:val="9"/>
+            <w:gridSpan w:val="7"/>
           </w:tcPr>
           <w:p>
             <w:pPr>
@@ -934,6 +796,30 @@
                 <w:rFonts w:ascii="Calibri" w:hAnsi="Calibri"/>
                 <w:sz w:val="20"/>
               </w:rPr>
+              <w:t xml:space="default">106</w:t>
+            </w:r>
+          </w:p>
+        </w:tc>
+        <w:tc>
+          <w:tcPr>
+            <w:tcBorders>
+              <w:top w:val="single" w:space="0" w:color="D3D3D3"/>
+              <w:bottom w:val="single" w:space="0" w:color="D3D3D3"/>
+              <w:start w:val="single" w:space="0" w:color="D3D3D3"/>
+              <w:end w:val="single" w:space="0" w:color="D3D3D3"/>
+            </w:tcBorders>
+          </w:tcPr>
+          <w:p>
+            <w:pPr>
+              <w:spacing w:before="0" w:after="60"/>
+              <w:keepNext/>
+              <w:jc w:val="end"/>
+            </w:pPr>
+            <w:r>
+              <w:rPr>
+                <w:rFonts w:ascii="Calibri" w:hAnsi="Calibri"/>
+                <w:sz w:val="20"/>
+              </w:rPr>
               <w:t xml:space="default">-0.87 (-1.53, -0.24)</w:t>
             </w:r>
           </w:p>
@@ -951,6 +837,30 @@
             <w:pPr>
               <w:spacing w:before="0" w:after="60"/>
               <w:keepNext/>
+              <w:jc w:val="start"/>
+            </w:pPr>
+            <w:r>
+              <w:rPr>
+                <w:rFonts w:ascii="Calibri" w:hAnsi="Calibri"/>
+                <w:sz w:val="20"/>
+              </w:rPr>
+              <w:t xml:space="default">0.01</w:t>
+            </w:r>
+          </w:p>
+        </w:tc>
+        <w:tc>
+          <w:tcPr>
+            <w:tcBorders>
+              <w:top w:val="single" w:space="0" w:color="D3D3D3"/>
+              <w:bottom w:val="single" w:space="0" w:color="D3D3D3"/>
+              <w:start w:val="single" w:space="0" w:color="D3D3D3"/>
+              <w:end w:val="single" w:space="0" w:color="D3D3D3"/>
+            </w:tcBorders>
+          </w:tcPr>
+          <w:p>
+            <w:pPr>
+              <w:spacing w:before="0" w:after="60"/>
+              <w:keepNext/>
               <w:jc w:val="end"/>
             </w:pPr>
             <w:r>
@@ -958,7 +868,7 @@
                 <w:rFonts w:ascii="Calibri" w:hAnsi="Calibri"/>
                 <w:sz w:val="20"/>
               </w:rPr>
-              <w:t xml:space="default">29.13</w:t>
+              <w:t xml:space="default">106</w:t>
             </w:r>
           </w:p>
         </w:tc>
@@ -982,103 +892,7 @@
                 <w:rFonts w:ascii="Calibri" w:hAnsi="Calibri"/>
                 <w:sz w:val="20"/>
               </w:rPr>
-              <w:t xml:space="default">-2.61</w:t>
-            </w:r>
-          </w:p>
-        </w:tc>
-        <w:tc>
-          <w:tcPr>
-            <w:tcBorders>
-              <w:top w:val="single" w:space="0" w:color="D3D3D3"/>
-              <w:bottom w:val="single" w:space="0" w:color="D3D3D3"/>
-              <w:start w:val="single" w:space="0" w:color="D3D3D3"/>
-              <w:end w:val="single" w:space="0" w:color="D3D3D3"/>
-            </w:tcBorders>
-          </w:tcPr>
-          <w:p>
-            <w:pPr>
-              <w:spacing w:before="0" w:after="60"/>
-              <w:keepNext/>
-              <w:jc w:val="start"/>
-            </w:pPr>
-            <w:r>
-              <w:rPr>
-                <w:rFonts w:ascii="Calibri" w:hAnsi="Calibri"/>
-                <w:sz w:val="20"/>
-              </w:rPr>
-              <w:t xml:space="default">0.01</w:t>
-            </w:r>
-          </w:p>
-        </w:tc>
-        <w:tc>
-          <w:tcPr>
-            <w:tcBorders>
-              <w:top w:val="single" w:space="0" w:color="D3D3D3"/>
-              <w:bottom w:val="single" w:space="0" w:color="D3D3D3"/>
-              <w:start w:val="single" w:space="0" w:color="D3D3D3"/>
-              <w:end w:val="single" w:space="0" w:color="D3D3D3"/>
-            </w:tcBorders>
-          </w:tcPr>
-          <w:p>
-            <w:pPr>
-              <w:spacing w:before="0" w:after="60"/>
-              <w:keepNext/>
-              <w:jc w:val="end"/>
-            </w:pPr>
-            <w:r>
-              <w:rPr>
-                <w:rFonts w:ascii="Calibri" w:hAnsi="Calibri"/>
-                <w:sz w:val="20"/>
-              </w:rPr>
               <w:t xml:space="default">-1.16 (-1.82, -0.53)</w:t>
-            </w:r>
-          </w:p>
-        </w:tc>
-        <w:tc>
-          <w:tcPr>
-            <w:tcBorders>
-              <w:top w:val="single" w:space="0" w:color="D3D3D3"/>
-              <w:bottom w:val="single" w:space="0" w:color="D3D3D3"/>
-              <w:start w:val="single" w:space="0" w:color="D3D3D3"/>
-              <w:end w:val="single" w:space="0" w:color="D3D3D3"/>
-            </w:tcBorders>
-          </w:tcPr>
-          <w:p>
-            <w:pPr>
-              <w:spacing w:before="0" w:after="60"/>
-              <w:keepNext/>
-              <w:jc w:val="end"/>
-            </w:pPr>
-            <w:r>
-              <w:rPr>
-                <w:rFonts w:ascii="Calibri" w:hAnsi="Calibri"/>
-                <w:sz w:val="20"/>
-              </w:rPr>
-              <w:t xml:space="default">28.51</w:t>
-            </w:r>
-          </w:p>
-        </w:tc>
-        <w:tc>
-          <w:tcPr>
-            <w:tcBorders>
-              <w:top w:val="single" w:space="0" w:color="D3D3D3"/>
-              <w:bottom w:val="single" w:space="0" w:color="D3D3D3"/>
-              <w:start w:val="single" w:space="0" w:color="D3D3D3"/>
-              <w:end w:val="single" w:space="0" w:color="D3D3D3"/>
-            </w:tcBorders>
-          </w:tcPr>
-          <w:p>
-            <w:pPr>
-              <w:spacing w:before="0" w:after="60"/>
-              <w:keepNext/>
-              <w:jc w:val="end"/>
-            </w:pPr>
-            <w:r>
-              <w:rPr>
-                <w:rFonts w:ascii="Calibri" w:hAnsi="Calibri"/>
-                <w:sz w:val="20"/>
-              </w:rPr>
-              <w:t xml:space="default">-3.56</w:t>
             </w:r>
           </w:p>
         </w:tc>
@@ -1164,6 +978,30 @@
                 <w:rFonts w:ascii="Calibri" w:hAnsi="Calibri"/>
                 <w:sz w:val="20"/>
               </w:rPr>
+              <w:t xml:space="default">106</w:t>
+            </w:r>
+          </w:p>
+        </w:tc>
+        <w:tc>
+          <w:tcPr>
+            <w:tcBorders>
+              <w:top w:val="single" w:space="0" w:color="D3D3D3"/>
+              <w:bottom w:val="single" w:space="0" w:color="D3D3D3"/>
+              <w:start w:val="single" w:space="0" w:color="D3D3D3"/>
+              <w:end w:val="single" w:space="0" w:color="D3D3D3"/>
+            </w:tcBorders>
+          </w:tcPr>
+          <w:p>
+            <w:pPr>
+              <w:spacing w:before="0" w:after="60"/>
+              <w:keepNext/>
+              <w:jc w:val="end"/>
+            </w:pPr>
+            <w:r>
+              <w:rPr>
+                <w:rFonts w:ascii="Calibri" w:hAnsi="Calibri"/>
+                <w:sz w:val="20"/>
+              </w:rPr>
               <w:t xml:space="default">-0.66 (-1.32, -0.04)</w:t>
             </w:r>
           </w:p>
@@ -1181,6 +1019,30 @@
             <w:pPr>
               <w:spacing w:before="0" w:after="60"/>
               <w:keepNext/>
+              <w:jc w:val="start"/>
+            </w:pPr>
+            <w:r>
+              <w:rPr>
+                <w:rFonts w:ascii="Calibri" w:hAnsi="Calibri"/>
+                <w:sz w:val="20"/>
+              </w:rPr>
+              <w:t xml:space="default">0.05</w:t>
+            </w:r>
+          </w:p>
+        </w:tc>
+        <w:tc>
+          <w:tcPr>
+            <w:tcBorders>
+              <w:top w:val="single" w:space="0" w:color="D3D3D3"/>
+              <w:bottom w:val="single" w:space="0" w:color="D3D3D3"/>
+              <w:start w:val="single" w:space="0" w:color="D3D3D3"/>
+              <w:end w:val="single" w:space="0" w:color="D3D3D3"/>
+            </w:tcBorders>
+          </w:tcPr>
+          <w:p>
+            <w:pPr>
+              <w:spacing w:before="0" w:after="60"/>
+              <w:keepNext/>
               <w:jc w:val="end"/>
             </w:pPr>
             <w:r>
@@ -1188,7 +1050,7 @@
                 <w:rFonts w:ascii="Calibri" w:hAnsi="Calibri"/>
                 <w:sz w:val="20"/>
               </w:rPr>
-              <w:t xml:space="default">27.67</w:t>
+              <w:t xml:space="default">106</w:t>
             </w:r>
           </w:p>
         </w:tc>
@@ -1212,103 +1074,7 @@
                 <w:rFonts w:ascii="Calibri" w:hAnsi="Calibri"/>
                 <w:sz w:val="20"/>
               </w:rPr>
-              <w:t xml:space="default">-2.03</w:t>
-            </w:r>
-          </w:p>
-        </w:tc>
-        <w:tc>
-          <w:tcPr>
-            <w:tcBorders>
-              <w:top w:val="single" w:space="0" w:color="D3D3D3"/>
-              <w:bottom w:val="single" w:space="0" w:color="D3D3D3"/>
-              <w:start w:val="single" w:space="0" w:color="D3D3D3"/>
-              <w:end w:val="single" w:space="0" w:color="D3D3D3"/>
-            </w:tcBorders>
-          </w:tcPr>
-          <w:p>
-            <w:pPr>
-              <w:spacing w:before="0" w:after="60"/>
-              <w:keepNext/>
-              <w:jc w:val="start"/>
-            </w:pPr>
-            <w:r>
-              <w:rPr>
-                <w:rFonts w:ascii="Calibri" w:hAnsi="Calibri"/>
-                <w:sz w:val="20"/>
-              </w:rPr>
-              <w:t xml:space="default">0.05</w:t>
-            </w:r>
-          </w:p>
-        </w:tc>
-        <w:tc>
-          <w:tcPr>
-            <w:tcBorders>
-              <w:top w:val="single" w:space="0" w:color="D3D3D3"/>
-              <w:bottom w:val="single" w:space="0" w:color="D3D3D3"/>
-              <w:start w:val="single" w:space="0" w:color="D3D3D3"/>
-              <w:end w:val="single" w:space="0" w:color="D3D3D3"/>
-            </w:tcBorders>
-          </w:tcPr>
-          <w:p>
-            <w:pPr>
-              <w:spacing w:before="0" w:after="60"/>
-              <w:keepNext/>
-              <w:jc w:val="end"/>
-            </w:pPr>
-            <w:r>
-              <w:rPr>
-                <w:rFonts w:ascii="Calibri" w:hAnsi="Calibri"/>
-                <w:sz w:val="20"/>
-              </w:rPr>
               <w:t xml:space="default">-1.13 (-1.76, -0.52)</w:t>
-            </w:r>
-          </w:p>
-        </w:tc>
-        <w:tc>
-          <w:tcPr>
-            <w:tcBorders>
-              <w:top w:val="single" w:space="0" w:color="D3D3D3"/>
-              <w:bottom w:val="single" w:space="0" w:color="D3D3D3"/>
-              <w:start w:val="single" w:space="0" w:color="D3D3D3"/>
-              <w:end w:val="single" w:space="0" w:color="D3D3D3"/>
-            </w:tcBorders>
-          </w:tcPr>
-          <w:p>
-            <w:pPr>
-              <w:spacing w:before="0" w:after="60"/>
-              <w:keepNext/>
-              <w:jc w:val="end"/>
-            </w:pPr>
-            <w:r>
-              <w:rPr>
-                <w:rFonts w:ascii="Calibri" w:hAnsi="Calibri"/>
-                <w:sz w:val="20"/>
-              </w:rPr>
-              <w:t xml:space="default">26.87</w:t>
-            </w:r>
-          </w:p>
-        </w:tc>
-        <w:tc>
-          <w:tcPr>
-            <w:tcBorders>
-              <w:top w:val="single" w:space="0" w:color="D3D3D3"/>
-              <w:bottom w:val="single" w:space="0" w:color="D3D3D3"/>
-              <w:start w:val="single" w:space="0" w:color="D3D3D3"/>
-              <w:end w:val="single" w:space="0" w:color="D3D3D3"/>
-            </w:tcBorders>
-          </w:tcPr>
-          <w:p>
-            <w:pPr>
-              <w:spacing w:before="0" w:after="60"/>
-              <w:keepNext/>
-              <w:jc w:val="end"/>
-            </w:pPr>
-            <w:r>
-              <w:rPr>
-                <w:rFonts w:ascii="Calibri" w:hAnsi="Calibri"/>
-                <w:sz w:val="20"/>
-              </w:rPr>
-              <w:t xml:space="default">-3.60</w:t>
             </w:r>
           </w:p>
         </w:tc>
@@ -1352,7 +1118,7 @@
             <w:tcMar>
               <w:top w:w="25" w:type="dxa"/>
             </w:tcMar>
-            <w:gridSpan w:val="9"/>
+            <w:gridSpan w:val="7"/>
           </w:tcPr>
           <w:p>
             <w:pPr>
@@ -1418,6 +1184,30 @@
                 <w:rFonts w:ascii="Calibri" w:hAnsi="Calibri"/>
                 <w:sz w:val="20"/>
               </w:rPr>
+              <w:t xml:space="default">106</w:t>
+            </w:r>
+          </w:p>
+        </w:tc>
+        <w:tc>
+          <w:tcPr>
+            <w:tcBorders>
+              <w:top w:val="single" w:space="0" w:color="D3D3D3"/>
+              <w:bottom w:val="single" w:space="0" w:color="D3D3D3"/>
+              <w:start w:val="single" w:space="0" w:color="D3D3D3"/>
+              <w:end w:val="single" w:space="0" w:color="D3D3D3"/>
+            </w:tcBorders>
+          </w:tcPr>
+          <w:p>
+            <w:pPr>
+              <w:spacing w:before="0" w:after="60"/>
+              <w:keepNext/>
+              <w:jc w:val="end"/>
+            </w:pPr>
+            <w:r>
+              <w:rPr>
+                <w:rFonts w:ascii="Calibri" w:hAnsi="Calibri"/>
+                <w:sz w:val="20"/>
+              </w:rPr>
               <w:t xml:space="default">-1.32 (-1.9, -0.78)</w:t>
             </w:r>
           </w:p>
@@ -1435,6 +1225,30 @@
             <w:pPr>
               <w:spacing w:before="0" w:after="60"/>
               <w:keepNext/>
+              <w:jc w:val="start"/>
+            </w:pPr>
+            <w:r>
+              <w:rPr>
+                <w:rFonts w:ascii="Calibri" w:hAnsi="Calibri"/>
+                <w:sz w:val="20"/>
+              </w:rPr>
+              <w:t xml:space="default">1e-04</w:t>
+            </w:r>
+          </w:p>
+        </w:tc>
+        <w:tc>
+          <w:tcPr>
+            <w:tcBorders>
+              <w:top w:val="single" w:space="0" w:color="D3D3D3"/>
+              <w:bottom w:val="single" w:space="0" w:color="D3D3D3"/>
+              <w:start w:val="single" w:space="0" w:color="D3D3D3"/>
+              <w:end w:val="single" w:space="0" w:color="D3D3D3"/>
+            </w:tcBorders>
+          </w:tcPr>
+          <w:p>
+            <w:pPr>
+              <w:spacing w:before="0" w:after="60"/>
+              <w:keepNext/>
               <w:jc w:val="end"/>
             </w:pPr>
             <w:r>
@@ -1442,7 +1256,7 @@
                 <w:rFonts w:ascii="Calibri" w:hAnsi="Calibri"/>
                 <w:sz w:val="20"/>
               </w:rPr>
-              <w:t xml:space="default">28.61</w:t>
+              <w:t xml:space="default">106</w:t>
             </w:r>
           </w:p>
         </w:tc>
@@ -1466,103 +1280,7 @@
                 <w:rFonts w:ascii="Calibri" w:hAnsi="Calibri"/>
                 <w:sz w:val="20"/>
               </w:rPr>
-              <w:t xml:space="default">-4.53</w:t>
-            </w:r>
-          </w:p>
-        </w:tc>
-        <w:tc>
-          <w:tcPr>
-            <w:tcBorders>
-              <w:top w:val="single" w:space="0" w:color="D3D3D3"/>
-              <w:bottom w:val="single" w:space="0" w:color="D3D3D3"/>
-              <w:start w:val="single" w:space="0" w:color="D3D3D3"/>
-              <w:end w:val="single" w:space="0" w:color="D3D3D3"/>
-            </w:tcBorders>
-          </w:tcPr>
-          <w:p>
-            <w:pPr>
-              <w:spacing w:before="0" w:after="60"/>
-              <w:keepNext/>
-              <w:jc w:val="start"/>
-            </w:pPr>
-            <w:r>
-              <w:rPr>
-                <w:rFonts w:ascii="Calibri" w:hAnsi="Calibri"/>
-                <w:sz w:val="20"/>
-              </w:rPr>
-              <w:t xml:space="default">1e-04</w:t>
-            </w:r>
-          </w:p>
-        </w:tc>
-        <w:tc>
-          <w:tcPr>
-            <w:tcBorders>
-              <w:top w:val="single" w:space="0" w:color="D3D3D3"/>
-              <w:bottom w:val="single" w:space="0" w:color="D3D3D3"/>
-              <w:start w:val="single" w:space="0" w:color="D3D3D3"/>
-              <w:end w:val="single" w:space="0" w:color="D3D3D3"/>
-            </w:tcBorders>
-          </w:tcPr>
-          <w:p>
-            <w:pPr>
-              <w:spacing w:before="0" w:after="60"/>
-              <w:keepNext/>
-              <w:jc w:val="end"/>
-            </w:pPr>
-            <w:r>
-              <w:rPr>
-                <w:rFonts w:ascii="Calibri" w:hAnsi="Calibri"/>
-                <w:sz w:val="20"/>
-              </w:rPr>
               <w:t xml:space="default">-1.39 (-1.99, -0.85)</w:t>
-            </w:r>
-          </w:p>
-        </w:tc>
-        <w:tc>
-          <w:tcPr>
-            <w:tcBorders>
-              <w:top w:val="single" w:space="0" w:color="D3D3D3"/>
-              <w:bottom w:val="single" w:space="0" w:color="D3D3D3"/>
-              <w:start w:val="single" w:space="0" w:color="D3D3D3"/>
-              <w:end w:val="single" w:space="0" w:color="D3D3D3"/>
-            </w:tcBorders>
-          </w:tcPr>
-          <w:p>
-            <w:pPr>
-              <w:spacing w:before="0" w:after="60"/>
-              <w:keepNext/>
-              <w:jc w:val="end"/>
-            </w:pPr>
-            <w:r>
-              <w:rPr>
-                <w:rFonts w:ascii="Calibri" w:hAnsi="Calibri"/>
-                <w:sz w:val="20"/>
-              </w:rPr>
-              <w:t xml:space="default">28.45</w:t>
-            </w:r>
-          </w:p>
-        </w:tc>
-        <w:tc>
-          <w:tcPr>
-            <w:tcBorders>
-              <w:top w:val="single" w:space="0" w:color="D3D3D3"/>
-              <w:bottom w:val="single" w:space="0" w:color="D3D3D3"/>
-              <w:start w:val="single" w:space="0" w:color="D3D3D3"/>
-              <w:end w:val="single" w:space="0" w:color="D3D3D3"/>
-            </w:tcBorders>
-          </w:tcPr>
-          <w:p>
-            <w:pPr>
-              <w:spacing w:before="0" w:after="60"/>
-              <w:keepNext/>
-              <w:jc w:val="end"/>
-            </w:pPr>
-            <w:r>
-              <w:rPr>
-                <w:rFonts w:ascii="Calibri" w:hAnsi="Calibri"/>
-                <w:sz w:val="20"/>
-              </w:rPr>
-              <w:t xml:space="default">-4.74</w:t>
             </w:r>
           </w:p>
         </w:tc>
@@ -1648,6 +1366,30 @@
                 <w:rFonts w:ascii="Calibri" w:hAnsi="Calibri"/>
                 <w:sz w:val="20"/>
               </w:rPr>
+              <w:t xml:space="default">106</w:t>
+            </w:r>
+          </w:p>
+        </w:tc>
+        <w:tc>
+          <w:tcPr>
+            <w:tcBorders>
+              <w:top w:val="single" w:space="0" w:color="D3D3D3"/>
+              <w:bottom w:val="single" w:space="0" w:color="D3D3D3"/>
+              <w:start w:val="single" w:space="0" w:color="D3D3D3"/>
+              <w:end w:val="single" w:space="0" w:color="D3D3D3"/>
+            </w:tcBorders>
+          </w:tcPr>
+          <w:p>
+            <w:pPr>
+              <w:spacing w:before="0" w:after="60"/>
+              <w:keepNext/>
+              <w:jc w:val="end"/>
+            </w:pPr>
+            <w:r>
+              <w:rPr>
+                <w:rFonts w:ascii="Calibri" w:hAnsi="Calibri"/>
+                <w:sz w:val="20"/>
+              </w:rPr>
               <w:t xml:space="default">-1.41 (-2.07, -0.77)</w:t>
             </w:r>
           </w:p>
@@ -1665,6 +1407,30 @@
             <w:pPr>
               <w:spacing w:before="0" w:after="60"/>
               <w:keepNext/>
+              <w:jc w:val="start"/>
+            </w:pPr>
+            <w:r>
+              <w:rPr>
+                <w:rFonts w:ascii="Calibri" w:hAnsi="Calibri"/>
+                <w:sz w:val="20"/>
+              </w:rPr>
+              <w:t xml:space="default">3e-04</w:t>
+            </w:r>
+          </w:p>
+        </w:tc>
+        <w:tc>
+          <w:tcPr>
+            <w:tcBorders>
+              <w:top w:val="single" w:space="0" w:color="D3D3D3"/>
+              <w:bottom w:val="single" w:space="0" w:color="D3D3D3"/>
+              <w:start w:val="single" w:space="0" w:color="D3D3D3"/>
+              <w:end w:val="single" w:space="0" w:color="D3D3D3"/>
+            </w:tcBorders>
+          </w:tcPr>
+          <w:p>
+            <w:pPr>
+              <w:spacing w:before="0" w:after="60"/>
+              <w:keepNext/>
               <w:jc w:val="end"/>
             </w:pPr>
             <w:r>
@@ -1672,7 +1438,7 @@
                 <w:rFonts w:ascii="Calibri" w:hAnsi="Calibri"/>
                 <w:sz w:val="20"/>
               </w:rPr>
-              <w:t xml:space="default">27.00</w:t>
+              <w:t xml:space="default">106</w:t>
             </w:r>
           </w:p>
         </w:tc>
@@ -1696,103 +1462,7 @@
                 <w:rFonts w:ascii="Calibri" w:hAnsi="Calibri"/>
                 <w:sz w:val="20"/>
               </w:rPr>
-              <w:t xml:space="default">-4.21</w:t>
-            </w:r>
-          </w:p>
-        </w:tc>
-        <w:tc>
-          <w:tcPr>
-            <w:tcBorders>
-              <w:top w:val="single" w:space="0" w:color="D3D3D3"/>
-              <w:bottom w:val="single" w:space="0" w:color="D3D3D3"/>
-              <w:start w:val="single" w:space="0" w:color="D3D3D3"/>
-              <w:end w:val="single" w:space="0" w:color="D3D3D3"/>
-            </w:tcBorders>
-          </w:tcPr>
-          <w:p>
-            <w:pPr>
-              <w:spacing w:before="0" w:after="60"/>
-              <w:keepNext/>
-              <w:jc w:val="start"/>
-            </w:pPr>
-            <w:r>
-              <w:rPr>
-                <w:rFonts w:ascii="Calibri" w:hAnsi="Calibri"/>
-                <w:sz w:val="20"/>
-              </w:rPr>
-              <w:t xml:space="default">3e-04</w:t>
-            </w:r>
-          </w:p>
-        </w:tc>
-        <w:tc>
-          <w:tcPr>
-            <w:tcBorders>
-              <w:top w:val="single" w:space="0" w:color="D3D3D3"/>
-              <w:bottom w:val="single" w:space="0" w:color="D3D3D3"/>
-              <w:start w:val="single" w:space="0" w:color="D3D3D3"/>
-              <w:end w:val="single" w:space="0" w:color="D3D3D3"/>
-            </w:tcBorders>
-          </w:tcPr>
-          <w:p>
-            <w:pPr>
-              <w:spacing w:before="0" w:after="60"/>
-              <w:keepNext/>
-              <w:jc w:val="end"/>
-            </w:pPr>
-            <w:r>
-              <w:rPr>
-                <w:rFonts w:ascii="Calibri" w:hAnsi="Calibri"/>
-                <w:sz w:val="20"/>
-              </w:rPr>
               <w:t xml:space="default">-1.33 (-1.95, -0.7)</w:t>
-            </w:r>
-          </w:p>
-        </w:tc>
-        <w:tc>
-          <w:tcPr>
-            <w:tcBorders>
-              <w:top w:val="single" w:space="0" w:color="D3D3D3"/>
-              <w:bottom w:val="single" w:space="0" w:color="D3D3D3"/>
-              <w:start w:val="single" w:space="0" w:color="D3D3D3"/>
-              <w:end w:val="single" w:space="0" w:color="D3D3D3"/>
-            </w:tcBorders>
-          </w:tcPr>
-          <w:p>
-            <w:pPr>
-              <w:spacing w:before="0" w:after="60"/>
-              <w:keepNext/>
-              <w:jc w:val="end"/>
-            </w:pPr>
-            <w:r>
-              <w:rPr>
-                <w:rFonts w:ascii="Calibri" w:hAnsi="Calibri"/>
-                <w:sz w:val="20"/>
-              </w:rPr>
-              <w:t xml:space="default">26.38</w:t>
-            </w:r>
-          </w:p>
-        </w:tc>
-        <w:tc>
-          <w:tcPr>
-            <w:tcBorders>
-              <w:top w:val="single" w:space="0" w:color="D3D3D3"/>
-              <w:bottom w:val="single" w:space="0" w:color="D3D3D3"/>
-              <w:start w:val="single" w:space="0" w:color="D3D3D3"/>
-              <w:end w:val="single" w:space="0" w:color="D3D3D3"/>
-            </w:tcBorders>
-          </w:tcPr>
-          <w:p>
-            <w:pPr>
-              <w:spacing w:before="0" w:after="60"/>
-              <w:keepNext/>
-              <w:jc w:val="end"/>
-            </w:pPr>
-            <w:r>
-              <w:rPr>
-                <w:rFonts w:ascii="Calibri" w:hAnsi="Calibri"/>
-                <w:sz w:val="20"/>
-              </w:rPr>
-              <w:t xml:space="default">-4.14</w:t>
             </w:r>
           </w:p>
         </w:tc>
@@ -1827,7 +1497,7 @@
         </w:trPr>
         <w:tc>
           <w:tcPr>
-            <w:gridSpan w:val="9"/>
+            <w:gridSpan w:val="7"/>
           </w:tcPr>
           <w:p>
             <w:pPr>
@@ -1859,7 +1529,7 @@
         </w:trPr>
         <w:tc>
           <w:tcPr>
-            <w:gridSpan w:val="9"/>
+            <w:gridSpan w:val="7"/>
           </w:tcPr>
           <w:p>
             <w:pPr>
@@ -1891,7 +1561,7 @@
         </w:trPr>
         <w:tc>
           <w:tcPr>
-            <w:gridSpan w:val="9"/>
+            <w:gridSpan w:val="7"/>
           </w:tcPr>
           <w:p>
             <w:pPr>
@@ -1923,7 +1593,7 @@
         </w:trPr>
         <w:tc>
           <w:tcPr>
-            <w:gridSpan w:val="9"/>
+            <w:gridSpan w:val="7"/>
           </w:tcPr>
           <w:p>
             <w:pPr>

</xml_diff>

<commit_message>
Updated scripts and visualizations
</commit_message>
<xml_diff>
--- a/Output/devel_mod_table.docx
+++ b/Output/devel_mod_table.docx
@@ -58,7 +58,7 @@
           <w:sz w:val="24"/>
           <w:color w:val="333333"/>
         </w:rPr>
-        <w:t xml:space="preserve"> Associations of three temperature variables before or after thermoregulatory independence (defined as occurring six days post-hatch) with nestling mass. Temperature variability is defined as the interquartile range.</w:t>
+        <w:t xml:space="preserve"> Associations of three temperature variables in early and late development (before and after six days post-hatch) with nestling mass. Temperature variability is defined as the interquartile range. For each temperature variable, results are provided for unadjusted and adjusted models. Sample size for each stratum is provided in the header (n). For each model, the table provides the effect size and 95% confidence interval for temperature effects (β (95% CI)), and the corresponding standard error, degrees of freedom, t-value, and p-value from a two-tailed t-test using a Satterthwaite degree of freedom estimation.</w:t>
       </w:r>
     </w:p>
     <w:tbl xmlns:w="http://schemas.openxmlformats.org/wordprocessingml/2006/main" xmlns:wp="http://schemas.openxmlformats.org/drawingml/2006/wordprocessingDrawing" xmlns:r="http://schemas.openxmlformats.org/officeDocument/2006/relationships" xmlns:w14="http://schemas.microsoft.com/office/word/2010/wordml">
@@ -87,6 +87,7 @@
             </w:tcBorders>
             <w:vMerge w:val="restart"/>
             <w:vAlign w:val="bottom"/>
+            <w:gridSpan w:val="1"/>
           </w:tcPr>
           <w:p>
             <w:pPr>
@@ -110,7 +111,7 @@
               <w:bottom w:val="single" w:sz="16" w:space="0" w:color="D3D3D3"/>
               <w:start w:val="single" w:space="0" w:color="D3D3D3"/>
             </w:tcBorders>
-            <w:gridSpan w:val="3"/>
+            <w:gridSpan w:val="5"/>
           </w:tcPr>
           <w:p>
             <w:pPr>
@@ -123,7 +124,7 @@
                 <w:rFonts w:ascii="Calibri" w:hAnsi="Calibri"/>
                 <w:sz w:val="20"/>
               </w:rPr>
-              <w:t xml:space="default">Before models</w:t>
+              <w:t xml:space="default">Early development models (n = 106)</w:t>
             </w:r>
           </w:p>
         </w:tc>
@@ -134,7 +135,7 @@
               <w:bottom w:val="single" w:sz="16" w:space="0" w:color="D3D3D3"/>
               <w:end w:val="single" w:space="0" w:color="D3D3D3"/>
             </w:tcBorders>
-            <w:gridSpan w:val="3"/>
+            <w:gridSpan w:val="5"/>
           </w:tcPr>
           <w:p>
             <w:pPr>
@@ -147,7 +148,7 @@
                 <w:rFonts w:ascii="Calibri" w:hAnsi="Calibri"/>
                 <w:sz w:val="20"/>
               </w:rPr>
-              <w:t xml:space="default">After models</w:t>
+              <w:t xml:space="default">Late development models (n = 106)</w:t>
             </w:r>
           </w:p>
         </w:tc>
@@ -198,27 +199,6 @@
                 <w:rFonts w:ascii="Calibri" w:hAnsi="Calibri"/>
                 <w:sz w:val="20"/>
               </w:rPr>
-              <w:t xml:space="default">N</w:t>
-            </w:r>
-          </w:p>
-        </w:tc>
-        <w:tc>
-          <w:tcPr>
-            <w:tcBorders>
-              <w:bottom w:val="single" w:sz="16" w:space="0" w:color="D3D3D3"/>
-            </w:tcBorders>
-          </w:tcPr>
-          <w:p>
-            <w:pPr>
-              <w:spacing w:before="0" w:after="60"/>
-              <w:keepNext/>
-              <w:jc w:val="end"/>
-            </w:pPr>
-            <w:r>
-              <w:rPr>
-                <w:rFonts w:ascii="Calibri" w:hAnsi="Calibri"/>
-                <w:sz w:val="20"/>
-              </w:rPr>
               <w:t xml:space="default">β (95% CI)</w:t>
             </w:r>
             <w:r>
@@ -242,6 +222,69 @@
             <w:pPr>
               <w:spacing w:before="0" w:after="60"/>
               <w:keepNext/>
+              <w:jc w:val="end"/>
+            </w:pPr>
+            <w:r>
+              <w:rPr>
+                <w:rFonts w:ascii="Calibri" w:hAnsi="Calibri"/>
+                <w:sz w:val="20"/>
+              </w:rPr>
+              <w:t xml:space="default">SE</w:t>
+            </w:r>
+          </w:p>
+        </w:tc>
+        <w:tc>
+          <w:tcPr>
+            <w:tcBorders>
+              <w:bottom w:val="single" w:sz="16" w:space="0" w:color="D3D3D3"/>
+            </w:tcBorders>
+          </w:tcPr>
+          <w:p>
+            <w:pPr>
+              <w:spacing w:before="0" w:after="60"/>
+              <w:keepNext/>
+              <w:jc w:val="end"/>
+            </w:pPr>
+            <w:r>
+              <w:rPr>
+                <w:rFonts w:ascii="Calibri" w:hAnsi="Calibri"/>
+                <w:sz w:val="20"/>
+              </w:rPr>
+              <w:t xml:space="default">DF</w:t>
+            </w:r>
+          </w:p>
+        </w:tc>
+        <w:tc>
+          <w:tcPr>
+            <w:tcBorders>
+              <w:bottom w:val="single" w:sz="16" w:space="0" w:color="D3D3D3"/>
+            </w:tcBorders>
+          </w:tcPr>
+          <w:p>
+            <w:pPr>
+              <w:spacing w:before="0" w:after="60"/>
+              <w:keepNext/>
+              <w:jc w:val="end"/>
+            </w:pPr>
+            <w:r>
+              <w:rPr>
+                <w:rFonts w:ascii="Calibri" w:hAnsi="Calibri"/>
+                <w:sz w:val="20"/>
+              </w:rPr>
+              <w:t xml:space="default">t-value</w:t>
+            </w:r>
+          </w:p>
+        </w:tc>
+        <w:tc>
+          <w:tcPr>
+            <w:tcBorders>
+              <w:bottom w:val="single" w:sz="16" w:space="0" w:color="D3D3D3"/>
+            </w:tcBorders>
+          </w:tcPr>
+          <w:p>
+            <w:pPr>
+              <w:spacing w:before="0" w:after="60"/>
+              <w:keepNext/>
               <w:jc w:val="start"/>
             </w:pPr>
             <w:r>
@@ -249,28 +292,7 @@
                 <w:rFonts w:ascii="Calibri" w:hAnsi="Calibri"/>
                 <w:sz w:val="20"/>
               </w:rPr>
-              <w:t xml:space="default">P</w:t>
-            </w:r>
-          </w:p>
-        </w:tc>
-        <w:tc>
-          <w:tcPr>
-            <w:tcBorders>
-              <w:bottom w:val="single" w:sz="16" w:space="0" w:color="D3D3D3"/>
-            </w:tcBorders>
-          </w:tcPr>
-          <w:p>
-            <w:pPr>
-              <w:spacing w:before="0" w:after="60"/>
-              <w:keepNext/>
-              <w:jc w:val="end"/>
-            </w:pPr>
-            <w:r>
-              <w:rPr>
-                <w:rFonts w:ascii="Calibri" w:hAnsi="Calibri"/>
-                <w:sz w:val="20"/>
-              </w:rPr>
-              <w:t xml:space="default">N</w:t>
+              <w:t xml:space="default">p-value</w:t>
             </w:r>
           </w:p>
         </w:tc>
@@ -308,6 +330,69 @@
           <w:tcPr>
             <w:tcBorders>
               <w:bottom w:val="single" w:sz="16" w:space="0" w:color="D3D3D3"/>
+            </w:tcBorders>
+          </w:tcPr>
+          <w:p>
+            <w:pPr>
+              <w:spacing w:before="0" w:after="60"/>
+              <w:keepNext/>
+              <w:jc w:val="end"/>
+            </w:pPr>
+            <w:r>
+              <w:rPr>
+                <w:rFonts w:ascii="Calibri" w:hAnsi="Calibri"/>
+                <w:sz w:val="20"/>
+              </w:rPr>
+              <w:t xml:space="default">SE</w:t>
+            </w:r>
+          </w:p>
+        </w:tc>
+        <w:tc>
+          <w:tcPr>
+            <w:tcBorders>
+              <w:bottom w:val="single" w:sz="16" w:space="0" w:color="D3D3D3"/>
+            </w:tcBorders>
+          </w:tcPr>
+          <w:p>
+            <w:pPr>
+              <w:spacing w:before="0" w:after="60"/>
+              <w:keepNext/>
+              <w:jc w:val="end"/>
+            </w:pPr>
+            <w:r>
+              <w:rPr>
+                <w:rFonts w:ascii="Calibri" w:hAnsi="Calibri"/>
+                <w:sz w:val="20"/>
+              </w:rPr>
+              <w:t xml:space="default">DF</w:t>
+            </w:r>
+          </w:p>
+        </w:tc>
+        <w:tc>
+          <w:tcPr>
+            <w:tcBorders>
+              <w:bottom w:val="single" w:sz="16" w:space="0" w:color="D3D3D3"/>
+            </w:tcBorders>
+          </w:tcPr>
+          <w:p>
+            <w:pPr>
+              <w:spacing w:before="0" w:after="60"/>
+              <w:keepNext/>
+              <w:jc w:val="end"/>
+            </w:pPr>
+            <w:r>
+              <w:rPr>
+                <w:rFonts w:ascii="Calibri" w:hAnsi="Calibri"/>
+                <w:sz w:val="20"/>
+              </w:rPr>
+              <w:t xml:space="default">t-value</w:t>
+            </w:r>
+          </w:p>
+        </w:tc>
+        <w:tc>
+          <w:tcPr>
+            <w:tcBorders>
+              <w:bottom w:val="single" w:sz="16" w:space="0" w:color="D3D3D3"/>
               <w:end w:val="single" w:space="0" w:color="D3D3D3"/>
             </w:tcBorders>
           </w:tcPr>
@@ -322,7 +407,7 @@
                 <w:rFonts w:ascii="Calibri" w:hAnsi="Calibri"/>
                 <w:sz w:val="20"/>
               </w:rPr>
-              <w:t xml:space="default">P</w:t>
+              <w:t xml:space="default">p-value</w:t>
             </w:r>
           </w:p>
         </w:tc>
@@ -342,7 +427,7 @@
             <w:tcMar>
               <w:top w:w="25" w:type="dxa"/>
             </w:tcMar>
-            <w:gridSpan w:val="7"/>
+            <w:gridSpan w:val="11"/>
           </w:tcPr>
           <w:p>
             <w:pPr>
@@ -408,30 +493,6 @@
                 <w:rFonts w:ascii="Calibri" w:hAnsi="Calibri"/>
                 <w:sz w:val="20"/>
               </w:rPr>
-              <w:t xml:space="default">106</w:t>
-            </w:r>
-          </w:p>
-        </w:tc>
-        <w:tc>
-          <w:tcPr>
-            <w:tcBorders>
-              <w:top w:val="single" w:space="0" w:color="D3D3D3"/>
-              <w:bottom w:val="single" w:space="0" w:color="D3D3D3"/>
-              <w:start w:val="single" w:space="0" w:color="D3D3D3"/>
-              <w:end w:val="single" w:space="0" w:color="D3D3D3"/>
-            </w:tcBorders>
-          </w:tcPr>
-          <w:p>
-            <w:pPr>
-              <w:spacing w:before="0" w:after="60"/>
-              <w:keepNext/>
-              <w:jc w:val="end"/>
-            </w:pPr>
-            <w:r>
-              <w:rPr>
-                <w:rFonts w:ascii="Calibri" w:hAnsi="Calibri"/>
-                <w:sz w:val="20"/>
-              </w:rPr>
               <w:t xml:space="default">1.11 (0.45, 1.8)</w:t>
             </w:r>
           </w:p>
@@ -449,6 +510,78 @@
             <w:pPr>
               <w:spacing w:before="0" w:after="60"/>
               <w:keepNext/>
+              <w:jc w:val="end"/>
+            </w:pPr>
+            <w:r>
+              <w:rPr>
+                <w:rFonts w:ascii="Calibri" w:hAnsi="Calibri"/>
+                <w:sz w:val="20"/>
+              </w:rPr>
+              <w:t xml:space="default">0.35</w:t>
+            </w:r>
+          </w:p>
+        </w:tc>
+        <w:tc>
+          <w:tcPr>
+            <w:tcBorders>
+              <w:top w:val="single" w:space="0" w:color="D3D3D3"/>
+              <w:bottom w:val="single" w:space="0" w:color="D3D3D3"/>
+              <w:start w:val="single" w:space="0" w:color="D3D3D3"/>
+              <w:end w:val="single" w:space="0" w:color="D3D3D3"/>
+            </w:tcBorders>
+          </w:tcPr>
+          <w:p>
+            <w:pPr>
+              <w:spacing w:before="0" w:after="60"/>
+              <w:keepNext/>
+              <w:jc w:val="end"/>
+            </w:pPr>
+            <w:r>
+              <w:rPr>
+                <w:rFonts w:ascii="Calibri" w:hAnsi="Calibri"/>
+                <w:sz w:val="20"/>
+              </w:rPr>
+              <w:t xml:space="default">28.58</w:t>
+            </w:r>
+          </w:p>
+        </w:tc>
+        <w:tc>
+          <w:tcPr>
+            <w:tcBorders>
+              <w:top w:val="single" w:space="0" w:color="D3D3D3"/>
+              <w:bottom w:val="single" w:space="0" w:color="D3D3D3"/>
+              <w:start w:val="single" w:space="0" w:color="D3D3D3"/>
+              <w:end w:val="single" w:space="0" w:color="D3D3D3"/>
+            </w:tcBorders>
+          </w:tcPr>
+          <w:p>
+            <w:pPr>
+              <w:spacing w:before="0" w:after="60"/>
+              <w:keepNext/>
+              <w:jc w:val="end"/>
+            </w:pPr>
+            <w:r>
+              <w:rPr>
+                <w:rFonts w:ascii="Calibri" w:hAnsi="Calibri"/>
+                <w:sz w:val="20"/>
+              </w:rPr>
+              <w:t xml:space="default">3.22</w:t>
+            </w:r>
+          </w:p>
+        </w:tc>
+        <w:tc>
+          <w:tcPr>
+            <w:tcBorders>
+              <w:top w:val="single" w:space="0" w:color="D3D3D3"/>
+              <w:bottom w:val="single" w:space="0" w:color="D3D3D3"/>
+              <w:start w:val="single" w:space="0" w:color="D3D3D3"/>
+              <w:end w:val="single" w:space="0" w:color="D3D3D3"/>
+            </w:tcBorders>
+          </w:tcPr>
+          <w:p>
+            <w:pPr>
+              <w:spacing w:before="0" w:after="60"/>
+              <w:keepNext/>
               <w:jc w:val="start"/>
             </w:pPr>
             <w:r>
@@ -480,31 +613,79 @@
                 <w:rFonts w:ascii="Calibri" w:hAnsi="Calibri"/>
                 <w:sz w:val="20"/>
               </w:rPr>
-              <w:t xml:space="default">106</w:t>
-            </w:r>
-          </w:p>
-        </w:tc>
-        <w:tc>
-          <w:tcPr>
-            <w:tcBorders>
-              <w:top w:val="single" w:space="0" w:color="D3D3D3"/>
-              <w:bottom w:val="single" w:space="0" w:color="D3D3D3"/>
-              <w:start w:val="single" w:space="0" w:color="D3D3D3"/>
-              <w:end w:val="single" w:space="0" w:color="D3D3D3"/>
-            </w:tcBorders>
-          </w:tcPr>
-          <w:p>
-            <w:pPr>
-              <w:spacing w:before="0" w:after="60"/>
-              <w:keepNext/>
-              <w:jc w:val="end"/>
-            </w:pPr>
-            <w:r>
-              <w:rPr>
-                <w:rFonts w:ascii="Calibri" w:hAnsi="Calibri"/>
-                <w:sz w:val="20"/>
-              </w:rPr>
               <w:t xml:space="default">0.5 (-0.22, 1.25)</w:t>
+            </w:r>
+          </w:p>
+        </w:tc>
+        <w:tc>
+          <w:tcPr>
+            <w:tcBorders>
+              <w:top w:val="single" w:space="0" w:color="D3D3D3"/>
+              <w:bottom w:val="single" w:space="0" w:color="D3D3D3"/>
+              <w:start w:val="single" w:space="0" w:color="D3D3D3"/>
+              <w:end w:val="single" w:space="0" w:color="D3D3D3"/>
+            </w:tcBorders>
+          </w:tcPr>
+          <w:p>
+            <w:pPr>
+              <w:spacing w:before="0" w:after="60"/>
+              <w:keepNext/>
+              <w:jc w:val="end"/>
+            </w:pPr>
+            <w:r>
+              <w:rPr>
+                <w:rFonts w:ascii="Calibri" w:hAnsi="Calibri"/>
+                <w:sz w:val="20"/>
+              </w:rPr>
+              <w:t xml:space="default">0.38</w:t>
+            </w:r>
+          </w:p>
+        </w:tc>
+        <w:tc>
+          <w:tcPr>
+            <w:tcBorders>
+              <w:top w:val="single" w:space="0" w:color="D3D3D3"/>
+              <w:bottom w:val="single" w:space="0" w:color="D3D3D3"/>
+              <w:start w:val="single" w:space="0" w:color="D3D3D3"/>
+              <w:end w:val="single" w:space="0" w:color="D3D3D3"/>
+            </w:tcBorders>
+          </w:tcPr>
+          <w:p>
+            <w:pPr>
+              <w:spacing w:before="0" w:after="60"/>
+              <w:keepNext/>
+              <w:jc w:val="end"/>
+            </w:pPr>
+            <w:r>
+              <w:rPr>
+                <w:rFonts w:ascii="Calibri" w:hAnsi="Calibri"/>
+                <w:sz w:val="20"/>
+              </w:rPr>
+              <w:t xml:space="default">28.55</w:t>
+            </w:r>
+          </w:p>
+        </w:tc>
+        <w:tc>
+          <w:tcPr>
+            <w:tcBorders>
+              <w:top w:val="single" w:space="0" w:color="D3D3D3"/>
+              <w:bottom w:val="single" w:space="0" w:color="D3D3D3"/>
+              <w:start w:val="single" w:space="0" w:color="D3D3D3"/>
+              <w:end w:val="single" w:space="0" w:color="D3D3D3"/>
+            </w:tcBorders>
+          </w:tcPr>
+          <w:p>
+            <w:pPr>
+              <w:spacing w:before="0" w:after="60"/>
+              <w:keepNext/>
+              <w:jc w:val="end"/>
+            </w:pPr>
+            <w:r>
+              <w:rPr>
+                <w:rFonts w:ascii="Calibri" w:hAnsi="Calibri"/>
+                <w:sz w:val="20"/>
+              </w:rPr>
+              <w:t xml:space="default">1.3</w:t>
             </w:r>
           </w:p>
         </w:tc>
@@ -590,30 +771,6 @@
                 <w:rFonts w:ascii="Calibri" w:hAnsi="Calibri"/>
                 <w:sz w:val="20"/>
               </w:rPr>
-              <w:t xml:space="default">106</w:t>
-            </w:r>
-          </w:p>
-        </w:tc>
-        <w:tc>
-          <w:tcPr>
-            <w:tcBorders>
-              <w:top w:val="single" w:space="0" w:color="D3D3D3"/>
-              <w:bottom w:val="single" w:space="0" w:color="D3D3D3"/>
-              <w:start w:val="single" w:space="0" w:color="D3D3D3"/>
-              <w:end w:val="single" w:space="0" w:color="D3D3D3"/>
-            </w:tcBorders>
-          </w:tcPr>
-          <w:p>
-            <w:pPr>
-              <w:spacing w:before="0" w:after="60"/>
-              <w:keepNext/>
-              <w:jc w:val="end"/>
-            </w:pPr>
-            <w:r>
-              <w:rPr>
-                <w:rFonts w:ascii="Calibri" w:hAnsi="Calibri"/>
-                <w:sz w:val="20"/>
-              </w:rPr>
               <w:t xml:space="default">1.16 (0.32, 2)</w:t>
             </w:r>
           </w:p>
@@ -631,6 +788,78 @@
             <w:pPr>
               <w:spacing w:before="0" w:after="60"/>
               <w:keepNext/>
+              <w:jc w:val="end"/>
+            </w:pPr>
+            <w:r>
+              <w:rPr>
+                <w:rFonts w:ascii="Calibri" w:hAnsi="Calibri"/>
+                <w:sz w:val="20"/>
+              </w:rPr>
+              <w:t xml:space="default">0.42</w:t>
+            </w:r>
+          </w:p>
+        </w:tc>
+        <w:tc>
+          <w:tcPr>
+            <w:tcBorders>
+              <w:top w:val="single" w:space="0" w:color="D3D3D3"/>
+              <w:bottom w:val="single" w:space="0" w:color="D3D3D3"/>
+              <w:start w:val="single" w:space="0" w:color="D3D3D3"/>
+              <w:end w:val="single" w:space="0" w:color="D3D3D3"/>
+            </w:tcBorders>
+          </w:tcPr>
+          <w:p>
+            <w:pPr>
+              <w:spacing w:before="0" w:after="60"/>
+              <w:keepNext/>
+              <w:jc w:val="end"/>
+            </w:pPr>
+            <w:r>
+              <w:rPr>
+                <w:rFonts w:ascii="Calibri" w:hAnsi="Calibri"/>
+                <w:sz w:val="20"/>
+              </w:rPr>
+              <w:t xml:space="default">26.96</w:t>
+            </w:r>
+          </w:p>
+        </w:tc>
+        <w:tc>
+          <w:tcPr>
+            <w:tcBorders>
+              <w:top w:val="single" w:space="0" w:color="D3D3D3"/>
+              <w:bottom w:val="single" w:space="0" w:color="D3D3D3"/>
+              <w:start w:val="single" w:space="0" w:color="D3D3D3"/>
+              <w:end w:val="single" w:space="0" w:color="D3D3D3"/>
+            </w:tcBorders>
+          </w:tcPr>
+          <w:p>
+            <w:pPr>
+              <w:spacing w:before="0" w:after="60"/>
+              <w:keepNext/>
+              <w:jc w:val="end"/>
+            </w:pPr>
+            <w:r>
+              <w:rPr>
+                <w:rFonts w:ascii="Calibri" w:hAnsi="Calibri"/>
+                <w:sz w:val="20"/>
+              </w:rPr>
+              <w:t xml:space="default">2.79</w:t>
+            </w:r>
+          </w:p>
+        </w:tc>
+        <w:tc>
+          <w:tcPr>
+            <w:tcBorders>
+              <w:top w:val="single" w:space="0" w:color="D3D3D3"/>
+              <w:bottom w:val="single" w:space="0" w:color="D3D3D3"/>
+              <w:start w:val="single" w:space="0" w:color="D3D3D3"/>
+              <w:end w:val="single" w:space="0" w:color="D3D3D3"/>
+            </w:tcBorders>
+          </w:tcPr>
+          <w:p>
+            <w:pPr>
+              <w:spacing w:before="0" w:after="60"/>
+              <w:keepNext/>
               <w:jc w:val="start"/>
             </w:pPr>
             <w:r>
@@ -662,31 +891,79 @@
                 <w:rFonts w:ascii="Calibri" w:hAnsi="Calibri"/>
                 <w:sz w:val="20"/>
               </w:rPr>
-              <w:t xml:space="default">106</w:t>
-            </w:r>
-          </w:p>
-        </w:tc>
-        <w:tc>
-          <w:tcPr>
-            <w:tcBorders>
-              <w:top w:val="single" w:space="0" w:color="D3D3D3"/>
-              <w:bottom w:val="single" w:space="0" w:color="D3D3D3"/>
-              <w:start w:val="single" w:space="0" w:color="D3D3D3"/>
-              <w:end w:val="single" w:space="0" w:color="D3D3D3"/>
-            </w:tcBorders>
-          </w:tcPr>
-          <w:p>
-            <w:pPr>
-              <w:spacing w:before="0" w:after="60"/>
-              <w:keepNext/>
-              <w:jc w:val="end"/>
-            </w:pPr>
-            <w:r>
-              <w:rPr>
-                <w:rFonts w:ascii="Calibri" w:hAnsi="Calibri"/>
-                <w:sz w:val="20"/>
-              </w:rPr>
               <w:t xml:space="default">0.29 (-0.45, 1.06)</w:t>
+            </w:r>
+          </w:p>
+        </w:tc>
+        <w:tc>
+          <w:tcPr>
+            <w:tcBorders>
+              <w:top w:val="single" w:space="0" w:color="D3D3D3"/>
+              <w:bottom w:val="single" w:space="0" w:color="D3D3D3"/>
+              <w:start w:val="single" w:space="0" w:color="D3D3D3"/>
+              <w:end w:val="single" w:space="0" w:color="D3D3D3"/>
+            </w:tcBorders>
+          </w:tcPr>
+          <w:p>
+            <w:pPr>
+              <w:spacing w:before="0" w:after="60"/>
+              <w:keepNext/>
+              <w:jc w:val="end"/>
+            </w:pPr>
+            <w:r>
+              <w:rPr>
+                <w:rFonts w:ascii="Calibri" w:hAnsi="Calibri"/>
+                <w:sz w:val="20"/>
+              </w:rPr>
+              <w:t xml:space="default">0.38</w:t>
+            </w:r>
+          </w:p>
+        </w:tc>
+        <w:tc>
+          <w:tcPr>
+            <w:tcBorders>
+              <w:top w:val="single" w:space="0" w:color="D3D3D3"/>
+              <w:bottom w:val="single" w:space="0" w:color="D3D3D3"/>
+              <w:start w:val="single" w:space="0" w:color="D3D3D3"/>
+              <w:end w:val="single" w:space="0" w:color="D3D3D3"/>
+            </w:tcBorders>
+          </w:tcPr>
+          <w:p>
+            <w:pPr>
+              <w:spacing w:before="0" w:after="60"/>
+              <w:keepNext/>
+              <w:jc w:val="end"/>
+            </w:pPr>
+            <w:r>
+              <w:rPr>
+                <w:rFonts w:ascii="Calibri" w:hAnsi="Calibri"/>
+                <w:sz w:val="20"/>
+              </w:rPr>
+              <w:t xml:space="default">26.96</w:t>
+            </w:r>
+          </w:p>
+        </w:tc>
+        <w:tc>
+          <w:tcPr>
+            <w:tcBorders>
+              <w:top w:val="single" w:space="0" w:color="D3D3D3"/>
+              <w:bottom w:val="single" w:space="0" w:color="D3D3D3"/>
+              <w:start w:val="single" w:space="0" w:color="D3D3D3"/>
+              <w:end w:val="single" w:space="0" w:color="D3D3D3"/>
+            </w:tcBorders>
+          </w:tcPr>
+          <w:p>
+            <w:pPr>
+              <w:spacing w:before="0" w:after="60"/>
+              <w:keepNext/>
+              <w:jc w:val="end"/>
+            </w:pPr>
+            <w:r>
+              <w:rPr>
+                <w:rFonts w:ascii="Calibri" w:hAnsi="Calibri"/>
+                <w:sz w:val="20"/>
+              </w:rPr>
+              <w:t xml:space="default">0.75</w:t>
             </w:r>
           </w:p>
         </w:tc>
@@ -730,7 +1007,7 @@
             <w:tcMar>
               <w:top w:w="25" w:type="dxa"/>
             </w:tcMar>
-            <w:gridSpan w:val="7"/>
+            <w:gridSpan w:val="11"/>
           </w:tcPr>
           <w:p>
             <w:pPr>
@@ -796,30 +1073,6 @@
                 <w:rFonts w:ascii="Calibri" w:hAnsi="Calibri"/>
                 <w:sz w:val="20"/>
               </w:rPr>
-              <w:t xml:space="default">106</w:t>
-            </w:r>
-          </w:p>
-        </w:tc>
-        <w:tc>
-          <w:tcPr>
-            <w:tcBorders>
-              <w:top w:val="single" w:space="0" w:color="D3D3D3"/>
-              <w:bottom w:val="single" w:space="0" w:color="D3D3D3"/>
-              <w:start w:val="single" w:space="0" w:color="D3D3D3"/>
-              <w:end w:val="single" w:space="0" w:color="D3D3D3"/>
-            </w:tcBorders>
-          </w:tcPr>
-          <w:p>
-            <w:pPr>
-              <w:spacing w:before="0" w:after="60"/>
-              <w:keepNext/>
-              <w:jc w:val="end"/>
-            </w:pPr>
-            <w:r>
-              <w:rPr>
-                <w:rFonts w:ascii="Calibri" w:hAnsi="Calibri"/>
-                <w:sz w:val="20"/>
-              </w:rPr>
               <w:t xml:space="default">-0.87 (-1.53, -0.24)</w:t>
             </w:r>
           </w:p>
@@ -837,6 +1090,78 @@
             <w:pPr>
               <w:spacing w:before="0" w:after="60"/>
               <w:keepNext/>
+              <w:jc w:val="end"/>
+            </w:pPr>
+            <w:r>
+              <w:rPr>
+                <w:rFonts w:ascii="Calibri" w:hAnsi="Calibri"/>
+                <w:sz w:val="20"/>
+              </w:rPr>
+              <w:t xml:space="default">0.33</w:t>
+            </w:r>
+          </w:p>
+        </w:tc>
+        <w:tc>
+          <w:tcPr>
+            <w:tcBorders>
+              <w:top w:val="single" w:space="0" w:color="D3D3D3"/>
+              <w:bottom w:val="single" w:space="0" w:color="D3D3D3"/>
+              <w:start w:val="single" w:space="0" w:color="D3D3D3"/>
+              <w:end w:val="single" w:space="0" w:color="D3D3D3"/>
+            </w:tcBorders>
+          </w:tcPr>
+          <w:p>
+            <w:pPr>
+              <w:spacing w:before="0" w:after="60"/>
+              <w:keepNext/>
+              <w:jc w:val="end"/>
+            </w:pPr>
+            <w:r>
+              <w:rPr>
+                <w:rFonts w:ascii="Calibri" w:hAnsi="Calibri"/>
+                <w:sz w:val="20"/>
+              </w:rPr>
+              <w:t xml:space="default">29.13</w:t>
+            </w:r>
+          </w:p>
+        </w:tc>
+        <w:tc>
+          <w:tcPr>
+            <w:tcBorders>
+              <w:top w:val="single" w:space="0" w:color="D3D3D3"/>
+              <w:bottom w:val="single" w:space="0" w:color="D3D3D3"/>
+              <w:start w:val="single" w:space="0" w:color="D3D3D3"/>
+              <w:end w:val="single" w:space="0" w:color="D3D3D3"/>
+            </w:tcBorders>
+          </w:tcPr>
+          <w:p>
+            <w:pPr>
+              <w:spacing w:before="0" w:after="60"/>
+              <w:keepNext/>
+              <w:jc w:val="end"/>
+            </w:pPr>
+            <w:r>
+              <w:rPr>
+                <w:rFonts w:ascii="Calibri" w:hAnsi="Calibri"/>
+                <w:sz w:val="20"/>
+              </w:rPr>
+              <w:t xml:space="default">-2.61</w:t>
+            </w:r>
+          </w:p>
+        </w:tc>
+        <w:tc>
+          <w:tcPr>
+            <w:tcBorders>
+              <w:top w:val="single" w:space="0" w:color="D3D3D3"/>
+              <w:bottom w:val="single" w:space="0" w:color="D3D3D3"/>
+              <w:start w:val="single" w:space="0" w:color="D3D3D3"/>
+              <w:end w:val="single" w:space="0" w:color="D3D3D3"/>
+            </w:tcBorders>
+          </w:tcPr>
+          <w:p>
+            <w:pPr>
+              <w:spacing w:before="0" w:after="60"/>
+              <w:keepNext/>
               <w:jc w:val="start"/>
             </w:pPr>
             <w:r>
@@ -868,31 +1193,79 @@
                 <w:rFonts w:ascii="Calibri" w:hAnsi="Calibri"/>
                 <w:sz w:val="20"/>
               </w:rPr>
-              <w:t xml:space="default">106</w:t>
-            </w:r>
-          </w:p>
-        </w:tc>
-        <w:tc>
-          <w:tcPr>
-            <w:tcBorders>
-              <w:top w:val="single" w:space="0" w:color="D3D3D3"/>
-              <w:bottom w:val="single" w:space="0" w:color="D3D3D3"/>
-              <w:start w:val="single" w:space="0" w:color="D3D3D3"/>
-              <w:end w:val="single" w:space="0" w:color="D3D3D3"/>
-            </w:tcBorders>
-          </w:tcPr>
-          <w:p>
-            <w:pPr>
-              <w:spacing w:before="0" w:after="60"/>
-              <w:keepNext/>
-              <w:jc w:val="end"/>
-            </w:pPr>
-            <w:r>
-              <w:rPr>
-                <w:rFonts w:ascii="Calibri" w:hAnsi="Calibri"/>
-                <w:sz w:val="20"/>
-              </w:rPr>
               <w:t xml:space="default">-1.16 (-1.82, -0.53)</w:t>
+            </w:r>
+          </w:p>
+        </w:tc>
+        <w:tc>
+          <w:tcPr>
+            <w:tcBorders>
+              <w:top w:val="single" w:space="0" w:color="D3D3D3"/>
+              <w:bottom w:val="single" w:space="0" w:color="D3D3D3"/>
+              <w:start w:val="single" w:space="0" w:color="D3D3D3"/>
+              <w:end w:val="single" w:space="0" w:color="D3D3D3"/>
+            </w:tcBorders>
+          </w:tcPr>
+          <w:p>
+            <w:pPr>
+              <w:spacing w:before="0" w:after="60"/>
+              <w:keepNext/>
+              <w:jc w:val="end"/>
+            </w:pPr>
+            <w:r>
+              <w:rPr>
+                <w:rFonts w:ascii="Calibri" w:hAnsi="Calibri"/>
+                <w:sz w:val="20"/>
+              </w:rPr>
+              <w:t xml:space="default">0.33</w:t>
+            </w:r>
+          </w:p>
+        </w:tc>
+        <w:tc>
+          <w:tcPr>
+            <w:tcBorders>
+              <w:top w:val="single" w:space="0" w:color="D3D3D3"/>
+              <w:bottom w:val="single" w:space="0" w:color="D3D3D3"/>
+              <w:start w:val="single" w:space="0" w:color="D3D3D3"/>
+              <w:end w:val="single" w:space="0" w:color="D3D3D3"/>
+            </w:tcBorders>
+          </w:tcPr>
+          <w:p>
+            <w:pPr>
+              <w:spacing w:before="0" w:after="60"/>
+              <w:keepNext/>
+              <w:jc w:val="end"/>
+            </w:pPr>
+            <w:r>
+              <w:rPr>
+                <w:rFonts w:ascii="Calibri" w:hAnsi="Calibri"/>
+                <w:sz w:val="20"/>
+              </w:rPr>
+              <w:t xml:space="default">28.51</w:t>
+            </w:r>
+          </w:p>
+        </w:tc>
+        <w:tc>
+          <w:tcPr>
+            <w:tcBorders>
+              <w:top w:val="single" w:space="0" w:color="D3D3D3"/>
+              <w:bottom w:val="single" w:space="0" w:color="D3D3D3"/>
+              <w:start w:val="single" w:space="0" w:color="D3D3D3"/>
+              <w:end w:val="single" w:space="0" w:color="D3D3D3"/>
+            </w:tcBorders>
+          </w:tcPr>
+          <w:p>
+            <w:pPr>
+              <w:spacing w:before="0" w:after="60"/>
+              <w:keepNext/>
+              <w:jc w:val="end"/>
+            </w:pPr>
+            <w:r>
+              <w:rPr>
+                <w:rFonts w:ascii="Calibri" w:hAnsi="Calibri"/>
+                <w:sz w:val="20"/>
+              </w:rPr>
+              <w:t xml:space="default">-3.56</w:t>
             </w:r>
           </w:p>
         </w:tc>
@@ -978,30 +1351,6 @@
                 <w:rFonts w:ascii="Calibri" w:hAnsi="Calibri"/>
                 <w:sz w:val="20"/>
               </w:rPr>
-              <w:t xml:space="default">106</w:t>
-            </w:r>
-          </w:p>
-        </w:tc>
-        <w:tc>
-          <w:tcPr>
-            <w:tcBorders>
-              <w:top w:val="single" w:space="0" w:color="D3D3D3"/>
-              <w:bottom w:val="single" w:space="0" w:color="D3D3D3"/>
-              <w:start w:val="single" w:space="0" w:color="D3D3D3"/>
-              <w:end w:val="single" w:space="0" w:color="D3D3D3"/>
-            </w:tcBorders>
-          </w:tcPr>
-          <w:p>
-            <w:pPr>
-              <w:spacing w:before="0" w:after="60"/>
-              <w:keepNext/>
-              <w:jc w:val="end"/>
-            </w:pPr>
-            <w:r>
-              <w:rPr>
-                <w:rFonts w:ascii="Calibri" w:hAnsi="Calibri"/>
-                <w:sz w:val="20"/>
-              </w:rPr>
               <w:t xml:space="default">-0.66 (-1.32, -0.04)</w:t>
             </w:r>
           </w:p>
@@ -1019,6 +1368,78 @@
             <w:pPr>
               <w:spacing w:before="0" w:after="60"/>
               <w:keepNext/>
+              <w:jc w:val="end"/>
+            </w:pPr>
+            <w:r>
+              <w:rPr>
+                <w:rFonts w:ascii="Calibri" w:hAnsi="Calibri"/>
+                <w:sz w:val="20"/>
+              </w:rPr>
+              <w:t xml:space="default">0.33</w:t>
+            </w:r>
+          </w:p>
+        </w:tc>
+        <w:tc>
+          <w:tcPr>
+            <w:tcBorders>
+              <w:top w:val="single" w:space="0" w:color="D3D3D3"/>
+              <w:bottom w:val="single" w:space="0" w:color="D3D3D3"/>
+              <w:start w:val="single" w:space="0" w:color="D3D3D3"/>
+              <w:end w:val="single" w:space="0" w:color="D3D3D3"/>
+            </w:tcBorders>
+          </w:tcPr>
+          <w:p>
+            <w:pPr>
+              <w:spacing w:before="0" w:after="60"/>
+              <w:keepNext/>
+              <w:jc w:val="end"/>
+            </w:pPr>
+            <w:r>
+              <w:rPr>
+                <w:rFonts w:ascii="Calibri" w:hAnsi="Calibri"/>
+                <w:sz w:val="20"/>
+              </w:rPr>
+              <w:t xml:space="default">27.67</w:t>
+            </w:r>
+          </w:p>
+        </w:tc>
+        <w:tc>
+          <w:tcPr>
+            <w:tcBorders>
+              <w:top w:val="single" w:space="0" w:color="D3D3D3"/>
+              <w:bottom w:val="single" w:space="0" w:color="D3D3D3"/>
+              <w:start w:val="single" w:space="0" w:color="D3D3D3"/>
+              <w:end w:val="single" w:space="0" w:color="D3D3D3"/>
+            </w:tcBorders>
+          </w:tcPr>
+          <w:p>
+            <w:pPr>
+              <w:spacing w:before="0" w:after="60"/>
+              <w:keepNext/>
+              <w:jc w:val="end"/>
+            </w:pPr>
+            <w:r>
+              <w:rPr>
+                <w:rFonts w:ascii="Calibri" w:hAnsi="Calibri"/>
+                <w:sz w:val="20"/>
+              </w:rPr>
+              <w:t xml:space="default">-2.03</w:t>
+            </w:r>
+          </w:p>
+        </w:tc>
+        <w:tc>
+          <w:tcPr>
+            <w:tcBorders>
+              <w:top w:val="single" w:space="0" w:color="D3D3D3"/>
+              <w:bottom w:val="single" w:space="0" w:color="D3D3D3"/>
+              <w:start w:val="single" w:space="0" w:color="D3D3D3"/>
+              <w:end w:val="single" w:space="0" w:color="D3D3D3"/>
+            </w:tcBorders>
+          </w:tcPr>
+          <w:p>
+            <w:pPr>
+              <w:spacing w:before="0" w:after="60"/>
+              <w:keepNext/>
               <w:jc w:val="start"/>
             </w:pPr>
             <w:r>
@@ -1050,31 +1471,79 @@
                 <w:rFonts w:ascii="Calibri" w:hAnsi="Calibri"/>
                 <w:sz w:val="20"/>
               </w:rPr>
-              <w:t xml:space="default">106</w:t>
-            </w:r>
-          </w:p>
-        </w:tc>
-        <w:tc>
-          <w:tcPr>
-            <w:tcBorders>
-              <w:top w:val="single" w:space="0" w:color="D3D3D3"/>
-              <w:bottom w:val="single" w:space="0" w:color="D3D3D3"/>
-              <w:start w:val="single" w:space="0" w:color="D3D3D3"/>
-              <w:end w:val="single" w:space="0" w:color="D3D3D3"/>
-            </w:tcBorders>
-          </w:tcPr>
-          <w:p>
-            <w:pPr>
-              <w:spacing w:before="0" w:after="60"/>
-              <w:keepNext/>
-              <w:jc w:val="end"/>
-            </w:pPr>
-            <w:r>
-              <w:rPr>
-                <w:rFonts w:ascii="Calibri" w:hAnsi="Calibri"/>
-                <w:sz w:val="20"/>
-              </w:rPr>
               <w:t xml:space="default">-1.13 (-1.76, -0.52)</w:t>
+            </w:r>
+          </w:p>
+        </w:tc>
+        <w:tc>
+          <w:tcPr>
+            <w:tcBorders>
+              <w:top w:val="single" w:space="0" w:color="D3D3D3"/>
+              <w:bottom w:val="single" w:space="0" w:color="D3D3D3"/>
+              <w:start w:val="single" w:space="0" w:color="D3D3D3"/>
+              <w:end w:val="single" w:space="0" w:color="D3D3D3"/>
+            </w:tcBorders>
+          </w:tcPr>
+          <w:p>
+            <w:pPr>
+              <w:spacing w:before="0" w:after="60"/>
+              <w:keepNext/>
+              <w:jc w:val="end"/>
+            </w:pPr>
+            <w:r>
+              <w:rPr>
+                <w:rFonts w:ascii="Calibri" w:hAnsi="Calibri"/>
+                <w:sz w:val="20"/>
+              </w:rPr>
+              <w:t xml:space="default">0.31</w:t>
+            </w:r>
+          </w:p>
+        </w:tc>
+        <w:tc>
+          <w:tcPr>
+            <w:tcBorders>
+              <w:top w:val="single" w:space="0" w:color="D3D3D3"/>
+              <w:bottom w:val="single" w:space="0" w:color="D3D3D3"/>
+              <w:start w:val="single" w:space="0" w:color="D3D3D3"/>
+              <w:end w:val="single" w:space="0" w:color="D3D3D3"/>
+            </w:tcBorders>
+          </w:tcPr>
+          <w:p>
+            <w:pPr>
+              <w:spacing w:before="0" w:after="60"/>
+              <w:keepNext/>
+              <w:jc w:val="end"/>
+            </w:pPr>
+            <w:r>
+              <w:rPr>
+                <w:rFonts w:ascii="Calibri" w:hAnsi="Calibri"/>
+                <w:sz w:val="20"/>
+              </w:rPr>
+              <w:t xml:space="default">26.87</w:t>
+            </w:r>
+          </w:p>
+        </w:tc>
+        <w:tc>
+          <w:tcPr>
+            <w:tcBorders>
+              <w:top w:val="single" w:space="0" w:color="D3D3D3"/>
+              <w:bottom w:val="single" w:space="0" w:color="D3D3D3"/>
+              <w:start w:val="single" w:space="0" w:color="D3D3D3"/>
+              <w:end w:val="single" w:space="0" w:color="D3D3D3"/>
+            </w:tcBorders>
+          </w:tcPr>
+          <w:p>
+            <w:pPr>
+              <w:spacing w:before="0" w:after="60"/>
+              <w:keepNext/>
+              <w:jc w:val="end"/>
+            </w:pPr>
+            <w:r>
+              <w:rPr>
+                <w:rFonts w:ascii="Calibri" w:hAnsi="Calibri"/>
+                <w:sz w:val="20"/>
+              </w:rPr>
+              <w:t xml:space="default">-3.6</w:t>
             </w:r>
           </w:p>
         </w:tc>
@@ -1118,7 +1587,7 @@
             <w:tcMar>
               <w:top w:w="25" w:type="dxa"/>
             </w:tcMar>
-            <w:gridSpan w:val="7"/>
+            <w:gridSpan w:val="11"/>
           </w:tcPr>
           <w:p>
             <w:pPr>
@@ -1184,30 +1653,6 @@
                 <w:rFonts w:ascii="Calibri" w:hAnsi="Calibri"/>
                 <w:sz w:val="20"/>
               </w:rPr>
-              <w:t xml:space="default">106</w:t>
-            </w:r>
-          </w:p>
-        </w:tc>
-        <w:tc>
-          <w:tcPr>
-            <w:tcBorders>
-              <w:top w:val="single" w:space="0" w:color="D3D3D3"/>
-              <w:bottom w:val="single" w:space="0" w:color="D3D3D3"/>
-              <w:start w:val="single" w:space="0" w:color="D3D3D3"/>
-              <w:end w:val="single" w:space="0" w:color="D3D3D3"/>
-            </w:tcBorders>
-          </w:tcPr>
-          <w:p>
-            <w:pPr>
-              <w:spacing w:before="0" w:after="60"/>
-              <w:keepNext/>
-              <w:jc w:val="end"/>
-            </w:pPr>
-            <w:r>
-              <w:rPr>
-                <w:rFonts w:ascii="Calibri" w:hAnsi="Calibri"/>
-                <w:sz w:val="20"/>
-              </w:rPr>
               <w:t xml:space="default">-1.32 (-1.9, -0.78)</w:t>
             </w:r>
           </w:p>
@@ -1225,6 +1670,78 @@
             <w:pPr>
               <w:spacing w:before="0" w:after="60"/>
               <w:keepNext/>
+              <w:jc w:val="end"/>
+            </w:pPr>
+            <w:r>
+              <w:rPr>
+                <w:rFonts w:ascii="Calibri" w:hAnsi="Calibri"/>
+                <w:sz w:val="20"/>
+              </w:rPr>
+              <w:t xml:space="default">0.29</w:t>
+            </w:r>
+          </w:p>
+        </w:tc>
+        <w:tc>
+          <w:tcPr>
+            <w:tcBorders>
+              <w:top w:val="single" w:space="0" w:color="D3D3D3"/>
+              <w:bottom w:val="single" w:space="0" w:color="D3D3D3"/>
+              <w:start w:val="single" w:space="0" w:color="D3D3D3"/>
+              <w:end w:val="single" w:space="0" w:color="D3D3D3"/>
+            </w:tcBorders>
+          </w:tcPr>
+          <w:p>
+            <w:pPr>
+              <w:spacing w:before="0" w:after="60"/>
+              <w:keepNext/>
+              <w:jc w:val="end"/>
+            </w:pPr>
+            <w:r>
+              <w:rPr>
+                <w:rFonts w:ascii="Calibri" w:hAnsi="Calibri"/>
+                <w:sz w:val="20"/>
+              </w:rPr>
+              <w:t xml:space="default">28.61</w:t>
+            </w:r>
+          </w:p>
+        </w:tc>
+        <w:tc>
+          <w:tcPr>
+            <w:tcBorders>
+              <w:top w:val="single" w:space="0" w:color="D3D3D3"/>
+              <w:bottom w:val="single" w:space="0" w:color="D3D3D3"/>
+              <w:start w:val="single" w:space="0" w:color="D3D3D3"/>
+              <w:end w:val="single" w:space="0" w:color="D3D3D3"/>
+            </w:tcBorders>
+          </w:tcPr>
+          <w:p>
+            <w:pPr>
+              <w:spacing w:before="0" w:after="60"/>
+              <w:keepNext/>
+              <w:jc w:val="end"/>
+            </w:pPr>
+            <w:r>
+              <w:rPr>
+                <w:rFonts w:ascii="Calibri" w:hAnsi="Calibri"/>
+                <w:sz w:val="20"/>
+              </w:rPr>
+              <w:t xml:space="default">-4.53</w:t>
+            </w:r>
+          </w:p>
+        </w:tc>
+        <w:tc>
+          <w:tcPr>
+            <w:tcBorders>
+              <w:top w:val="single" w:space="0" w:color="D3D3D3"/>
+              <w:bottom w:val="single" w:space="0" w:color="D3D3D3"/>
+              <w:start w:val="single" w:space="0" w:color="D3D3D3"/>
+              <w:end w:val="single" w:space="0" w:color="D3D3D3"/>
+            </w:tcBorders>
+          </w:tcPr>
+          <w:p>
+            <w:pPr>
+              <w:spacing w:before="0" w:after="60"/>
+              <w:keepNext/>
               <w:jc w:val="start"/>
             </w:pPr>
             <w:r>
@@ -1256,31 +1773,79 @@
                 <w:rFonts w:ascii="Calibri" w:hAnsi="Calibri"/>
                 <w:sz w:val="20"/>
               </w:rPr>
-              <w:t xml:space="default">106</w:t>
-            </w:r>
-          </w:p>
-        </w:tc>
-        <w:tc>
-          <w:tcPr>
-            <w:tcBorders>
-              <w:top w:val="single" w:space="0" w:color="D3D3D3"/>
-              <w:bottom w:val="single" w:space="0" w:color="D3D3D3"/>
-              <w:start w:val="single" w:space="0" w:color="D3D3D3"/>
-              <w:end w:val="single" w:space="0" w:color="D3D3D3"/>
-            </w:tcBorders>
-          </w:tcPr>
-          <w:p>
-            <w:pPr>
-              <w:spacing w:before="0" w:after="60"/>
-              <w:keepNext/>
-              <w:jc w:val="end"/>
-            </w:pPr>
-            <w:r>
-              <w:rPr>
-                <w:rFonts w:ascii="Calibri" w:hAnsi="Calibri"/>
-                <w:sz w:val="20"/>
-              </w:rPr>
               <w:t xml:space="default">-1.39 (-1.99, -0.85)</w:t>
+            </w:r>
+          </w:p>
+        </w:tc>
+        <w:tc>
+          <w:tcPr>
+            <w:tcBorders>
+              <w:top w:val="single" w:space="0" w:color="D3D3D3"/>
+              <w:bottom w:val="single" w:space="0" w:color="D3D3D3"/>
+              <w:start w:val="single" w:space="0" w:color="D3D3D3"/>
+              <w:end w:val="single" w:space="0" w:color="D3D3D3"/>
+            </w:tcBorders>
+          </w:tcPr>
+          <w:p>
+            <w:pPr>
+              <w:spacing w:before="0" w:after="60"/>
+              <w:keepNext/>
+              <w:jc w:val="end"/>
+            </w:pPr>
+            <w:r>
+              <w:rPr>
+                <w:rFonts w:ascii="Calibri" w:hAnsi="Calibri"/>
+                <w:sz w:val="20"/>
+              </w:rPr>
+              <w:t xml:space="default">0.29</w:t>
+            </w:r>
+          </w:p>
+        </w:tc>
+        <w:tc>
+          <w:tcPr>
+            <w:tcBorders>
+              <w:top w:val="single" w:space="0" w:color="D3D3D3"/>
+              <w:bottom w:val="single" w:space="0" w:color="D3D3D3"/>
+              <w:start w:val="single" w:space="0" w:color="D3D3D3"/>
+              <w:end w:val="single" w:space="0" w:color="D3D3D3"/>
+            </w:tcBorders>
+          </w:tcPr>
+          <w:p>
+            <w:pPr>
+              <w:spacing w:before="0" w:after="60"/>
+              <w:keepNext/>
+              <w:jc w:val="end"/>
+            </w:pPr>
+            <w:r>
+              <w:rPr>
+                <w:rFonts w:ascii="Calibri" w:hAnsi="Calibri"/>
+                <w:sz w:val="20"/>
+              </w:rPr>
+              <w:t xml:space="default">28.45</w:t>
+            </w:r>
+          </w:p>
+        </w:tc>
+        <w:tc>
+          <w:tcPr>
+            <w:tcBorders>
+              <w:top w:val="single" w:space="0" w:color="D3D3D3"/>
+              <w:bottom w:val="single" w:space="0" w:color="D3D3D3"/>
+              <w:start w:val="single" w:space="0" w:color="D3D3D3"/>
+              <w:end w:val="single" w:space="0" w:color="D3D3D3"/>
+            </w:tcBorders>
+          </w:tcPr>
+          <w:p>
+            <w:pPr>
+              <w:spacing w:before="0" w:after="60"/>
+              <w:keepNext/>
+              <w:jc w:val="end"/>
+            </w:pPr>
+            <w:r>
+              <w:rPr>
+                <w:rFonts w:ascii="Calibri" w:hAnsi="Calibri"/>
+                <w:sz w:val="20"/>
+              </w:rPr>
+              <w:t xml:space="default">-4.74</w:t>
             </w:r>
           </w:p>
         </w:tc>
@@ -1366,30 +1931,6 @@
                 <w:rFonts w:ascii="Calibri" w:hAnsi="Calibri"/>
                 <w:sz w:val="20"/>
               </w:rPr>
-              <w:t xml:space="default">106</w:t>
-            </w:r>
-          </w:p>
-        </w:tc>
-        <w:tc>
-          <w:tcPr>
-            <w:tcBorders>
-              <w:top w:val="single" w:space="0" w:color="D3D3D3"/>
-              <w:bottom w:val="single" w:space="0" w:color="D3D3D3"/>
-              <w:start w:val="single" w:space="0" w:color="D3D3D3"/>
-              <w:end w:val="single" w:space="0" w:color="D3D3D3"/>
-            </w:tcBorders>
-          </w:tcPr>
-          <w:p>
-            <w:pPr>
-              <w:spacing w:before="0" w:after="60"/>
-              <w:keepNext/>
-              <w:jc w:val="end"/>
-            </w:pPr>
-            <w:r>
-              <w:rPr>
-                <w:rFonts w:ascii="Calibri" w:hAnsi="Calibri"/>
-                <w:sz w:val="20"/>
-              </w:rPr>
               <w:t xml:space="default">-1.41 (-2.07, -0.77)</w:t>
             </w:r>
           </w:p>
@@ -1407,6 +1948,78 @@
             <w:pPr>
               <w:spacing w:before="0" w:after="60"/>
               <w:keepNext/>
+              <w:jc w:val="end"/>
+            </w:pPr>
+            <w:r>
+              <w:rPr>
+                <w:rFonts w:ascii="Calibri" w:hAnsi="Calibri"/>
+                <w:sz w:val="20"/>
+              </w:rPr>
+              <w:t xml:space="default">0.33</w:t>
+            </w:r>
+          </w:p>
+        </w:tc>
+        <w:tc>
+          <w:tcPr>
+            <w:tcBorders>
+              <w:top w:val="single" w:space="0" w:color="D3D3D3"/>
+              <w:bottom w:val="single" w:space="0" w:color="D3D3D3"/>
+              <w:start w:val="single" w:space="0" w:color="D3D3D3"/>
+              <w:end w:val="single" w:space="0" w:color="D3D3D3"/>
+            </w:tcBorders>
+          </w:tcPr>
+          <w:p>
+            <w:pPr>
+              <w:spacing w:before="0" w:after="60"/>
+              <w:keepNext/>
+              <w:jc w:val="end"/>
+            </w:pPr>
+            <w:r>
+              <w:rPr>
+                <w:rFonts w:ascii="Calibri" w:hAnsi="Calibri"/>
+                <w:sz w:val="20"/>
+              </w:rPr>
+              <w:t xml:space="default">27</w:t>
+            </w:r>
+          </w:p>
+        </w:tc>
+        <w:tc>
+          <w:tcPr>
+            <w:tcBorders>
+              <w:top w:val="single" w:space="0" w:color="D3D3D3"/>
+              <w:bottom w:val="single" w:space="0" w:color="D3D3D3"/>
+              <w:start w:val="single" w:space="0" w:color="D3D3D3"/>
+              <w:end w:val="single" w:space="0" w:color="D3D3D3"/>
+            </w:tcBorders>
+          </w:tcPr>
+          <w:p>
+            <w:pPr>
+              <w:spacing w:before="0" w:after="60"/>
+              <w:keepNext/>
+              <w:jc w:val="end"/>
+            </w:pPr>
+            <w:r>
+              <w:rPr>
+                <w:rFonts w:ascii="Calibri" w:hAnsi="Calibri"/>
+                <w:sz w:val="20"/>
+              </w:rPr>
+              <w:t xml:space="default">-4.21</w:t>
+            </w:r>
+          </w:p>
+        </w:tc>
+        <w:tc>
+          <w:tcPr>
+            <w:tcBorders>
+              <w:top w:val="single" w:space="0" w:color="D3D3D3"/>
+              <w:bottom w:val="single" w:space="0" w:color="D3D3D3"/>
+              <w:start w:val="single" w:space="0" w:color="D3D3D3"/>
+              <w:end w:val="single" w:space="0" w:color="D3D3D3"/>
+            </w:tcBorders>
+          </w:tcPr>
+          <w:p>
+            <w:pPr>
+              <w:spacing w:before="0" w:after="60"/>
+              <w:keepNext/>
               <w:jc w:val="start"/>
             </w:pPr>
             <w:r>
@@ -1438,31 +2051,79 @@
                 <w:rFonts w:ascii="Calibri" w:hAnsi="Calibri"/>
                 <w:sz w:val="20"/>
               </w:rPr>
-              <w:t xml:space="default">106</w:t>
-            </w:r>
-          </w:p>
-        </w:tc>
-        <w:tc>
-          <w:tcPr>
-            <w:tcBorders>
-              <w:top w:val="single" w:space="0" w:color="D3D3D3"/>
-              <w:bottom w:val="single" w:space="0" w:color="D3D3D3"/>
-              <w:start w:val="single" w:space="0" w:color="D3D3D3"/>
-              <w:end w:val="single" w:space="0" w:color="D3D3D3"/>
-            </w:tcBorders>
-          </w:tcPr>
-          <w:p>
-            <w:pPr>
-              <w:spacing w:before="0" w:after="60"/>
-              <w:keepNext/>
-              <w:jc w:val="end"/>
-            </w:pPr>
-            <w:r>
-              <w:rPr>
-                <w:rFonts w:ascii="Calibri" w:hAnsi="Calibri"/>
-                <w:sz w:val="20"/>
-              </w:rPr>
               <w:t xml:space="default">-1.33 (-1.95, -0.7)</w:t>
+            </w:r>
+          </w:p>
+        </w:tc>
+        <w:tc>
+          <w:tcPr>
+            <w:tcBorders>
+              <w:top w:val="single" w:space="0" w:color="D3D3D3"/>
+              <w:bottom w:val="single" w:space="0" w:color="D3D3D3"/>
+              <w:start w:val="single" w:space="0" w:color="D3D3D3"/>
+              <w:end w:val="single" w:space="0" w:color="D3D3D3"/>
+            </w:tcBorders>
+          </w:tcPr>
+          <w:p>
+            <w:pPr>
+              <w:spacing w:before="0" w:after="60"/>
+              <w:keepNext/>
+              <w:jc w:val="end"/>
+            </w:pPr>
+            <w:r>
+              <w:rPr>
+                <w:rFonts w:ascii="Calibri" w:hAnsi="Calibri"/>
+                <w:sz w:val="20"/>
+              </w:rPr>
+              <w:t xml:space="default">0.32</w:t>
+            </w:r>
+          </w:p>
+        </w:tc>
+        <w:tc>
+          <w:tcPr>
+            <w:tcBorders>
+              <w:top w:val="single" w:space="0" w:color="D3D3D3"/>
+              <w:bottom w:val="single" w:space="0" w:color="D3D3D3"/>
+              <w:start w:val="single" w:space="0" w:color="D3D3D3"/>
+              <w:end w:val="single" w:space="0" w:color="D3D3D3"/>
+            </w:tcBorders>
+          </w:tcPr>
+          <w:p>
+            <w:pPr>
+              <w:spacing w:before="0" w:after="60"/>
+              <w:keepNext/>
+              <w:jc w:val="end"/>
+            </w:pPr>
+            <w:r>
+              <w:rPr>
+                <w:rFonts w:ascii="Calibri" w:hAnsi="Calibri"/>
+                <w:sz w:val="20"/>
+              </w:rPr>
+              <w:t xml:space="default">26.38</w:t>
+            </w:r>
+          </w:p>
+        </w:tc>
+        <w:tc>
+          <w:tcPr>
+            <w:tcBorders>
+              <w:top w:val="single" w:space="0" w:color="D3D3D3"/>
+              <w:bottom w:val="single" w:space="0" w:color="D3D3D3"/>
+              <w:start w:val="single" w:space="0" w:color="D3D3D3"/>
+              <w:end w:val="single" w:space="0" w:color="D3D3D3"/>
+            </w:tcBorders>
+          </w:tcPr>
+          <w:p>
+            <w:pPr>
+              <w:spacing w:before="0" w:after="60"/>
+              <w:keepNext/>
+              <w:jc w:val="end"/>
+            </w:pPr>
+            <w:r>
+              <w:rPr>
+                <w:rFonts w:ascii="Calibri" w:hAnsi="Calibri"/>
+                <w:sz w:val="20"/>
+              </w:rPr>
+              <w:t xml:space="default">-4.14</w:t>
             </w:r>
           </w:p>
         </w:tc>
@@ -1497,7 +2158,7 @@
         </w:trPr>
         <w:tc>
           <w:tcPr>
-            <w:gridSpan w:val="7"/>
+            <w:gridSpan w:val="11"/>
           </w:tcPr>
           <w:p>
             <w:pPr>
@@ -1529,7 +2190,7 @@
         </w:trPr>
         <w:tc>
           <w:tcPr>
-            <w:gridSpan w:val="7"/>
+            <w:gridSpan w:val="11"/>
           </w:tcPr>
           <w:p>
             <w:pPr>
@@ -1550,7 +2211,7 @@
                 <w:rFonts w:ascii="Calibri" w:hAnsi="Calibri"/>
                 <w:sz w:val="20"/>
               </w:rPr>
-              <w:t xml:space="preserve">R-squared for adjusted minimum temperature models. Before model: Marginal R-squared = 0.23, Conditional R-squared = 0.82; After model: Marginal R-squared = 0.05, Conditional R-squared = 0.82</w:t>
+              <w:t xml:space="preserve">R-squared for adjusted minimum temperature models. Before model: Marginal R-squared = 0.32, Conditional R-squared = 0.82; After model: Marginal R-squared = 0.2, Conditional R-squared = 0.83</w:t>
             </w:r>
           </w:p>
         </w:tc>
@@ -1561,7 +2222,7 @@
         </w:trPr>
         <w:tc>
           <w:tcPr>
-            <w:gridSpan w:val="7"/>
+            <w:gridSpan w:val="11"/>
           </w:tcPr>
           <w:p>
             <w:pPr>
@@ -1582,7 +2243,7 @@
                 <w:rFonts w:ascii="Calibri" w:hAnsi="Calibri"/>
                 <w:sz w:val="20"/>
               </w:rPr>
-              <w:t xml:space="preserve">R-squared for adjusted maximum temperature models. Before model: Marginal R-squared = 0.14, Conditional R-squared = 0.81; After model: Marginal R-squared = 0.25, Conditional R-squared = 0.82</w:t>
+              <w:t xml:space="preserve">R-squared for adjusted maximum temperature models. Before model: Marginal R-squared = 0.26, Conditional R-squared = 0.82; After model: Marginal R-squared = 0.38, Conditional R-squared = 0.82</w:t>
             </w:r>
           </w:p>
         </w:tc>
@@ -1593,7 +2254,7 @@
         </w:trPr>
         <w:tc>
           <w:tcPr>
-            <w:gridSpan w:val="7"/>
+            <w:gridSpan w:val="11"/>
           </w:tcPr>
           <w:p>
             <w:pPr>
@@ -1614,7 +2275,7 @@
                 <w:rFonts w:ascii="Calibri" w:hAnsi="Calibri"/>
                 <w:sz w:val="20"/>
               </w:rPr>
-              <w:t xml:space="preserve">R-squared for adjusted temperature variability models. Before model: Marginal R-squared = 0.34, Conditional R-squared = 0.81; After model: Marginal R-squared = 0.37, Conditional R-squared = 0.81</w:t>
+              <w:t xml:space="preserve">R-squared for adjusted temperature variability models. Before model: Marginal R-squared = 0.42, Conditional R-squared = 0.81; After model: Marginal R-squared = 0.42, Conditional R-squared = 0.81</w:t>
             </w:r>
           </w:p>
         </w:tc>
@@ -1625,7 +2286,11 @@
         <w:pStyle w:val="FirstParagraph"/>
       </w:pPr>
     </w:p>
-    <w:sectPr/>
+    <w:sectPr>
+      <w:footnotePr>
+        <w:numRestart w:val="eachSect"/>
+      </w:footnotePr>
+    </w:sectPr>
   </w:body>
 </w:document>
 </file>
@@ -1797,8 +2462,6 @@
     </w:pPr>
     <w:rPr>
       <w:rFonts w:asciiTheme="majorHAnsi" w:cstheme="majorBidi" w:eastAsiaTheme="majorEastAsia" w:hAnsiTheme="majorHAnsi"/>
-      <w:spacing w:val="-10"/>
-      <w:kern w:val="28"/>
       <w:sz w:val="56"/>
       <w:szCs w:val="56"/>
     </w:rPr>
@@ -1811,8 +2474,6 @@
     <w:rsid w:val="00A10FD9"/>
     <w:rPr>
       <w:rFonts w:asciiTheme="majorHAnsi" w:cstheme="majorBidi" w:eastAsiaTheme="majorEastAsia" w:hAnsiTheme="majorHAnsi"/>
-      <w:spacing w:val="-10"/>
-      <w:kern w:val="28"/>
       <w:sz w:val="56"/>
       <w:szCs w:val="56"/>
     </w:rPr>
@@ -1853,23 +2514,31 @@
   </w:style>
   <w:style w:customStyle="1" w:styleId="Author" w:type="paragraph">
     <w:name w:val="Author"/>
+    <w:basedOn w:val="Title"/>
     <w:next w:val="BodyText"/>
     <w:qFormat/>
     <w:pPr>
       <w:keepNext/>
       <w:keepLines/>
-      <w:jc w:val="center"/>
     </w:pPr>
+    <w:rPr>
+      <w:sz w:val="24"/>
+      <w:szCs w:val="24"/>
+    </w:rPr>
   </w:style>
   <w:style w:styleId="Date" w:type="paragraph">
     <w:name w:val="Date"/>
+    <w:basedOn w:val="Title"/>
     <w:next w:val="BodyText"/>
     <w:qFormat/>
     <w:pPr>
       <w:keepNext/>
       <w:keepLines/>
-      <w:jc w:val="center"/>
     </w:pPr>
+    <w:rPr>
+      <w:sz w:val="24"/>
+      <w:szCs w:val="24"/>
+    </w:rPr>
   </w:style>
   <w:style w:customStyle="1" w:styleId="AbstractTitle" w:type="paragraph">
     <w:name w:val="Abstract Title"/>

</xml_diff>